<commit_message>
nmv 13 10 2026
</commit_message>
<xml_diff>
--- a/TS Jatai Ghanam Project/TS 4.3/TS 4.3 Ghanam Sanskrit Corrections.docx
+++ b/TS Jatai Ghanam Project/TS 4.3/TS 4.3 Ghanam Sanskrit Corrections.docx
@@ -1,7 +1,3207 @@
 
 <file path=word/document.xml><?xml version="1.0" encoding="utf-8"?>
-<w:document xmlns:wpc="http://schemas.microsoft.com/office/word/2010/wordprocessingCanvas" xmlns:cx="http://schemas.microsoft.com/office/drawing/2014/chartex" xmlns:cx1="http://schemas.microsoft.com/office/drawing/2015/9/8/chartex" xmlns:cx2="http://schemas.microsoft.com/office/drawing/2015/10/21/chartex" xmlns:cx3="http://schemas.microsoft.com/office/drawing/2016/5/9/chartex" xmlns:cx4="http://schemas.microsoft.com/office/drawing/2016/5/10/chartex" xmlns:cx5="http://schemas.microsoft.com/office/drawing/2016/5/11/chartex" xmlns:cx6="http://schemas.microsoft.com/office/drawing/2016/5/12/chartex" xmlns:cx7="http://schemas.microsoft.com/office/drawing/2016/5/13/chartex" xmlns:cx8="http://schemas.microsoft.com/office/drawing/2016/5/14/chartex" xmlns:mc="http://schemas.openxmlformats.org/markup-compatibility/2006" xmlns:aink="http://schemas.microsoft.com/office/drawing/2016/ink" xmlns:am3d="http://schemas.microsoft.com/office/drawing/2017/model3d" xmlns:o="urn:schemas-microsoft-com:office:office" xmlns:oel="http://schemas.microsoft.com/office/2019/extlst" xmlns:r="http://schemas.openxmlformats.org/officeDocument/2006/relationships" xmlns:m="http://schemas.openxmlformats.org/officeDocument/2006/math" xmlns:v="urn:schemas-microsoft-com:vml" xmlns:wp14="http://schemas.microsoft.com/office/word/2010/wordprocessingDrawing" xmlns:wp="http://schemas.openxmlformats.org/drawingml/2006/wordprocessingDrawing" xmlns:w10="urn:schemas-microsoft-com:office:word" xmlns:w="http://schemas.openxmlformats.org/wordprocessingml/2006/main" xmlns:w14="http://schemas.microsoft.com/office/word/2010/wordml" xmlns:w15="http://schemas.microsoft.com/office/word/2012/wordml" xmlns:w16cex="http://schemas.microsoft.com/office/word/2018/wordml/cex" xmlns:w16cid="http://schemas.microsoft.com/office/word/2016/wordml/cid" xmlns:w16="http://schemas.microsoft.com/office/word/2018/wordml" xmlns:w16sdtdh="http://schemas.microsoft.com/office/word/2020/wordml/sdtdatahash" xmlns:w16se="http://schemas.microsoft.com/office/word/2015/wordml/symex" xmlns:wpg="http://schemas.microsoft.com/office/word/2010/wordprocessingGroup" xmlns:wpi="http://schemas.microsoft.com/office/word/2010/wordprocessingInk" xmlns:wne="http://schemas.microsoft.com/office/word/2006/wordml" xmlns:wps="http://schemas.microsoft.com/office/word/2010/wordprocessingShape" mc:Ignorable="w14 w15 w16se w16cid w16 w16cex w16sdtdh wp14">
+<w:document xmlns:wpc="http://schemas.microsoft.com/office/word/2010/wordprocessingCanvas" xmlns:cx="http://schemas.microsoft.com/office/drawing/2014/chartex" xmlns:cx1="http://schemas.microsoft.com/office/drawing/2015/9/8/chartex" xmlns:cx2="http://schemas.microsoft.com/office/drawing/2015/10/21/chartex" xmlns:cx3="http://schemas.microsoft.com/office/drawing/2016/5/9/chartex" xmlns:cx4="http://schemas.microsoft.com/office/drawing/2016/5/10/chartex" xmlns:cx5="http://schemas.microsoft.com/office/drawing/2016/5/11/chartex" xmlns:cx6="http://schemas.microsoft.com/office/drawing/2016/5/12/chartex" xmlns:cx7="http://schemas.microsoft.com/office/drawing/2016/5/13/chartex" xmlns:cx8="http://schemas.microsoft.com/office/drawing/2016/5/14/chartex" xmlns:mc="http://schemas.openxmlformats.org/markup-compatibility/2006" xmlns:aink="http://schemas.microsoft.com/office/drawing/2016/ink" xmlns:am3d="http://schemas.microsoft.com/office/drawing/2017/model3d" xmlns:o="urn:schemas-microsoft-com:office:office" xmlns:oel="http://schemas.microsoft.com/office/2019/extlst" xmlns:r="http://schemas.openxmlformats.org/officeDocument/2006/relationships" xmlns:m="http://schemas.openxmlformats.org/officeDocument/2006/math" xmlns:v="urn:schemas-microsoft-com:vml" xmlns:wp14="http://schemas.microsoft.com/office/word/2010/wordprocessingDrawing" xmlns:wp="http://schemas.openxmlformats.org/drawingml/2006/wordprocessingDrawing" xmlns:w10="urn:schemas-microsoft-com:office:word" xmlns:w="http://schemas.openxmlformats.org/wordprocessingml/2006/main" xmlns:w14="http://schemas.microsoft.com/office/word/2010/wordml" xmlns:w15="http://schemas.microsoft.com/office/word/2012/wordml" xmlns:w16cex="http://schemas.microsoft.com/office/word/2018/wordml/cex" xmlns:w16cid="http://schemas.microsoft.com/office/word/2016/wordml/cid" xmlns:w16="http://schemas.microsoft.com/office/word/2018/wordml" xmlns:w16du="http://schemas.microsoft.com/office/word/2023/wordml/word16du" xmlns:w16sdtdh="http://schemas.microsoft.com/office/word/2020/wordml/sdtdatahash" xmlns:w16sdtfl="http://schemas.microsoft.com/office/word/2024/wordml/sdtformatlock" xmlns:w16se="http://schemas.microsoft.com/office/word/2015/wordml/symex" xmlns:wpg="http://schemas.microsoft.com/office/word/2010/wordprocessingGroup" xmlns:wpi="http://schemas.microsoft.com/office/word/2010/wordprocessingInk" xmlns:wne="http://schemas.microsoft.com/office/word/2006/wordml" xmlns:wps="http://schemas.microsoft.com/office/word/2010/wordprocessingShape" mc:Ignorable="w14 w15 w16se w16cid w16 w16cex w16sdtdh w16sdtfl w16du wp14">
   <w:body>
+    <w:p>
+      <w:pPr>
+        <w:spacing w:before="0" w:line="240" w:lineRule="auto"/>
+        <w:jc w:val="center"/>
+        <w:rPr>
+          <w:b/>
+          <w:bCs/>
+          <w:sz w:val="32"/>
+          <w:szCs w:val="32"/>
+          <w:u w:val="single"/>
+        </w:rPr>
+      </w:pPr>
+      <w:r>
+        <w:rPr>
+          <w:b/>
+          <w:bCs/>
+          <w:sz w:val="32"/>
+          <w:szCs w:val="32"/>
+          <w:u w:val="single"/>
+        </w:rPr>
+        <w:t xml:space="preserve">TS </w:t>
+      </w:r>
+      <w:r>
+        <w:rPr>
+          <w:b/>
+          <w:bCs/>
+          <w:sz w:val="32"/>
+          <w:szCs w:val="32"/>
+          <w:u w:val="single"/>
+        </w:rPr>
+        <w:t>Ghanam</w:t>
+      </w:r>
+      <w:r>
+        <w:rPr>
+          <w:b/>
+          <w:bCs/>
+          <w:sz w:val="32"/>
+          <w:szCs w:val="32"/>
+          <w:u w:val="single"/>
+        </w:rPr>
+        <w:t xml:space="preserve"> </w:t>
+      </w:r>
+      <w:r>
+        <w:rPr>
+          <w:b/>
+          <w:bCs/>
+          <w:sz w:val="32"/>
+          <w:szCs w:val="32"/>
+          <w:u w:val="single"/>
+        </w:rPr>
+        <w:t xml:space="preserve">– TS </w:t>
+      </w:r>
+      <w:r>
+        <w:rPr>
+          <w:b/>
+          <w:bCs/>
+          <w:sz w:val="32"/>
+          <w:szCs w:val="32"/>
+          <w:u w:val="single"/>
+        </w:rPr>
+        <w:t>4.3</w:t>
+      </w:r>
+      <w:r>
+        <w:rPr>
+          <w:b/>
+          <w:bCs/>
+          <w:sz w:val="32"/>
+          <w:szCs w:val="32"/>
+          <w:u w:val="single"/>
+        </w:rPr>
+        <w:t xml:space="preserve"> </w:t>
+      </w:r>
+      <w:r>
+        <w:rPr>
+          <w:b/>
+          <w:bCs/>
+          <w:sz w:val="32"/>
+          <w:szCs w:val="32"/>
+          <w:u w:val="single"/>
+        </w:rPr>
+        <w:t>Sanskrit</w:t>
+      </w:r>
+      <w:r>
+        <w:rPr>
+          <w:b/>
+          <w:bCs/>
+          <w:sz w:val="32"/>
+          <w:szCs w:val="32"/>
+          <w:u w:val="single"/>
+        </w:rPr>
+        <w:t xml:space="preserve"> Corrections –</w:t>
+      </w:r>
+      <w:r>
+        <w:rPr>
+          <w:b/>
+          <w:bCs/>
+          <w:sz w:val="32"/>
+          <w:szCs w:val="32"/>
+          <w:u w:val="single"/>
+        </w:rPr>
+        <w:t xml:space="preserve"> </w:t>
+      </w:r>
+      <w:r>
+        <w:rPr>
+          <w:b/>
+          <w:bCs/>
+          <w:sz w:val="32"/>
+          <w:szCs w:val="32"/>
+          <w:u w:val="single"/>
+        </w:rPr>
+        <w:t xml:space="preserve">Observed till </w:t>
+      </w:r>
+      <w:r>
+        <w:rPr>
+          <w:b/>
+          <w:bCs/>
+          <w:sz w:val="32"/>
+          <w:szCs w:val="32"/>
+          <w:u w:val="single"/>
+        </w:rPr>
+        <w:t>31st Oct 2026</w:t>
+      </w:r>
+    </w:p>
+    <w:p>
+      <w:pPr>
+        <w:spacing w:before="0" w:line="240" w:lineRule="auto"/>
+        <w:jc w:val="center"/>
+        <w:rPr>
+          <w:b/>
+          <w:bCs/>
+          <w:sz w:val="28"/>
+          <w:szCs w:val="32"/>
+        </w:rPr>
+      </w:pPr>
+      <w:r>
+        <w:rPr>
+          <w:b/>
+          <w:bCs/>
+          <w:sz w:val="28"/>
+          <w:szCs w:val="32"/>
+        </w:rPr>
+        <w:t>(ignore those which are already incorporated in your book’s version and date)</w:t>
+      </w:r>
+    </w:p>
+    <w:tbl>
+      <w:tblPr>
+        <w:tblW w:w="14459" w:type="dxa"/>
+        <w:tblInd w:w="-714" w:type="dxa"/>
+        <w:tblBorders>
+          <w:top w:val="single" w:sz="4" w:space="0" w:color="000000"/>
+          <w:left w:val="single" w:sz="4" w:space="0" w:color="000000"/>
+          <w:bottom w:val="single" w:sz="4" w:space="0" w:color="000000"/>
+          <w:right w:val="single" w:sz="4" w:space="0" w:color="000000"/>
+          <w:insideH w:val="single" w:sz="4" w:space="0" w:color="000000"/>
+          <w:insideV w:val="single" w:sz="4" w:space="0" w:color="000000"/>
+        </w:tblBorders>
+        <w:tblLook w:val="04A0" w:firstRow="1" w:lastRow="0" w:firstColumn="1" w:lastColumn="0" w:noHBand="0" w:noVBand="1"/>
+      </w:tblPr>
+      <w:tblGrid>
+        <w:gridCol w:w="7088"/>
+        <w:gridCol w:w="7371"/>
+      </w:tblGrid>
+      <w:tr>
+        <w:tc>
+          <w:tcPr>
+            <w:tcW w:w="7088" w:type="dxa"/>
+          </w:tcPr>
+          <w:p>
+            <w:pPr>
+              <w:spacing w:before="0" w:line="240" w:lineRule="auto"/>
+              <w:jc w:val="center"/>
+              <w:rPr>
+                <w:b/>
+                <w:sz w:val="32"/>
+                <w:szCs w:val="32"/>
+              </w:rPr>
+            </w:pPr>
+            <w:r>
+              <w:rPr>
+                <w:b/>
+                <w:sz w:val="32"/>
+                <w:szCs w:val="32"/>
+              </w:rPr>
+              <w:t>As Printed</w:t>
+            </w:r>
+          </w:p>
+        </w:tc>
+        <w:tc>
+          <w:tcPr>
+            <w:tcW w:w="7371" w:type="dxa"/>
+          </w:tcPr>
+          <w:p>
+            <w:pPr>
+              <w:spacing w:before="0" w:line="240" w:lineRule="auto"/>
+              <w:ind w:right="-18"/>
+              <w:jc w:val="center"/>
+              <w:rPr>
+                <w:b/>
+                <w:sz w:val="32"/>
+                <w:szCs w:val="32"/>
+              </w:rPr>
+            </w:pPr>
+            <w:r>
+              <w:rPr>
+                <w:b/>
+                <w:sz w:val="32"/>
+                <w:szCs w:val="32"/>
+              </w:rPr>
+              <w:t>To be read as or corrected as</w:t>
+            </w:r>
+            <w:r>
+              <w:rPr>
+                <w:b/>
+                <w:sz w:val="32"/>
+                <w:szCs w:val="32"/>
+              </w:rPr>
+              <w:t xml:space="preserve"> </w:t>
+            </w:r>
+          </w:p>
+        </w:tc>
+      </w:tr>
+      <w:tr>
+        <w:trPr>
+          <w:trHeight w:val="801"/>
+        </w:trPr>
+        <w:tc>
+          <w:tcPr>
+            <w:tcW w:w="7088" w:type="dxa"/>
+            <w:tcBorders>
+              <w:top w:val="single" w:sz="4" w:space="0" w:color="000000"/>
+              <w:left w:val="single" w:sz="4" w:space="0" w:color="000000"/>
+              <w:bottom w:val="single" w:sz="4" w:space="0" w:color="000000"/>
+              <w:right w:val="single" w:sz="4" w:space="0" w:color="000000"/>
+            </w:tcBorders>
+          </w:tcPr>
+          <w:p>
+            <w:pPr>
+              <w:widowControl w:val="0"/>
+              <w:autoSpaceDE w:val="0"/>
+              <w:autoSpaceDN w:val="0"/>
+              <w:adjustRightInd w:val="0"/>
+              <w:spacing w:before="0" w:line="240" w:lineRule="auto"/>
+              <w:rPr>
+                <w:rFonts w:ascii="BRH Devanagari Extra" w:hAnsi="BRH Devanagari Extra" w:cs="BRH Devanagari Extra"/>
+                <w:sz w:val="32"/>
+                <w:szCs w:val="32"/>
+              </w:rPr>
+            </w:pPr>
+            <w:r>
+              <w:rPr>
+                <w:rFonts w:ascii="BRH Devanagari Extra" w:hAnsi="BRH Devanagari Extra" w:cs="BRH Devanagari Extra"/>
+                <w:sz w:val="32"/>
+                <w:szCs w:val="32"/>
+              </w:rPr>
+              <w:t>(</w:t>
+            </w:r>
+            <w:r>
+              <w:rPr>
+                <w:rFonts w:cs="BRH Devanagari Extra"/>
+                <w:szCs w:val="32"/>
+              </w:rPr>
+              <w:t>30</w:t>
+            </w:r>
+            <w:r>
+              <w:rPr>
+                <w:rFonts w:ascii="BRH Devanagari Extra" w:hAnsi="BRH Devanagari Extra" w:cs="BRH Devanagari Extra"/>
+                <w:sz w:val="32"/>
+                <w:szCs w:val="32"/>
+              </w:rPr>
+              <w:t>)[</w:t>
+            </w:r>
+            <w:r>
+              <w:rPr>
+                <w:rFonts w:cs="BRH Devanagari Extra"/>
+                <w:szCs w:val="32"/>
+              </w:rPr>
+              <w:t>P19</w:t>
+            </w:r>
+            <w:r>
+              <w:rPr>
+                <w:rFonts w:ascii="BRH Devanagari Extra" w:hAnsi="BRH Devanagari Extra" w:cs="BRH Devanagari Extra"/>
+                <w:sz w:val="32"/>
+                <w:szCs w:val="32"/>
+              </w:rPr>
+              <w:t xml:space="preserve">] </w:t>
+            </w:r>
+            <w:r>
+              <w:rPr>
+                <w:rFonts w:cs="BRH Devanagari Extra"/>
+                <w:szCs w:val="32"/>
+              </w:rPr>
+              <w:t>4</w:t>
+            </w:r>
+            <w:r>
+              <w:rPr>
+                <w:rFonts w:ascii="BRH Devanagari Extra" w:hAnsi="BRH Devanagari Extra" w:cs="BRH Devanagari Extra"/>
+                <w:sz w:val="32"/>
+                <w:szCs w:val="32"/>
+              </w:rPr>
+              <w:t>.</w:t>
+            </w:r>
+            <w:r>
+              <w:rPr>
+                <w:rFonts w:cs="BRH Devanagari Extra"/>
+                <w:szCs w:val="32"/>
+              </w:rPr>
+              <w:t>3</w:t>
+            </w:r>
+            <w:r>
+              <w:rPr>
+                <w:rFonts w:ascii="BRH Devanagari Extra" w:hAnsi="BRH Devanagari Extra" w:cs="BRH Devanagari Extra"/>
+                <w:sz w:val="32"/>
+                <w:szCs w:val="32"/>
+              </w:rPr>
+              <w:t>.</w:t>
+            </w:r>
+            <w:r>
+              <w:rPr>
+                <w:rFonts w:cs="BRH Devanagari Extra"/>
+                <w:szCs w:val="32"/>
+              </w:rPr>
+              <w:t>10</w:t>
+            </w:r>
+            <w:r>
+              <w:rPr>
+                <w:rFonts w:ascii="BRH Devanagari Extra" w:hAnsi="BRH Devanagari Extra" w:cs="BRH Devanagari Extra"/>
+                <w:sz w:val="32"/>
+                <w:szCs w:val="32"/>
+              </w:rPr>
+              <w:t>.</w:t>
+            </w:r>
+            <w:r>
+              <w:rPr>
+                <w:rFonts w:cs="BRH Devanagari Extra"/>
+                <w:szCs w:val="32"/>
+              </w:rPr>
+              <w:t>2</w:t>
+            </w:r>
+            <w:r>
+              <w:rPr>
+                <w:rFonts w:ascii="BRH Devanagari Extra" w:hAnsi="BRH Devanagari Extra" w:cs="BRH Devanagari Extra"/>
+                <w:sz w:val="32"/>
+                <w:szCs w:val="32"/>
+              </w:rPr>
+              <w:t>(</w:t>
+            </w:r>
+            <w:r>
+              <w:rPr>
+                <w:rFonts w:cs="BRH Devanagari Extra"/>
+                <w:szCs w:val="32"/>
+              </w:rPr>
+              <w:t>22</w:t>
+            </w:r>
+            <w:r>
+              <w:rPr>
+                <w:rFonts w:ascii="BRH Devanagari Extra" w:hAnsi="BRH Devanagari Extra" w:cs="BRH Devanagari Extra"/>
+                <w:sz w:val="32"/>
+                <w:szCs w:val="32"/>
+              </w:rPr>
+              <w:t>)-  AÉ</w:t>
+            </w:r>
+            <w:r>
+              <w:rPr>
+                <w:rFonts w:ascii="BRH Malayalam Extra" w:hAnsi="BRH Malayalam Extra" w:cs="BRH Devanagari Extra"/>
+                <w:szCs w:val="32"/>
+              </w:rPr>
+              <w:t>–</w:t>
+            </w:r>
+            <w:r>
+              <w:rPr>
+                <w:rFonts w:ascii="BRH Devanagari Extra" w:hAnsi="BRH Devanagari Extra" w:cs="BRH Devanagari Extra"/>
+                <w:sz w:val="32"/>
+                <w:szCs w:val="32"/>
+              </w:rPr>
+              <w:t>xiÉÉ</w:t>
+            </w:r>
+            <w:r>
+              <w:rPr>
+                <w:rFonts w:ascii="BRH Malayalam Extra" w:hAnsi="BRH Malayalam Extra" w:cs="BRH Devanagari Extra"/>
+                <w:szCs w:val="32"/>
+              </w:rPr>
+              <w:t>–</w:t>
+            </w:r>
+            <w:r>
+              <w:rPr>
+                <w:rFonts w:ascii="BRH Devanagari Extra" w:hAnsi="BRH Devanagari Extra" w:cs="BRH Devanagari Extra"/>
+                <w:sz w:val="32"/>
+                <w:szCs w:val="32"/>
+              </w:rPr>
+              <w:t>qÉç | LMüþÌuÉ</w:t>
+            </w:r>
+            <w:r>
+              <w:rPr>
+                <w:rFonts w:ascii="BRH Devanagari Extra" w:hAnsi="BRH Devanagari Extra" w:cs="BRH Devanagari Extra"/>
+                <w:sz w:val="26"/>
+                <w:szCs w:val="32"/>
+              </w:rPr>
+              <w:t>óè</w:t>
+            </w:r>
+            <w:r>
+              <w:rPr>
+                <w:rFonts w:ascii="BRH Devanagari Extra" w:hAnsi="BRH Devanagari Extra" w:cs="BRH Devanagari Extra"/>
+                <w:sz w:val="32"/>
+                <w:szCs w:val="32"/>
+              </w:rPr>
+              <w:t xml:space="preserve">zÉirÉÉ | </w:t>
+            </w:r>
+          </w:p>
+          <w:p>
+            <w:pPr>
+              <w:widowControl w:val="0"/>
+              <w:autoSpaceDE w:val="0"/>
+              <w:autoSpaceDN w:val="0"/>
+              <w:adjustRightInd w:val="0"/>
+              <w:spacing w:before="0" w:line="240" w:lineRule="auto"/>
+              <w:rPr>
+                <w:rFonts w:ascii="BRH Devanagari Extra" w:hAnsi="BRH Devanagari Extra" w:cs="BRH Devanagari Extra"/>
+                <w:sz w:val="32"/>
+                <w:szCs w:val="32"/>
+              </w:rPr>
+            </w:pPr>
+            <w:r>
+              <w:rPr>
+                <w:rFonts w:ascii="BRH Devanagari Extra" w:hAnsi="BRH Devanagari Extra" w:cs="BRH Devanagari Extra"/>
+                <w:sz w:val="32"/>
+                <w:szCs w:val="32"/>
+              </w:rPr>
+              <w:t>A</w:t>
+            </w:r>
+            <w:r>
+              <w:rPr>
+                <w:rFonts w:ascii="BRH Malayalam Extra" w:hAnsi="BRH Malayalam Extra" w:cs="BRH Devanagari Extra"/>
+                <w:szCs w:val="32"/>
+              </w:rPr>
+              <w:t>–</w:t>
+            </w:r>
+            <w:r>
+              <w:rPr>
+                <w:rFonts w:ascii="BRH Devanagari Extra" w:hAnsi="BRH Devanagari Extra" w:cs="BRH Devanagari Extra"/>
+                <w:sz w:val="32"/>
+                <w:szCs w:val="32"/>
+              </w:rPr>
+              <w:t>xiÉÑ</w:t>
+            </w:r>
+            <w:r>
+              <w:rPr>
+                <w:rFonts w:ascii="BRH Malayalam Extra" w:hAnsi="BRH Malayalam Extra" w:cs="BRH Devanagari Extra"/>
+                <w:szCs w:val="32"/>
+              </w:rPr>
+              <w:t>–</w:t>
+            </w:r>
+            <w:r>
+              <w:rPr>
+                <w:rFonts w:ascii="BRH Devanagari Extra" w:hAnsi="BRH Devanagari Extra" w:cs="BRH Devanagari Extra"/>
+                <w:sz w:val="32"/>
+                <w:szCs w:val="32"/>
+              </w:rPr>
+              <w:t>uÉ</w:t>
+            </w:r>
+            <w:r>
+              <w:rPr>
+                <w:rFonts w:ascii="BRH Malayalam Extra" w:hAnsi="BRH Malayalam Extra" w:cs="BRH Devanagari Extra"/>
+                <w:szCs w:val="32"/>
+                <w:highlight w:val="yellow"/>
+              </w:rPr>
+              <w:t>–</w:t>
+            </w:r>
+            <w:r>
+              <w:rPr>
+                <w:rFonts w:ascii="BRH Devanagari Extra" w:hAnsi="BRH Devanagari Extra" w:cs="BRH Devanagari Extra"/>
+                <w:sz w:val="32"/>
+                <w:szCs w:val="32"/>
+                <w:highlight w:val="yellow"/>
+              </w:rPr>
+              <w:t>iÉ</w:t>
+            </w:r>
+            <w:r>
+              <w:rPr>
+                <w:rFonts w:ascii="BRH Devanagari Extra" w:hAnsi="BRH Devanagari Extra" w:cs="BRH Devanagari Extra"/>
+                <w:sz w:val="32"/>
+                <w:szCs w:val="32"/>
+              </w:rPr>
+              <w:t xml:space="preserve"> |</w:t>
+            </w:r>
+          </w:p>
+          <w:p>
+            <w:pPr>
+              <w:widowControl w:val="0"/>
+              <w:autoSpaceDE w:val="0"/>
+              <w:autoSpaceDN w:val="0"/>
+              <w:adjustRightInd w:val="0"/>
+              <w:spacing w:before="0" w:line="240" w:lineRule="auto"/>
+              <w:rPr>
+                <w:rFonts w:ascii="BRH Devanagari Extra" w:hAnsi="BRH Devanagari Extra" w:cs="BRH Devanagari Extra"/>
+                <w:sz w:val="32"/>
+                <w:szCs w:val="32"/>
+              </w:rPr>
+            </w:pPr>
+            <w:r>
+              <w:rPr>
+                <w:rFonts w:ascii="BRH Devanagari Extra" w:hAnsi="BRH Devanagari Extra" w:cs="BRH Devanagari Extra"/>
+                <w:sz w:val="32"/>
+                <w:szCs w:val="32"/>
+              </w:rPr>
+              <w:t>AÉ</w:t>
+            </w:r>
+            <w:r>
+              <w:rPr>
+                <w:rFonts w:ascii="BRH Malayalam Extra" w:hAnsi="BRH Malayalam Extra" w:cs="BRH Devanagari Extra"/>
+                <w:szCs w:val="32"/>
+              </w:rPr>
+              <w:t>–</w:t>
+            </w:r>
+            <w:r>
+              <w:rPr>
+                <w:rFonts w:ascii="BRH Devanagari Extra" w:hAnsi="BRH Devanagari Extra" w:cs="BRH Devanagari Extra"/>
+                <w:sz w:val="32"/>
+                <w:szCs w:val="32"/>
+              </w:rPr>
+              <w:t>xiÉÉ</w:t>
+            </w:r>
+            <w:r>
+              <w:rPr>
+                <w:rFonts w:ascii="BRH Malayalam Extra" w:hAnsi="BRH Malayalam Extra" w:cs="BRH Devanagari Extra"/>
+                <w:szCs w:val="32"/>
+              </w:rPr>
+              <w:t>–</w:t>
+            </w:r>
+            <w:r>
+              <w:rPr>
+                <w:rFonts w:ascii="BRH Devanagari Extra" w:hAnsi="BRH Devanagari Extra" w:cs="BRH Devanagari Extra"/>
+                <w:sz w:val="32"/>
+                <w:szCs w:val="32"/>
+              </w:rPr>
+              <w:t xml:space="preserve"> qÉåMüþÌuÉ</w:t>
+            </w:r>
+            <w:r>
+              <w:rPr>
+                <w:rFonts w:ascii="BRH Devanagari Extra" w:hAnsi="BRH Devanagari Extra" w:cs="BRH Devanagari Extra"/>
+                <w:sz w:val="26"/>
+                <w:szCs w:val="32"/>
+              </w:rPr>
+              <w:t>óè</w:t>
+            </w:r>
+            <w:r>
+              <w:rPr>
+                <w:rFonts w:ascii="BRH Devanagari Extra" w:hAnsi="BRH Devanagari Extra" w:cs="BRH Devanagari Extra"/>
+                <w:sz w:val="32"/>
+                <w:szCs w:val="32"/>
+              </w:rPr>
+              <w:t>zÉ</w:t>
+            </w:r>
+            <w:r>
+              <w:rPr>
+                <w:rFonts w:ascii="BRH Malayalam Extra" w:hAnsi="BRH Malayalam Extra" w:cs="BRH Devanagari Extra"/>
+                <w:szCs w:val="32"/>
+              </w:rPr>
+              <w:t>–</w:t>
+            </w:r>
+            <w:r>
+              <w:rPr>
+                <w:rFonts w:ascii="BRH Devanagari Extra" w:hAnsi="BRH Devanagari Extra" w:cs="BRH Devanagari Extra"/>
+                <w:sz w:val="32"/>
+                <w:szCs w:val="32"/>
+              </w:rPr>
+              <w:t xml:space="preserve"> irÉæMüþÌuÉ</w:t>
+            </w:r>
+            <w:r>
+              <w:rPr>
+                <w:rFonts w:ascii="BRH Devanagari Extra" w:hAnsi="BRH Devanagari Extra" w:cs="BRH Devanagari Extra"/>
+                <w:sz w:val="26"/>
+                <w:szCs w:val="32"/>
+              </w:rPr>
+              <w:t>óè</w:t>
+            </w:r>
+            <w:r>
+              <w:rPr>
+                <w:rFonts w:ascii="BRH Devanagari Extra" w:hAnsi="BRH Devanagari Extra" w:cs="BRH Devanagari Extra"/>
+                <w:sz w:val="32"/>
+                <w:szCs w:val="32"/>
+              </w:rPr>
+              <w:t>zÉirÉÉ ÅÅxiÉÉ qÉÉxiÉÉ</w:t>
+            </w:r>
+            <w:r>
+              <w:rPr>
+                <w:rFonts w:ascii="BRH Malayalam Extra" w:hAnsi="BRH Malayalam Extra" w:cs="BRH Devanagari Extra"/>
+                <w:szCs w:val="32"/>
+              </w:rPr>
+              <w:t>–</w:t>
+            </w:r>
+            <w:r>
+              <w:rPr>
+                <w:rFonts w:ascii="BRH Devanagari Extra" w:hAnsi="BRH Devanagari Extra" w:cs="BRH Devanagari Extra"/>
+                <w:sz w:val="32"/>
+                <w:szCs w:val="32"/>
+              </w:rPr>
+              <w:t xml:space="preserve"> qÉåMüþÌuÉ</w:t>
+            </w:r>
+            <w:r>
+              <w:rPr>
+                <w:rFonts w:ascii="BRH Devanagari Extra" w:hAnsi="BRH Devanagari Extra" w:cs="BRH Devanagari Extra"/>
+                <w:sz w:val="26"/>
+                <w:szCs w:val="32"/>
+              </w:rPr>
+              <w:t>óè</w:t>
+            </w:r>
+            <w:r>
+              <w:rPr>
+                <w:rFonts w:ascii="BRH Devanagari Extra" w:hAnsi="BRH Devanagari Extra" w:cs="BRH Devanagari Extra"/>
+                <w:sz w:val="32"/>
+                <w:szCs w:val="32"/>
+              </w:rPr>
+              <w:t>zÉirÉÉ ÅxiÉ</w:t>
+            </w:r>
+            <w:r>
+              <w:rPr>
+                <w:rFonts w:ascii="BRH Devanagari Extra" w:hAnsi="BRH Devanagari Extra" w:cs="BRH Devanagari Extra"/>
+                <w:sz w:val="32"/>
+                <w:szCs w:val="32"/>
+                <w:highlight w:val="yellow"/>
+              </w:rPr>
+              <w:t>Ñu</w:t>
+            </w:r>
+            <w:r>
+              <w:rPr>
+                <w:rFonts w:ascii="BRH Devanagari Extra" w:hAnsi="BRH Devanagari Extra" w:cs="BRH Devanagari Extra"/>
+                <w:sz w:val="32"/>
+                <w:szCs w:val="32"/>
+              </w:rPr>
+              <w:t>É</w:t>
+            </w:r>
+            <w:r>
+              <w:rPr>
+                <w:rFonts w:ascii="BRH Malayalam Extra" w:hAnsi="BRH Malayalam Extra" w:cs="BRH Devanagari Extra"/>
+                <w:szCs w:val="32"/>
+              </w:rPr>
+              <w:t>–</w:t>
+            </w:r>
+            <w:r>
+              <w:rPr>
+                <w:rFonts w:ascii="BRH Devanagari Extra" w:hAnsi="BRH Devanagari Extra" w:cs="BRH Devanagari Extra"/>
+                <w:sz w:val="32"/>
+                <w:szCs w:val="32"/>
+              </w:rPr>
+              <w:t xml:space="preserve">iÉÉ </w:t>
+            </w:r>
+            <w:r>
+              <w:rPr>
+                <w:rFonts w:ascii="BRH Devanagari Extra" w:hAnsi="BRH Devanagari Extra" w:cs="BRH Devanagari Extra"/>
+                <w:sz w:val="32"/>
+                <w:szCs w:val="32"/>
+                <w:highlight w:val="yellow"/>
+              </w:rPr>
+              <w:t>xiÉ</w:t>
+            </w:r>
+            <w:r>
+              <w:rPr>
+                <w:rFonts w:ascii="BRH Devanagari Extra" w:hAnsi="BRH Devanagari Extra" w:cs="BRH Devanagari Extra"/>
+                <w:sz w:val="32"/>
+                <w:szCs w:val="32"/>
+              </w:rPr>
+              <w:t>ÑþuÉ</w:t>
+            </w:r>
+            <w:r>
+              <w:rPr>
+                <w:rFonts w:ascii="BRH Malayalam Extra" w:hAnsi="BRH Malayalam Extra" w:cs="BRH Devanagari Extra"/>
+                <w:szCs w:val="32"/>
+              </w:rPr>
+              <w:t>–</w:t>
+            </w:r>
+            <w:r>
+              <w:rPr>
+                <w:rFonts w:ascii="BRH Devanagari Extra" w:hAnsi="BRH Devanagari Extra" w:cs="BRH Devanagari Extra"/>
+                <w:sz w:val="32"/>
+                <w:szCs w:val="32"/>
+              </w:rPr>
+              <w:t xml:space="preserve"> iÉæMüþÌuÉ</w:t>
+            </w:r>
+            <w:r>
+              <w:rPr>
+                <w:rFonts w:ascii="BRH Devanagari Extra" w:hAnsi="BRH Devanagari Extra" w:cs="BRH Devanagari Extra"/>
+                <w:sz w:val="26"/>
+                <w:szCs w:val="32"/>
+              </w:rPr>
+              <w:t>óè</w:t>
+            </w:r>
+            <w:r>
+              <w:rPr>
+                <w:rFonts w:ascii="BRH Devanagari Extra" w:hAnsi="BRH Devanagari Extra" w:cs="BRH Devanagari Extra"/>
+                <w:sz w:val="32"/>
+                <w:szCs w:val="32"/>
+              </w:rPr>
+              <w:t>zÉirÉÉ ÅÅxiÉÉ qÉÉxiÉÉ</w:t>
+            </w:r>
+            <w:r>
+              <w:rPr>
+                <w:rFonts w:ascii="BRH Malayalam Extra" w:hAnsi="BRH Malayalam Extra" w:cs="BRH Devanagari Extra"/>
+                <w:szCs w:val="32"/>
+              </w:rPr>
+              <w:t>–</w:t>
+            </w:r>
+            <w:r>
+              <w:rPr>
+                <w:rFonts w:ascii="BRH Devanagari Extra" w:hAnsi="BRH Devanagari Extra" w:cs="BRH Devanagari Extra"/>
+                <w:sz w:val="32"/>
+                <w:szCs w:val="32"/>
+              </w:rPr>
+              <w:t xml:space="preserve"> qÉåMüþÌuÉ</w:t>
+            </w:r>
+            <w:r>
+              <w:rPr>
+                <w:rFonts w:ascii="BRH Devanagari Extra" w:hAnsi="BRH Devanagari Extra" w:cs="BRH Devanagari Extra"/>
+                <w:sz w:val="26"/>
+                <w:szCs w:val="32"/>
+              </w:rPr>
+              <w:t>óè</w:t>
+            </w:r>
+            <w:r>
+              <w:rPr>
+                <w:rFonts w:ascii="BRH Devanagari Extra" w:hAnsi="BRH Devanagari Extra" w:cs="BRH Devanagari Extra"/>
+                <w:sz w:val="32"/>
+                <w:szCs w:val="32"/>
+              </w:rPr>
+              <w:t>zÉirÉÉ ÅxiÉ</w:t>
+            </w:r>
+            <w:r>
+              <w:rPr>
+                <w:rFonts w:ascii="BRH Devanagari Extra" w:hAnsi="BRH Devanagari Extra" w:cs="BRH Devanagari Extra"/>
+                <w:sz w:val="32"/>
+                <w:szCs w:val="32"/>
+                <w:highlight w:val="yellow"/>
+              </w:rPr>
+              <w:t>Ñu</w:t>
+            </w:r>
+            <w:r>
+              <w:rPr>
+                <w:rFonts w:ascii="BRH Devanagari Extra" w:hAnsi="BRH Devanagari Extra" w:cs="BRH Devanagari Extra"/>
+                <w:sz w:val="32"/>
+                <w:szCs w:val="32"/>
+              </w:rPr>
+              <w:t>É</w:t>
+            </w:r>
+            <w:r>
+              <w:rPr>
+                <w:rFonts w:ascii="BRH Malayalam Extra" w:hAnsi="BRH Malayalam Extra" w:cs="BRH Devanagari Extra"/>
+                <w:szCs w:val="32"/>
+              </w:rPr>
+              <w:t>–</w:t>
+            </w:r>
+            <w:r>
+              <w:rPr>
+                <w:rFonts w:ascii="BRH Devanagari Extra" w:hAnsi="BRH Devanagari Extra" w:cs="BRH Devanagari Extra"/>
+                <w:sz w:val="32"/>
+                <w:szCs w:val="32"/>
+              </w:rPr>
+              <w:t xml:space="preserve">iÉ | </w:t>
+            </w:r>
+          </w:p>
+          <w:p>
+            <w:pPr>
+              <w:widowControl w:val="0"/>
+              <w:autoSpaceDE w:val="0"/>
+              <w:autoSpaceDN w:val="0"/>
+              <w:adjustRightInd w:val="0"/>
+              <w:spacing w:before="0" w:line="240" w:lineRule="auto"/>
+              <w:rPr>
+                <w:rFonts w:ascii="BRH Devanagari Extra" w:hAnsi="BRH Devanagari Extra" w:cs="BRH Devanagari Extra"/>
+                <w:sz w:val="32"/>
+                <w:szCs w:val="32"/>
+              </w:rPr>
+            </w:pPr>
+            <w:r>
+              <w:rPr>
+                <w:rFonts w:ascii="BRH Devanagari Extra" w:hAnsi="BRH Devanagari Extra" w:cs="BRH Devanagari Extra"/>
+                <w:sz w:val="32"/>
+                <w:szCs w:val="32"/>
+              </w:rPr>
+              <w:t>(</w:t>
+            </w:r>
+            <w:r>
+              <w:rPr>
+                <w:rFonts w:cs="BRH Devanagari Extra"/>
+                <w:szCs w:val="32"/>
+              </w:rPr>
+              <w:t>31</w:t>
+            </w:r>
+            <w:r>
+              <w:rPr>
+                <w:rFonts w:ascii="BRH Devanagari Extra" w:hAnsi="BRH Devanagari Extra" w:cs="BRH Devanagari Extra"/>
+                <w:sz w:val="32"/>
+                <w:szCs w:val="32"/>
+              </w:rPr>
+              <w:t>)[</w:t>
+            </w:r>
+            <w:r>
+              <w:rPr>
+                <w:rFonts w:cs="BRH Devanagari Extra"/>
+                <w:szCs w:val="32"/>
+              </w:rPr>
+              <w:t>P19</w:t>
+            </w:r>
+            <w:r>
+              <w:rPr>
+                <w:rFonts w:ascii="BRH Devanagari Extra" w:hAnsi="BRH Devanagari Extra" w:cs="BRH Devanagari Extra"/>
+                <w:sz w:val="32"/>
+                <w:szCs w:val="32"/>
+              </w:rPr>
+              <w:t xml:space="preserve">] </w:t>
+            </w:r>
+            <w:r>
+              <w:rPr>
+                <w:rFonts w:cs="BRH Devanagari Extra"/>
+                <w:szCs w:val="32"/>
+              </w:rPr>
+              <w:t>4</w:t>
+            </w:r>
+            <w:r>
+              <w:rPr>
+                <w:rFonts w:ascii="BRH Devanagari Extra" w:hAnsi="BRH Devanagari Extra" w:cs="BRH Devanagari Extra"/>
+                <w:sz w:val="32"/>
+                <w:szCs w:val="32"/>
+              </w:rPr>
+              <w:t>.</w:t>
+            </w:r>
+            <w:r>
+              <w:rPr>
+                <w:rFonts w:cs="BRH Devanagari Extra"/>
+                <w:szCs w:val="32"/>
+              </w:rPr>
+              <w:t>3</w:t>
+            </w:r>
+            <w:r>
+              <w:rPr>
+                <w:rFonts w:ascii="BRH Devanagari Extra" w:hAnsi="BRH Devanagari Extra" w:cs="BRH Devanagari Extra"/>
+                <w:sz w:val="32"/>
+                <w:szCs w:val="32"/>
+              </w:rPr>
+              <w:t>.</w:t>
+            </w:r>
+            <w:r>
+              <w:rPr>
+                <w:rFonts w:cs="BRH Devanagari Extra"/>
+                <w:szCs w:val="32"/>
+              </w:rPr>
+              <w:t>10</w:t>
+            </w:r>
+            <w:r>
+              <w:rPr>
+                <w:rFonts w:ascii="BRH Devanagari Extra" w:hAnsi="BRH Devanagari Extra" w:cs="BRH Devanagari Extra"/>
+                <w:sz w:val="32"/>
+                <w:szCs w:val="32"/>
+              </w:rPr>
+              <w:t>.</w:t>
+            </w:r>
+            <w:r>
+              <w:rPr>
+                <w:rFonts w:cs="BRH Devanagari Extra"/>
+                <w:szCs w:val="32"/>
+              </w:rPr>
+              <w:t>2</w:t>
+            </w:r>
+            <w:r>
+              <w:rPr>
+                <w:rFonts w:ascii="BRH Devanagari Extra" w:hAnsi="BRH Devanagari Extra" w:cs="BRH Devanagari Extra"/>
+                <w:sz w:val="32"/>
+                <w:szCs w:val="32"/>
+              </w:rPr>
+              <w:t>(</w:t>
+            </w:r>
+            <w:r>
+              <w:rPr>
+                <w:rFonts w:cs="BRH Devanagari Extra"/>
+                <w:szCs w:val="32"/>
+              </w:rPr>
+              <w:t>23</w:t>
+            </w:r>
+            <w:r>
+              <w:rPr>
+                <w:rFonts w:ascii="BRH Devanagari Extra" w:hAnsi="BRH Devanagari Extra" w:cs="BRH Devanagari Extra"/>
+                <w:sz w:val="32"/>
+                <w:szCs w:val="32"/>
+              </w:rPr>
+              <w:t>)-  LMüþÌuÉ</w:t>
+            </w:r>
+            <w:r>
+              <w:rPr>
+                <w:rFonts w:ascii="BRH Devanagari Extra" w:hAnsi="BRH Devanagari Extra" w:cs="BRH Devanagari Extra"/>
+                <w:sz w:val="26"/>
+                <w:szCs w:val="32"/>
+              </w:rPr>
+              <w:t>óè</w:t>
+            </w:r>
+            <w:r>
+              <w:rPr>
+                <w:rFonts w:ascii="BRH Devanagari Extra" w:hAnsi="BRH Devanagari Extra" w:cs="BRH Devanagari Extra"/>
+                <w:sz w:val="32"/>
+                <w:szCs w:val="32"/>
+              </w:rPr>
+              <w:t>zÉirÉÉ | A</w:t>
+            </w:r>
+            <w:r>
+              <w:rPr>
+                <w:rFonts w:ascii="BRH Malayalam Extra" w:hAnsi="BRH Malayalam Extra" w:cs="BRH Devanagari Extra"/>
+                <w:szCs w:val="32"/>
+              </w:rPr>
+              <w:t>–</w:t>
+            </w:r>
+            <w:r>
+              <w:rPr>
+                <w:rFonts w:ascii="BRH Devanagari Extra" w:hAnsi="BRH Devanagari Extra" w:cs="BRH Devanagari Extra"/>
+                <w:sz w:val="32"/>
+                <w:szCs w:val="32"/>
+              </w:rPr>
+              <w:t>xiÉÑ</w:t>
+            </w:r>
+            <w:r>
+              <w:rPr>
+                <w:rFonts w:ascii="BRH Malayalam Extra" w:hAnsi="BRH Malayalam Extra" w:cs="BRH Devanagari Extra"/>
+                <w:szCs w:val="32"/>
+              </w:rPr>
+              <w:t>–</w:t>
+            </w:r>
+            <w:r>
+              <w:rPr>
+                <w:rFonts w:ascii="BRH Devanagari Extra" w:hAnsi="BRH Devanagari Extra" w:cs="BRH Devanagari Extra"/>
+                <w:sz w:val="32"/>
+                <w:szCs w:val="32"/>
+              </w:rPr>
+              <w:t>uÉ</w:t>
+            </w:r>
+            <w:r>
+              <w:rPr>
+                <w:rFonts w:ascii="BRH Malayalam Extra" w:hAnsi="BRH Malayalam Extra" w:cs="BRH Devanagari Extra"/>
+                <w:szCs w:val="32"/>
+                <w:highlight w:val="yellow"/>
+              </w:rPr>
+              <w:t>–</w:t>
+            </w:r>
+            <w:r>
+              <w:rPr>
+                <w:rFonts w:ascii="BRH Devanagari Extra" w:hAnsi="BRH Devanagari Extra" w:cs="BRH Devanagari Extra"/>
+                <w:sz w:val="32"/>
+                <w:szCs w:val="32"/>
+                <w:highlight w:val="yellow"/>
+              </w:rPr>
+              <w:t>i</w:t>
+            </w:r>
+            <w:r>
+              <w:rPr>
+                <w:rFonts w:ascii="BRH Devanagari Extra" w:hAnsi="BRH Devanagari Extra" w:cs="BRH Devanagari Extra"/>
+                <w:sz w:val="32"/>
+                <w:szCs w:val="32"/>
+              </w:rPr>
+              <w:t>É | LMüþzÉTüÉÈ |</w:t>
+            </w:r>
+          </w:p>
+          <w:p>
+            <w:pPr>
+              <w:widowControl w:val="0"/>
+              <w:autoSpaceDE w:val="0"/>
+              <w:autoSpaceDN w:val="0"/>
+              <w:adjustRightInd w:val="0"/>
+              <w:spacing w:before="0" w:line="240" w:lineRule="auto"/>
+              <w:rPr>
+                <w:rFonts w:ascii="BRH Devanagari Extra" w:hAnsi="BRH Devanagari Extra" w:cs="BRH Devanagari Extra"/>
+                <w:sz w:val="32"/>
+                <w:szCs w:val="32"/>
+              </w:rPr>
+            </w:pPr>
+            <w:r>
+              <w:rPr>
+                <w:rFonts w:ascii="BRH Devanagari Extra" w:hAnsi="BRH Devanagari Extra" w:cs="BRH Devanagari Extra"/>
+                <w:sz w:val="32"/>
+                <w:szCs w:val="32"/>
+              </w:rPr>
+              <w:t>LMüþÌuÉ</w:t>
+            </w:r>
+            <w:r>
+              <w:rPr>
+                <w:rFonts w:ascii="BRH Devanagari Extra" w:hAnsi="BRH Devanagari Extra" w:cs="BRH Devanagari Extra"/>
+                <w:sz w:val="26"/>
+                <w:szCs w:val="32"/>
+              </w:rPr>
+              <w:t>óè</w:t>
+            </w:r>
+            <w:r>
+              <w:rPr>
+                <w:rFonts w:ascii="BRH Devanagari Extra" w:hAnsi="BRH Devanagari Extra" w:cs="BRH Devanagari Extra"/>
+                <w:sz w:val="32"/>
+                <w:szCs w:val="32"/>
+              </w:rPr>
+              <w:t>zÉirÉÉ ÅxiÉ</w:t>
+            </w:r>
+            <w:r>
+              <w:rPr>
+                <w:rFonts w:ascii="BRH Devanagari Extra" w:hAnsi="BRH Devanagari Extra" w:cs="BRH Devanagari Extra"/>
+                <w:sz w:val="32"/>
+                <w:szCs w:val="32"/>
+                <w:highlight w:val="yellow"/>
+              </w:rPr>
+              <w:t>Ñu</w:t>
+            </w:r>
+            <w:r>
+              <w:rPr>
+                <w:rFonts w:ascii="BRH Devanagari Extra" w:hAnsi="BRH Devanagari Extra" w:cs="BRH Devanagari Extra"/>
+                <w:sz w:val="32"/>
+                <w:szCs w:val="32"/>
+              </w:rPr>
+              <w:t>É</w:t>
+            </w:r>
+            <w:r>
+              <w:rPr>
+                <w:rFonts w:ascii="BRH Malayalam Extra" w:hAnsi="BRH Malayalam Extra" w:cs="BRH Devanagari Extra"/>
+                <w:szCs w:val="32"/>
+              </w:rPr>
+              <w:t>–</w:t>
+            </w:r>
+            <w:r>
+              <w:rPr>
+                <w:rFonts w:ascii="BRH Devanagari Extra" w:hAnsi="BRH Devanagari Extra" w:cs="BRH Devanagari Extra"/>
+                <w:sz w:val="32"/>
+                <w:szCs w:val="32"/>
+              </w:rPr>
+              <w:t>iÉÉ x</w:t>
+            </w:r>
+            <w:r>
+              <w:rPr>
+                <w:rFonts w:ascii="BRH Devanagari Extra" w:hAnsi="BRH Devanagari Extra" w:cs="BRH Devanagari Extra"/>
+                <w:sz w:val="32"/>
+                <w:szCs w:val="32"/>
+                <w:highlight w:val="yellow"/>
+              </w:rPr>
+              <w:t>i</w:t>
+            </w:r>
+            <w:r>
+              <w:rPr>
+                <w:rFonts w:ascii="BRH Devanagari Extra" w:hAnsi="BRH Devanagari Extra" w:cs="BRH Devanagari Extra"/>
+                <w:sz w:val="32"/>
+                <w:szCs w:val="32"/>
+              </w:rPr>
+              <w:t>ÉÑþuÉ</w:t>
+            </w:r>
+            <w:r>
+              <w:rPr>
+                <w:rFonts w:ascii="BRH Malayalam Extra" w:hAnsi="BRH Malayalam Extra" w:cs="BRH Devanagari Extra"/>
+                <w:szCs w:val="32"/>
+              </w:rPr>
+              <w:t>–</w:t>
+            </w:r>
+            <w:r>
+              <w:rPr>
+                <w:rFonts w:ascii="BRH Devanagari Extra" w:hAnsi="BRH Devanagari Extra" w:cs="BRH Devanagari Extra"/>
+                <w:sz w:val="32"/>
+                <w:szCs w:val="32"/>
+              </w:rPr>
+              <w:t xml:space="preserve"> iÉæMüþÌuÉ</w:t>
+            </w:r>
+            <w:r>
+              <w:rPr>
+                <w:rFonts w:ascii="BRH Devanagari Extra" w:hAnsi="BRH Devanagari Extra" w:cs="BRH Devanagari Extra"/>
+                <w:sz w:val="26"/>
+                <w:szCs w:val="32"/>
+              </w:rPr>
+              <w:t>óè</w:t>
+            </w:r>
+            <w:r>
+              <w:rPr>
+                <w:rFonts w:ascii="BRH Devanagari Extra" w:hAnsi="BRH Devanagari Extra" w:cs="BRH Devanagari Extra"/>
+                <w:sz w:val="32"/>
+                <w:szCs w:val="32"/>
+              </w:rPr>
+              <w:t>zÉ</w:t>
+            </w:r>
+            <w:r>
+              <w:rPr>
+                <w:rFonts w:ascii="BRH Malayalam Extra" w:hAnsi="BRH Malayalam Extra" w:cs="BRH Devanagari Extra"/>
+                <w:szCs w:val="32"/>
+              </w:rPr>
+              <w:t>–</w:t>
+            </w:r>
+            <w:r>
+              <w:rPr>
+                <w:rFonts w:ascii="BRH Devanagari Extra" w:hAnsi="BRH Devanagari Extra" w:cs="BRH Devanagari Extra"/>
+                <w:sz w:val="32"/>
+                <w:szCs w:val="32"/>
+              </w:rPr>
+              <w:t xml:space="preserve"> irÉæMüþÌuÉ</w:t>
+            </w:r>
+            <w:r>
+              <w:rPr>
+                <w:rFonts w:ascii="BRH Devanagari Extra" w:hAnsi="BRH Devanagari Extra" w:cs="BRH Devanagari Extra"/>
+                <w:sz w:val="26"/>
+                <w:szCs w:val="32"/>
+              </w:rPr>
+              <w:t>óè</w:t>
+            </w:r>
+            <w:r>
+              <w:rPr>
+                <w:rFonts w:ascii="BRH Devanagari Extra" w:hAnsi="BRH Devanagari Extra" w:cs="BRH Devanagari Extra"/>
+                <w:sz w:val="32"/>
+                <w:szCs w:val="32"/>
+              </w:rPr>
+              <w:t>zÉirÉÉ ÅxiÉÑuÉ</w:t>
+            </w:r>
+            <w:r>
+              <w:rPr>
+                <w:rFonts w:ascii="BRH Malayalam Extra" w:hAnsi="BRH Malayalam Extra" w:cs="BRH Devanagari Extra"/>
+                <w:szCs w:val="32"/>
+              </w:rPr>
+              <w:t>–</w:t>
+            </w:r>
+            <w:r>
+              <w:rPr>
+                <w:rFonts w:ascii="BRH Devanagari Extra" w:hAnsi="BRH Devanagari Extra" w:cs="BRH Devanagari Extra"/>
+                <w:sz w:val="32"/>
+                <w:szCs w:val="32"/>
+              </w:rPr>
+              <w:t xml:space="preserve"> iÉæMüþzÉTüÉ</w:t>
+            </w:r>
+            <w:r>
+              <w:rPr>
+                <w:rFonts w:ascii="BRH Malayalam Extra" w:hAnsi="BRH Malayalam Extra" w:cs="BRH Devanagari Extra"/>
+                <w:szCs w:val="32"/>
+              </w:rPr>
+              <w:t>–</w:t>
+            </w:r>
+            <w:r>
+              <w:rPr>
+                <w:rFonts w:ascii="BRH Devanagari Extra" w:hAnsi="BRH Devanagari Extra" w:cs="BRH Devanagari Extra"/>
+                <w:sz w:val="32"/>
+                <w:szCs w:val="32"/>
+              </w:rPr>
+              <w:t xml:space="preserve"> LMüþzÉTüÉ AxiÉÑuÉ</w:t>
+            </w:r>
+            <w:r>
+              <w:rPr>
+                <w:rFonts w:ascii="BRH Malayalam Extra" w:hAnsi="BRH Malayalam Extra" w:cs="BRH Devanagari Extra"/>
+                <w:szCs w:val="32"/>
+              </w:rPr>
+              <w:t>–</w:t>
+            </w:r>
+            <w:r>
+              <w:rPr>
+                <w:rFonts w:ascii="BRH Devanagari Extra" w:hAnsi="BRH Devanagari Extra" w:cs="BRH Devanagari Extra"/>
+                <w:sz w:val="32"/>
+                <w:szCs w:val="32"/>
+              </w:rPr>
+              <w:t xml:space="preserve"> iÉæMüþÌuÉ</w:t>
+            </w:r>
+            <w:r>
+              <w:rPr>
+                <w:rFonts w:ascii="BRH Devanagari Extra" w:hAnsi="BRH Devanagari Extra" w:cs="BRH Devanagari Extra"/>
+                <w:sz w:val="26"/>
+                <w:szCs w:val="32"/>
+              </w:rPr>
+              <w:t>óè</w:t>
+            </w:r>
+            <w:r>
+              <w:rPr>
+                <w:rFonts w:ascii="BRH Devanagari Extra" w:hAnsi="BRH Devanagari Extra" w:cs="BRH Devanagari Extra"/>
+                <w:sz w:val="32"/>
+                <w:szCs w:val="32"/>
+              </w:rPr>
+              <w:t>zÉ</w:t>
+            </w:r>
+            <w:r>
+              <w:rPr>
+                <w:rFonts w:ascii="BRH Malayalam Extra" w:hAnsi="BRH Malayalam Extra" w:cs="BRH Devanagari Extra"/>
+                <w:szCs w:val="32"/>
+              </w:rPr>
+              <w:t>–</w:t>
+            </w:r>
+            <w:r>
+              <w:rPr>
+                <w:rFonts w:ascii="BRH Devanagari Extra" w:hAnsi="BRH Devanagari Extra" w:cs="BRH Devanagari Extra"/>
+                <w:sz w:val="32"/>
+                <w:szCs w:val="32"/>
+              </w:rPr>
+              <w:t xml:space="preserve"> irÉæMüþÌuÉ</w:t>
+            </w:r>
+            <w:r>
+              <w:rPr>
+                <w:rFonts w:ascii="BRH Devanagari Extra" w:hAnsi="BRH Devanagari Extra" w:cs="BRH Devanagari Extra"/>
+                <w:sz w:val="26"/>
+                <w:szCs w:val="32"/>
+              </w:rPr>
+              <w:t>óè</w:t>
+            </w:r>
+            <w:r>
+              <w:rPr>
+                <w:rFonts w:ascii="BRH Devanagari Extra" w:hAnsi="BRH Devanagari Extra" w:cs="BRH Devanagari Extra"/>
+                <w:sz w:val="32"/>
+                <w:szCs w:val="32"/>
+              </w:rPr>
+              <w:t>zÉirÉÉ ÅxiÉÑuÉ</w:t>
+            </w:r>
+            <w:r>
+              <w:rPr>
+                <w:rFonts w:ascii="BRH Malayalam Extra" w:hAnsi="BRH Malayalam Extra" w:cs="BRH Devanagari Extra"/>
+                <w:szCs w:val="32"/>
+              </w:rPr>
+              <w:t>–</w:t>
+            </w:r>
+            <w:r>
+              <w:rPr>
+                <w:rFonts w:ascii="BRH Devanagari Extra" w:hAnsi="BRH Devanagari Extra" w:cs="BRH Devanagari Extra"/>
+                <w:sz w:val="32"/>
+                <w:szCs w:val="32"/>
+              </w:rPr>
+              <w:t xml:space="preserve"> iÉæMüþzÉTüÉÈ | </w:t>
+            </w:r>
+          </w:p>
+          <w:p>
+            <w:pPr>
+              <w:widowControl w:val="0"/>
+              <w:autoSpaceDE w:val="0"/>
+              <w:autoSpaceDN w:val="0"/>
+              <w:adjustRightInd w:val="0"/>
+              <w:spacing w:before="0" w:line="240" w:lineRule="auto"/>
+              <w:rPr>
+                <w:rFonts w:ascii="BRH Devanagari Extra" w:hAnsi="BRH Devanagari Extra" w:cs="BRH Devanagari Extra"/>
+                <w:sz w:val="32"/>
+                <w:szCs w:val="32"/>
+              </w:rPr>
+            </w:pPr>
+            <w:r>
+              <w:rPr>
+                <w:rFonts w:ascii="BRH Devanagari Extra" w:hAnsi="BRH Devanagari Extra" w:cs="BRH Devanagari Extra"/>
+                <w:sz w:val="32"/>
+                <w:szCs w:val="32"/>
+              </w:rPr>
+              <w:t>(</w:t>
+            </w:r>
+            <w:r>
+              <w:rPr>
+                <w:rFonts w:cs="BRH Devanagari Extra"/>
+                <w:szCs w:val="32"/>
+              </w:rPr>
+              <w:t>33</w:t>
+            </w:r>
+            <w:r>
+              <w:rPr>
+                <w:rFonts w:ascii="BRH Devanagari Extra" w:hAnsi="BRH Devanagari Extra" w:cs="BRH Devanagari Extra"/>
+                <w:sz w:val="32"/>
+                <w:szCs w:val="32"/>
+              </w:rPr>
+              <w:t>)[</w:t>
+            </w:r>
+            <w:r>
+              <w:rPr>
+                <w:rFonts w:cs="BRH Devanagari Extra"/>
+                <w:szCs w:val="32"/>
+              </w:rPr>
+              <w:t>P19</w:t>
+            </w:r>
+            <w:r>
+              <w:rPr>
+                <w:rFonts w:ascii="BRH Devanagari Extra" w:hAnsi="BRH Devanagari Extra" w:cs="BRH Devanagari Extra"/>
+                <w:sz w:val="32"/>
+                <w:szCs w:val="32"/>
+              </w:rPr>
+              <w:t xml:space="preserve">] </w:t>
+            </w:r>
+            <w:r>
+              <w:rPr>
+                <w:rFonts w:cs="BRH Devanagari Extra"/>
+                <w:szCs w:val="32"/>
+              </w:rPr>
+              <w:t>4</w:t>
+            </w:r>
+            <w:r>
+              <w:rPr>
+                <w:rFonts w:ascii="BRH Devanagari Extra" w:hAnsi="BRH Devanagari Extra" w:cs="BRH Devanagari Extra"/>
+                <w:sz w:val="32"/>
+                <w:szCs w:val="32"/>
+              </w:rPr>
+              <w:t>.</w:t>
+            </w:r>
+            <w:r>
+              <w:rPr>
+                <w:rFonts w:cs="BRH Devanagari Extra"/>
+                <w:szCs w:val="32"/>
+              </w:rPr>
+              <w:t>3</w:t>
+            </w:r>
+            <w:r>
+              <w:rPr>
+                <w:rFonts w:ascii="BRH Devanagari Extra" w:hAnsi="BRH Devanagari Extra" w:cs="BRH Devanagari Extra"/>
+                <w:sz w:val="32"/>
+                <w:szCs w:val="32"/>
+              </w:rPr>
+              <w:t>.</w:t>
+            </w:r>
+            <w:r>
+              <w:rPr>
+                <w:rFonts w:cs="BRH Devanagari Extra"/>
+                <w:szCs w:val="32"/>
+              </w:rPr>
+              <w:t>10</w:t>
+            </w:r>
+            <w:r>
+              <w:rPr>
+                <w:rFonts w:ascii="BRH Devanagari Extra" w:hAnsi="BRH Devanagari Extra" w:cs="BRH Devanagari Extra"/>
+                <w:sz w:val="32"/>
+                <w:szCs w:val="32"/>
+              </w:rPr>
+              <w:t>.</w:t>
+            </w:r>
+            <w:r>
+              <w:rPr>
+                <w:rFonts w:cs="BRH Devanagari Extra"/>
+                <w:szCs w:val="32"/>
+              </w:rPr>
+              <w:t>2</w:t>
+            </w:r>
+            <w:r>
+              <w:rPr>
+                <w:rFonts w:ascii="BRH Devanagari Extra" w:hAnsi="BRH Devanagari Extra" w:cs="BRH Devanagari Extra"/>
+                <w:sz w:val="32"/>
+                <w:szCs w:val="32"/>
+              </w:rPr>
+              <w:t>(</w:t>
+            </w:r>
+            <w:r>
+              <w:rPr>
+                <w:rFonts w:cs="BRH Devanagari Extra"/>
+                <w:szCs w:val="32"/>
+              </w:rPr>
+              <w:t>24</w:t>
+            </w:r>
+            <w:r>
+              <w:rPr>
+                <w:rFonts w:ascii="BRH Devanagari Extra" w:hAnsi="BRH Devanagari Extra" w:cs="BRH Devanagari Extra"/>
+                <w:sz w:val="32"/>
+                <w:szCs w:val="32"/>
+              </w:rPr>
+              <w:t>)-  A</w:t>
+            </w:r>
+            <w:r>
+              <w:rPr>
+                <w:rFonts w:ascii="BRH Malayalam Extra" w:hAnsi="BRH Malayalam Extra" w:cs="BRH Devanagari Extra"/>
+                <w:szCs w:val="32"/>
+              </w:rPr>
+              <w:t>–</w:t>
+            </w:r>
+            <w:r>
+              <w:rPr>
+                <w:rFonts w:ascii="BRH Devanagari Extra" w:hAnsi="BRH Devanagari Extra" w:cs="BRH Devanagari Extra"/>
+                <w:sz w:val="32"/>
+                <w:szCs w:val="32"/>
+              </w:rPr>
+              <w:t>xiÉÑ</w:t>
+            </w:r>
+            <w:r>
+              <w:rPr>
+                <w:rFonts w:ascii="BRH Malayalam Extra" w:hAnsi="BRH Malayalam Extra" w:cs="BRH Devanagari Extra"/>
+                <w:szCs w:val="32"/>
+              </w:rPr>
+              <w:t>–</w:t>
+            </w:r>
+            <w:r>
+              <w:rPr>
+                <w:rFonts w:ascii="BRH Devanagari Extra" w:hAnsi="BRH Devanagari Extra" w:cs="BRH Devanagari Extra"/>
+                <w:sz w:val="32"/>
+                <w:szCs w:val="32"/>
+              </w:rPr>
+              <w:t>uÉ</w:t>
+            </w:r>
+            <w:r>
+              <w:rPr>
+                <w:rFonts w:ascii="BRH Malayalam Extra" w:hAnsi="BRH Malayalam Extra" w:cs="BRH Devanagari Extra"/>
+                <w:szCs w:val="32"/>
+                <w:highlight w:val="yellow"/>
+              </w:rPr>
+              <w:t>–</w:t>
+            </w:r>
+            <w:r>
+              <w:rPr>
+                <w:rFonts w:ascii="BRH Devanagari Extra" w:hAnsi="BRH Devanagari Extra" w:cs="BRH Devanagari Extra"/>
+                <w:sz w:val="32"/>
+                <w:szCs w:val="32"/>
+                <w:highlight w:val="yellow"/>
+              </w:rPr>
+              <w:t>iÉ</w:t>
+            </w:r>
+            <w:r>
+              <w:rPr>
+                <w:rFonts w:ascii="BRH Devanagari Extra" w:hAnsi="BRH Devanagari Extra" w:cs="BRH Devanagari Extra"/>
+                <w:sz w:val="32"/>
+                <w:szCs w:val="32"/>
+              </w:rPr>
+              <w:t xml:space="preserve"> | LMüþzÉTüÉÈ | mÉ</w:t>
+            </w:r>
+            <w:r>
+              <w:rPr>
+                <w:rFonts w:ascii="BRH Malayalam Extra" w:hAnsi="BRH Malayalam Extra" w:cs="BRH Devanagari Extra"/>
+                <w:szCs w:val="32"/>
+              </w:rPr>
+              <w:t>–</w:t>
+            </w:r>
+            <w:r>
+              <w:rPr>
+                <w:rFonts w:ascii="BRH Devanagari Extra" w:hAnsi="BRH Devanagari Extra" w:cs="BRH Devanagari Extra"/>
+                <w:sz w:val="32"/>
+                <w:szCs w:val="32"/>
+              </w:rPr>
+              <w:t>zÉuÉþÈ |</w:t>
+            </w:r>
+          </w:p>
+          <w:p>
+            <w:pPr>
+              <w:widowControl w:val="0"/>
+              <w:autoSpaceDE w:val="0"/>
+              <w:autoSpaceDN w:val="0"/>
+              <w:adjustRightInd w:val="0"/>
+              <w:spacing w:before="0" w:line="240" w:lineRule="auto"/>
+              <w:rPr>
+                <w:rFonts w:cs="BRH Malayalam Extra"/>
+                <w:color w:val="FF0000"/>
+                <w:szCs w:val="40"/>
+              </w:rPr>
+            </w:pPr>
+            <w:r>
+              <w:rPr>
+                <w:rFonts w:ascii="BRH Devanagari Extra" w:hAnsi="BRH Devanagari Extra" w:cs="BRH Devanagari Extra"/>
+                <w:sz w:val="32"/>
+                <w:szCs w:val="32"/>
+              </w:rPr>
+              <w:t>A</w:t>
+            </w:r>
+            <w:r>
+              <w:rPr>
+                <w:rFonts w:ascii="BRH Malayalam Extra" w:hAnsi="BRH Malayalam Extra" w:cs="BRH Devanagari Extra"/>
+                <w:szCs w:val="32"/>
+              </w:rPr>
+              <w:t>–</w:t>
+            </w:r>
+            <w:r>
+              <w:rPr>
+                <w:rFonts w:ascii="BRH Devanagari Extra" w:hAnsi="BRH Devanagari Extra" w:cs="BRH Devanagari Extra"/>
+                <w:sz w:val="32"/>
+                <w:szCs w:val="32"/>
+              </w:rPr>
+              <w:t>xiÉÑ</w:t>
+            </w:r>
+            <w:r>
+              <w:rPr>
+                <w:rFonts w:ascii="BRH Malayalam Extra" w:hAnsi="BRH Malayalam Extra" w:cs="BRH Devanagari Extra"/>
+                <w:szCs w:val="32"/>
+              </w:rPr>
+              <w:t>–</w:t>
+            </w:r>
+            <w:r>
+              <w:rPr>
+                <w:rFonts w:ascii="BRH Devanagari Extra" w:hAnsi="BRH Devanagari Extra" w:cs="BRH Devanagari Extra"/>
+                <w:sz w:val="32"/>
+                <w:szCs w:val="32"/>
+              </w:rPr>
+              <w:t>uÉ</w:t>
+            </w:r>
+            <w:r>
+              <w:rPr>
+                <w:rFonts w:ascii="BRH Malayalam Extra" w:hAnsi="BRH Malayalam Extra" w:cs="BRH Devanagari Extra"/>
+                <w:szCs w:val="32"/>
+              </w:rPr>
+              <w:t>–</w:t>
+            </w:r>
+            <w:r>
+              <w:rPr>
+                <w:rFonts w:ascii="BRH Devanagari Extra" w:hAnsi="BRH Devanagari Extra" w:cs="BRH Devanagari Extra"/>
+                <w:sz w:val="32"/>
+                <w:szCs w:val="32"/>
+              </w:rPr>
+              <w:t xml:space="preserve"> iÉæMüþzÉTüÉ</w:t>
+            </w:r>
+            <w:r>
+              <w:rPr>
+                <w:rFonts w:ascii="BRH Malayalam Extra" w:hAnsi="BRH Malayalam Extra" w:cs="BRH Devanagari Extra"/>
+                <w:szCs w:val="32"/>
+              </w:rPr>
+              <w:t>–</w:t>
+            </w:r>
+            <w:r>
+              <w:rPr>
+                <w:rFonts w:ascii="BRH Devanagari Extra" w:hAnsi="BRH Devanagari Extra" w:cs="BRH Devanagari Extra"/>
+                <w:sz w:val="32"/>
+                <w:szCs w:val="32"/>
+              </w:rPr>
+              <w:t xml:space="preserve"> LMüþzÉTüÉ AxiÉ</w:t>
+            </w:r>
+            <w:r>
+              <w:rPr>
+                <w:rFonts w:ascii="BRH Devanagari Extra" w:hAnsi="BRH Devanagari Extra" w:cs="BRH Devanagari Extra"/>
+                <w:sz w:val="32"/>
+                <w:szCs w:val="32"/>
+                <w:highlight w:val="yellow"/>
+              </w:rPr>
+              <w:t>Ñu</w:t>
+            </w:r>
+            <w:r>
+              <w:rPr>
+                <w:rFonts w:ascii="BRH Devanagari Extra" w:hAnsi="BRH Devanagari Extra" w:cs="BRH Devanagari Extra"/>
+                <w:sz w:val="32"/>
+                <w:szCs w:val="32"/>
+              </w:rPr>
+              <w:t>É</w:t>
+            </w:r>
+            <w:r>
+              <w:rPr>
+                <w:rFonts w:ascii="BRH Malayalam Extra" w:hAnsi="BRH Malayalam Extra" w:cs="BRH Devanagari Extra"/>
+                <w:szCs w:val="32"/>
+              </w:rPr>
+              <w:t>–</w:t>
+            </w:r>
+            <w:r>
+              <w:rPr>
+                <w:rFonts w:ascii="BRH Devanagari Extra" w:hAnsi="BRH Devanagari Extra" w:cs="BRH Devanagari Extra"/>
+                <w:sz w:val="32"/>
+                <w:szCs w:val="32"/>
+              </w:rPr>
+              <w:t xml:space="preserve">iÉÉ </w:t>
+            </w:r>
+            <w:r>
+              <w:rPr>
+                <w:rFonts w:ascii="BRH Devanagari Extra" w:hAnsi="BRH Devanagari Extra" w:cs="BRH Devanagari Extra"/>
+                <w:sz w:val="32"/>
+                <w:szCs w:val="32"/>
+                <w:highlight w:val="yellow"/>
+              </w:rPr>
+              <w:t>xiÉ</w:t>
+            </w:r>
+            <w:r>
+              <w:rPr>
+                <w:rFonts w:ascii="BRH Devanagari Extra" w:hAnsi="BRH Devanagari Extra" w:cs="BRH Devanagari Extra"/>
+                <w:sz w:val="32"/>
+                <w:szCs w:val="32"/>
+              </w:rPr>
+              <w:t>ÑþuÉ</w:t>
+            </w:r>
+            <w:r>
+              <w:rPr>
+                <w:rFonts w:ascii="BRH Malayalam Extra" w:hAnsi="BRH Malayalam Extra" w:cs="BRH Devanagari Extra"/>
+                <w:szCs w:val="32"/>
+              </w:rPr>
+              <w:t>–</w:t>
+            </w:r>
+            <w:r>
+              <w:rPr>
+                <w:rFonts w:ascii="BRH Devanagari Extra" w:hAnsi="BRH Devanagari Extra" w:cs="BRH Devanagari Extra"/>
+                <w:sz w:val="32"/>
+                <w:szCs w:val="32"/>
+              </w:rPr>
+              <w:t xml:space="preserve"> iÉæMüþzÉTüÉÈ mÉ</w:t>
+            </w:r>
+            <w:r>
+              <w:rPr>
+                <w:rFonts w:ascii="BRH Malayalam Extra" w:hAnsi="BRH Malayalam Extra" w:cs="BRH Devanagari Extra"/>
+                <w:szCs w:val="32"/>
+              </w:rPr>
+              <w:t>–</w:t>
+            </w:r>
+            <w:r>
+              <w:rPr>
+                <w:rFonts w:ascii="BRH Devanagari Extra" w:hAnsi="BRH Devanagari Extra" w:cs="BRH Devanagari Extra"/>
+                <w:sz w:val="32"/>
+                <w:szCs w:val="32"/>
+              </w:rPr>
+              <w:t xml:space="preserve">zÉuÉþÈ </w:t>
+            </w:r>
+            <w:r>
+              <w:rPr>
+                <w:rFonts w:ascii="BRH Devanagari Extra" w:hAnsi="BRH Devanagari Extra" w:cs="BRH Devanagari Extra"/>
+                <w:sz w:val="32"/>
+                <w:szCs w:val="32"/>
+              </w:rPr>
+              <w:lastRenderedPageBreak/>
+              <w:t>mÉ</w:t>
+            </w:r>
+            <w:r>
+              <w:rPr>
+                <w:rFonts w:ascii="BRH Malayalam Extra" w:hAnsi="BRH Malayalam Extra" w:cs="BRH Devanagari Extra"/>
+                <w:szCs w:val="32"/>
+              </w:rPr>
+              <w:t>–</w:t>
+            </w:r>
+            <w:r>
+              <w:rPr>
+                <w:rFonts w:ascii="BRH Devanagari Extra" w:hAnsi="BRH Devanagari Extra" w:cs="BRH Devanagari Extra"/>
+                <w:sz w:val="32"/>
+                <w:szCs w:val="32"/>
+              </w:rPr>
+              <w:t>zÉuÉ</w:t>
+            </w:r>
+            <w:r>
+              <w:rPr>
+                <w:rFonts w:ascii="BRH Malayalam Extra" w:hAnsi="BRH Malayalam Extra" w:cs="BRH Devanagari Extra"/>
+                <w:szCs w:val="32"/>
+              </w:rPr>
+              <w:t>–</w:t>
+            </w:r>
+            <w:r>
+              <w:rPr>
+                <w:rFonts w:ascii="BRH Devanagari Extra" w:hAnsi="BRH Devanagari Extra" w:cs="BRH Devanagari Extra"/>
+                <w:sz w:val="32"/>
+                <w:szCs w:val="32"/>
+              </w:rPr>
+              <w:t xml:space="preserve"> LMüþzÉTüÉ AxiÉÑ</w:t>
+            </w:r>
+            <w:r>
+              <w:rPr>
+                <w:rFonts w:ascii="BRH Devanagari Extra" w:hAnsi="BRH Devanagari Extra" w:cs="BRH Devanagari Extra"/>
+                <w:sz w:val="32"/>
+                <w:szCs w:val="32"/>
+                <w:highlight w:val="yellow"/>
+              </w:rPr>
+              <w:t>uÉ</w:t>
+            </w:r>
+            <w:r>
+              <w:rPr>
+                <w:rFonts w:ascii="BRH Malayalam Extra" w:hAnsi="BRH Malayalam Extra" w:cs="BRH Devanagari Extra"/>
+                <w:szCs w:val="32"/>
+              </w:rPr>
+              <w:t>–</w:t>
+            </w:r>
+            <w:r>
+              <w:rPr>
+                <w:rFonts w:ascii="BRH Devanagari Extra" w:hAnsi="BRH Devanagari Extra" w:cs="BRH Devanagari Extra"/>
+                <w:sz w:val="32"/>
+                <w:szCs w:val="32"/>
+              </w:rPr>
+              <w:t xml:space="preserve">iÉÉ </w:t>
+            </w:r>
+            <w:r>
+              <w:rPr>
+                <w:rFonts w:ascii="BRH Devanagari Extra" w:hAnsi="BRH Devanagari Extra" w:cs="BRH Devanagari Extra"/>
+                <w:sz w:val="32"/>
+                <w:szCs w:val="32"/>
+                <w:highlight w:val="yellow"/>
+              </w:rPr>
+              <w:t>xi</w:t>
+            </w:r>
+            <w:r>
+              <w:rPr>
+                <w:rFonts w:ascii="BRH Devanagari Extra" w:hAnsi="BRH Devanagari Extra" w:cs="BRH Devanagari Extra"/>
+                <w:sz w:val="32"/>
+                <w:szCs w:val="32"/>
+              </w:rPr>
+              <w:t>ÉÑþuÉ</w:t>
+            </w:r>
+            <w:r>
+              <w:rPr>
+                <w:rFonts w:ascii="BRH Malayalam Extra" w:hAnsi="BRH Malayalam Extra" w:cs="BRH Devanagari Extra"/>
+                <w:szCs w:val="32"/>
+              </w:rPr>
+              <w:t>–</w:t>
+            </w:r>
+            <w:r>
+              <w:rPr>
+                <w:rFonts w:ascii="BRH Devanagari Extra" w:hAnsi="BRH Devanagari Extra" w:cs="BRH Devanagari Extra"/>
+                <w:sz w:val="32"/>
+                <w:szCs w:val="32"/>
+              </w:rPr>
+              <w:t xml:space="preserve"> iÉæMüþzÉTüÉÈ mÉ</w:t>
+            </w:r>
+            <w:r>
+              <w:rPr>
+                <w:rFonts w:ascii="BRH Malayalam Extra" w:hAnsi="BRH Malayalam Extra" w:cs="BRH Devanagari Extra"/>
+                <w:szCs w:val="32"/>
+              </w:rPr>
+              <w:t>–</w:t>
+            </w:r>
+            <w:r>
+              <w:rPr>
+                <w:rFonts w:ascii="BRH Devanagari Extra" w:hAnsi="BRH Devanagari Extra" w:cs="BRH Devanagari Extra"/>
+                <w:sz w:val="32"/>
+                <w:szCs w:val="32"/>
+              </w:rPr>
+              <w:t xml:space="preserve">zÉuÉþÈ | </w:t>
+            </w:r>
+          </w:p>
+        </w:tc>
+        <w:tc>
+          <w:tcPr>
+            <w:tcW w:w="7371" w:type="dxa"/>
+            <w:tcBorders>
+              <w:top w:val="single" w:sz="4" w:space="0" w:color="000000"/>
+              <w:left w:val="single" w:sz="4" w:space="0" w:color="000000"/>
+              <w:bottom w:val="single" w:sz="4" w:space="0" w:color="000000"/>
+              <w:right w:val="single" w:sz="4" w:space="0" w:color="000000"/>
+            </w:tcBorders>
+          </w:tcPr>
+          <w:p>
+            <w:pPr>
+              <w:widowControl w:val="0"/>
+              <w:autoSpaceDE w:val="0"/>
+              <w:autoSpaceDN w:val="0"/>
+              <w:adjustRightInd w:val="0"/>
+              <w:spacing w:before="0" w:line="240" w:lineRule="auto"/>
+              <w:rPr>
+                <w:rFonts w:ascii="BRH Devanagari Extra" w:hAnsi="BRH Devanagari Extra" w:cs="BRH Devanagari Extra"/>
+                <w:sz w:val="32"/>
+                <w:szCs w:val="32"/>
+              </w:rPr>
+            </w:pPr>
+            <w:r>
+              <w:rPr>
+                <w:rFonts w:ascii="BRH Devanagari Extra" w:hAnsi="BRH Devanagari Extra" w:cs="BRH Devanagari Extra"/>
+                <w:sz w:val="32"/>
+                <w:szCs w:val="32"/>
+              </w:rPr>
+              <w:lastRenderedPageBreak/>
+              <w:t>(</w:t>
+            </w:r>
+            <w:r>
+              <w:rPr>
+                <w:rFonts w:cs="BRH Devanagari Extra"/>
+                <w:szCs w:val="32"/>
+              </w:rPr>
+              <w:t>30</w:t>
+            </w:r>
+            <w:r>
+              <w:rPr>
+                <w:rFonts w:ascii="BRH Devanagari Extra" w:hAnsi="BRH Devanagari Extra" w:cs="BRH Devanagari Extra"/>
+                <w:sz w:val="32"/>
+                <w:szCs w:val="32"/>
+              </w:rPr>
+              <w:t>)[</w:t>
+            </w:r>
+            <w:r>
+              <w:rPr>
+                <w:rFonts w:cs="BRH Devanagari Extra"/>
+                <w:szCs w:val="32"/>
+              </w:rPr>
+              <w:t>P19</w:t>
+            </w:r>
+            <w:r>
+              <w:rPr>
+                <w:rFonts w:ascii="BRH Devanagari Extra" w:hAnsi="BRH Devanagari Extra" w:cs="BRH Devanagari Extra"/>
+                <w:sz w:val="32"/>
+                <w:szCs w:val="32"/>
+              </w:rPr>
+              <w:t xml:space="preserve">] </w:t>
+            </w:r>
+            <w:r>
+              <w:rPr>
+                <w:rFonts w:cs="BRH Devanagari Extra"/>
+                <w:szCs w:val="32"/>
+              </w:rPr>
+              <w:t>4</w:t>
+            </w:r>
+            <w:r>
+              <w:rPr>
+                <w:rFonts w:ascii="BRH Devanagari Extra" w:hAnsi="BRH Devanagari Extra" w:cs="BRH Devanagari Extra"/>
+                <w:sz w:val="32"/>
+                <w:szCs w:val="32"/>
+              </w:rPr>
+              <w:t>.</w:t>
+            </w:r>
+            <w:r>
+              <w:rPr>
+                <w:rFonts w:cs="BRH Devanagari Extra"/>
+                <w:szCs w:val="32"/>
+              </w:rPr>
+              <w:t>3</w:t>
+            </w:r>
+            <w:r>
+              <w:rPr>
+                <w:rFonts w:ascii="BRH Devanagari Extra" w:hAnsi="BRH Devanagari Extra" w:cs="BRH Devanagari Extra"/>
+                <w:sz w:val="32"/>
+                <w:szCs w:val="32"/>
+              </w:rPr>
+              <w:t>.</w:t>
+            </w:r>
+            <w:r>
+              <w:rPr>
+                <w:rFonts w:cs="BRH Devanagari Extra"/>
+                <w:szCs w:val="32"/>
+              </w:rPr>
+              <w:t>10</w:t>
+            </w:r>
+            <w:r>
+              <w:rPr>
+                <w:rFonts w:ascii="BRH Devanagari Extra" w:hAnsi="BRH Devanagari Extra" w:cs="BRH Devanagari Extra"/>
+                <w:sz w:val="32"/>
+                <w:szCs w:val="32"/>
+              </w:rPr>
+              <w:t>.</w:t>
+            </w:r>
+            <w:r>
+              <w:rPr>
+                <w:rFonts w:cs="BRH Devanagari Extra"/>
+                <w:szCs w:val="32"/>
+              </w:rPr>
+              <w:t>2</w:t>
+            </w:r>
+            <w:r>
+              <w:rPr>
+                <w:rFonts w:ascii="BRH Devanagari Extra" w:hAnsi="BRH Devanagari Extra" w:cs="BRH Devanagari Extra"/>
+                <w:sz w:val="32"/>
+                <w:szCs w:val="32"/>
+              </w:rPr>
+              <w:t>(</w:t>
+            </w:r>
+            <w:r>
+              <w:rPr>
+                <w:rFonts w:cs="BRH Devanagari Extra"/>
+                <w:szCs w:val="32"/>
+              </w:rPr>
+              <w:t>22</w:t>
+            </w:r>
+            <w:r>
+              <w:rPr>
+                <w:rFonts w:ascii="BRH Devanagari Extra" w:hAnsi="BRH Devanagari Extra" w:cs="BRH Devanagari Extra"/>
+                <w:sz w:val="32"/>
+                <w:szCs w:val="32"/>
+              </w:rPr>
+              <w:t>)-  AÉ</w:t>
+            </w:r>
+            <w:r>
+              <w:rPr>
+                <w:rFonts w:ascii="BRH Malayalam Extra" w:hAnsi="BRH Malayalam Extra" w:cs="BRH Devanagari Extra"/>
+                <w:szCs w:val="32"/>
+              </w:rPr>
+              <w:t>–</w:t>
+            </w:r>
+            <w:r>
+              <w:rPr>
+                <w:rFonts w:ascii="BRH Devanagari Extra" w:hAnsi="BRH Devanagari Extra" w:cs="BRH Devanagari Extra"/>
+                <w:sz w:val="32"/>
+                <w:szCs w:val="32"/>
+              </w:rPr>
+              <w:t>xiÉÉ</w:t>
+            </w:r>
+            <w:r>
+              <w:rPr>
+                <w:rFonts w:ascii="BRH Malayalam Extra" w:hAnsi="BRH Malayalam Extra" w:cs="BRH Devanagari Extra"/>
+                <w:szCs w:val="32"/>
+              </w:rPr>
+              <w:t>–</w:t>
+            </w:r>
+            <w:r>
+              <w:rPr>
+                <w:rFonts w:ascii="BRH Devanagari Extra" w:hAnsi="BRH Devanagari Extra" w:cs="BRH Devanagari Extra"/>
+                <w:sz w:val="32"/>
+                <w:szCs w:val="32"/>
+              </w:rPr>
+              <w:t>qÉç | LMüþÌuÉ</w:t>
+            </w:r>
+            <w:r>
+              <w:rPr>
+                <w:rFonts w:ascii="BRH Devanagari Extra" w:hAnsi="BRH Devanagari Extra" w:cs="BRH Devanagari Extra"/>
+                <w:sz w:val="26"/>
+                <w:szCs w:val="32"/>
+              </w:rPr>
+              <w:t>óè</w:t>
+            </w:r>
+            <w:r>
+              <w:rPr>
+                <w:rFonts w:ascii="BRH Devanagari Extra" w:hAnsi="BRH Devanagari Extra" w:cs="BRH Devanagari Extra"/>
+                <w:sz w:val="32"/>
+                <w:szCs w:val="32"/>
+              </w:rPr>
+              <w:t xml:space="preserve">zÉirÉÉ | </w:t>
+            </w:r>
+          </w:p>
+          <w:p>
+            <w:pPr>
+              <w:widowControl w:val="0"/>
+              <w:autoSpaceDE w:val="0"/>
+              <w:autoSpaceDN w:val="0"/>
+              <w:adjustRightInd w:val="0"/>
+              <w:spacing w:before="0" w:line="240" w:lineRule="auto"/>
+              <w:rPr>
+                <w:rFonts w:ascii="BRH Devanagari Extra" w:hAnsi="BRH Devanagari Extra" w:cs="BRH Devanagari Extra"/>
+                <w:sz w:val="32"/>
+                <w:szCs w:val="32"/>
+              </w:rPr>
+            </w:pPr>
+            <w:r>
+              <w:rPr>
+                <w:rFonts w:ascii="BRH Devanagari Extra" w:hAnsi="BRH Devanagari Extra" w:cs="BRH Devanagari Extra"/>
+                <w:sz w:val="32"/>
+                <w:szCs w:val="32"/>
+              </w:rPr>
+              <w:t>A</w:t>
+            </w:r>
+            <w:r>
+              <w:rPr>
+                <w:rFonts w:ascii="BRH Malayalam Extra" w:hAnsi="BRH Malayalam Extra" w:cs="BRH Devanagari Extra"/>
+                <w:szCs w:val="32"/>
+              </w:rPr>
+              <w:t>–</w:t>
+            </w:r>
+            <w:r>
+              <w:rPr>
+                <w:rFonts w:ascii="BRH Devanagari Extra" w:hAnsi="BRH Devanagari Extra" w:cs="BRH Devanagari Extra"/>
+                <w:sz w:val="32"/>
+                <w:szCs w:val="32"/>
+              </w:rPr>
+              <w:t>xiÉÑ</w:t>
+            </w:r>
+            <w:r>
+              <w:rPr>
+                <w:rFonts w:ascii="BRH Malayalam Extra" w:hAnsi="BRH Malayalam Extra" w:cs="BRH Devanagari Extra"/>
+                <w:szCs w:val="32"/>
+              </w:rPr>
+              <w:t>–</w:t>
+            </w:r>
+            <w:r>
+              <w:rPr>
+                <w:rFonts w:ascii="BRH Devanagari Extra" w:hAnsi="BRH Devanagari Extra" w:cs="BRH Devanagari Extra"/>
+                <w:sz w:val="32"/>
+                <w:szCs w:val="32"/>
+              </w:rPr>
+              <w:t>uÉ</w:t>
+            </w:r>
+            <w:r>
+              <w:rPr>
+                <w:rFonts w:ascii="BRH Malayalam Extra" w:hAnsi="BRH Malayalam Extra" w:cs="BRH Devanagari Extra"/>
+                <w:szCs w:val="32"/>
+                <w:highlight w:val="yellow"/>
+              </w:rPr>
+              <w:t>–</w:t>
+            </w:r>
+            <w:r>
+              <w:rPr>
+                <w:rFonts w:ascii="BRH Devanagari Extra" w:hAnsi="BRH Devanagari Extra" w:cs="BRH Devanagari Extra"/>
+                <w:sz w:val="32"/>
+                <w:szCs w:val="32"/>
+                <w:highlight w:val="green"/>
+              </w:rPr>
+              <w:t>iÉ</w:t>
+            </w:r>
+            <w:r>
+              <w:rPr>
+                <w:rFonts w:ascii="BRH Malayalam Extra" w:hAnsi="BRH Malayalam Extra" w:cs="BRH Devanagari Extra"/>
+                <w:szCs w:val="32"/>
+                <w:highlight w:val="yellow"/>
+              </w:rPr>
+              <w:t>–</w:t>
+            </w:r>
+            <w:r>
+              <w:rPr>
+                <w:rFonts w:ascii="BRH Devanagari Extra" w:hAnsi="BRH Devanagari Extra" w:cs="BRH Devanagari Extra"/>
+                <w:sz w:val="32"/>
+                <w:szCs w:val="32"/>
+              </w:rPr>
+              <w:t xml:space="preserve"> |</w:t>
+            </w:r>
+          </w:p>
+          <w:p>
+            <w:pPr>
+              <w:widowControl w:val="0"/>
+              <w:autoSpaceDE w:val="0"/>
+              <w:autoSpaceDN w:val="0"/>
+              <w:adjustRightInd w:val="0"/>
+              <w:spacing w:before="0" w:line="240" w:lineRule="auto"/>
+              <w:rPr>
+                <w:rFonts w:ascii="BRH Devanagari Extra" w:hAnsi="BRH Devanagari Extra" w:cs="BRH Devanagari Extra"/>
+                <w:sz w:val="32"/>
+                <w:szCs w:val="32"/>
+              </w:rPr>
+            </w:pPr>
+            <w:r>
+              <w:rPr>
+                <w:rFonts w:ascii="BRH Devanagari Extra" w:hAnsi="BRH Devanagari Extra" w:cs="BRH Devanagari Extra"/>
+                <w:sz w:val="32"/>
+                <w:szCs w:val="32"/>
+              </w:rPr>
+              <w:t>AÉ</w:t>
+            </w:r>
+            <w:r>
+              <w:rPr>
+                <w:rFonts w:ascii="BRH Malayalam Extra" w:hAnsi="BRH Malayalam Extra" w:cs="BRH Devanagari Extra"/>
+                <w:szCs w:val="32"/>
+              </w:rPr>
+              <w:t>–</w:t>
+            </w:r>
+            <w:r>
+              <w:rPr>
+                <w:rFonts w:ascii="BRH Devanagari Extra" w:hAnsi="BRH Devanagari Extra" w:cs="BRH Devanagari Extra"/>
+                <w:sz w:val="32"/>
+                <w:szCs w:val="32"/>
+              </w:rPr>
+              <w:t>xiÉÉ</w:t>
+            </w:r>
+            <w:r>
+              <w:rPr>
+                <w:rFonts w:ascii="BRH Malayalam Extra" w:hAnsi="BRH Malayalam Extra" w:cs="BRH Devanagari Extra"/>
+                <w:szCs w:val="32"/>
+              </w:rPr>
+              <w:t>–</w:t>
+            </w:r>
+            <w:r>
+              <w:rPr>
+                <w:rFonts w:ascii="BRH Devanagari Extra" w:hAnsi="BRH Devanagari Extra" w:cs="BRH Devanagari Extra"/>
+                <w:sz w:val="32"/>
+                <w:szCs w:val="32"/>
+              </w:rPr>
+              <w:t xml:space="preserve"> qÉåMüþÌuÉ</w:t>
+            </w:r>
+            <w:r>
+              <w:rPr>
+                <w:rFonts w:ascii="BRH Devanagari Extra" w:hAnsi="BRH Devanagari Extra" w:cs="BRH Devanagari Extra"/>
+                <w:sz w:val="26"/>
+                <w:szCs w:val="32"/>
+              </w:rPr>
+              <w:t>óè</w:t>
+            </w:r>
+            <w:r>
+              <w:rPr>
+                <w:rFonts w:ascii="BRH Devanagari Extra" w:hAnsi="BRH Devanagari Extra" w:cs="BRH Devanagari Extra"/>
+                <w:sz w:val="32"/>
+                <w:szCs w:val="32"/>
+              </w:rPr>
+              <w:t>zÉ</w:t>
+            </w:r>
+            <w:r>
+              <w:rPr>
+                <w:rFonts w:ascii="BRH Malayalam Extra" w:hAnsi="BRH Malayalam Extra" w:cs="BRH Devanagari Extra"/>
+                <w:szCs w:val="32"/>
+              </w:rPr>
+              <w:t>–</w:t>
+            </w:r>
+            <w:r>
+              <w:rPr>
+                <w:rFonts w:ascii="BRH Devanagari Extra" w:hAnsi="BRH Devanagari Extra" w:cs="BRH Devanagari Extra"/>
+                <w:sz w:val="32"/>
+                <w:szCs w:val="32"/>
+              </w:rPr>
+              <w:t xml:space="preserve"> irÉæMüþÌuÉ</w:t>
+            </w:r>
+            <w:r>
+              <w:rPr>
+                <w:rFonts w:ascii="BRH Devanagari Extra" w:hAnsi="BRH Devanagari Extra" w:cs="BRH Devanagari Extra"/>
+                <w:sz w:val="26"/>
+                <w:szCs w:val="32"/>
+              </w:rPr>
+              <w:t>óè</w:t>
+            </w:r>
+            <w:r>
+              <w:rPr>
+                <w:rFonts w:ascii="BRH Devanagari Extra" w:hAnsi="BRH Devanagari Extra" w:cs="BRH Devanagari Extra"/>
+                <w:sz w:val="32"/>
+                <w:szCs w:val="32"/>
+              </w:rPr>
+              <w:t>zÉirÉÉ ÅÅxiÉÉ qÉÉxiÉÉ</w:t>
+            </w:r>
+            <w:r>
+              <w:rPr>
+                <w:rFonts w:ascii="BRH Malayalam Extra" w:hAnsi="BRH Malayalam Extra" w:cs="BRH Devanagari Extra"/>
+                <w:szCs w:val="32"/>
+              </w:rPr>
+              <w:t>–</w:t>
+            </w:r>
+            <w:r>
+              <w:rPr>
+                <w:rFonts w:ascii="BRH Devanagari Extra" w:hAnsi="BRH Devanagari Extra" w:cs="BRH Devanagari Extra"/>
+                <w:sz w:val="32"/>
+                <w:szCs w:val="32"/>
+              </w:rPr>
+              <w:t xml:space="preserve"> qÉåMüþÌuÉ</w:t>
+            </w:r>
+            <w:r>
+              <w:rPr>
+                <w:rFonts w:ascii="BRH Devanagari Extra" w:hAnsi="BRH Devanagari Extra" w:cs="BRH Devanagari Extra"/>
+                <w:sz w:val="26"/>
+                <w:szCs w:val="32"/>
+              </w:rPr>
+              <w:t>óè</w:t>
+            </w:r>
+            <w:r>
+              <w:rPr>
+                <w:rFonts w:ascii="BRH Devanagari Extra" w:hAnsi="BRH Devanagari Extra" w:cs="BRH Devanagari Extra"/>
+                <w:sz w:val="32"/>
+                <w:szCs w:val="32"/>
+              </w:rPr>
+              <w:t>zÉirÉÉ ÅxiÉ</w:t>
+            </w:r>
+            <w:r>
+              <w:rPr>
+                <w:rFonts w:ascii="BRH Devanagari Extra" w:hAnsi="BRH Devanagari Extra" w:cs="BRH Devanagari Extra"/>
+                <w:sz w:val="32"/>
+                <w:szCs w:val="32"/>
+                <w:highlight w:val="yellow"/>
+              </w:rPr>
+              <w:t>Ñ</w:t>
+            </w:r>
+            <w:r>
+              <w:rPr>
+                <w:rFonts w:ascii="BRH Devanagari Extra" w:hAnsi="BRH Devanagari Extra" w:cs="BRH Devanagari Extra"/>
+                <w:sz w:val="32"/>
+                <w:szCs w:val="32"/>
+                <w:highlight w:val="green"/>
+              </w:rPr>
+              <w:t>uÉ</w:t>
+            </w:r>
+            <w:r>
+              <w:rPr>
+                <w:rFonts w:ascii="BRH Devanagari Extra" w:hAnsi="BRH Devanagari Extra" w:cs="BRH Devanagari Extra"/>
+                <w:sz w:val="32"/>
+                <w:szCs w:val="32"/>
+              </w:rPr>
+              <w:t xml:space="preserve">iÉÉ </w:t>
+            </w:r>
+            <w:r>
+              <w:rPr>
+                <w:rFonts w:ascii="BRH Devanagari Extra" w:hAnsi="BRH Devanagari Extra" w:cs="BRH Devanagari Extra"/>
+                <w:sz w:val="32"/>
+                <w:szCs w:val="32"/>
+                <w:highlight w:val="green"/>
+              </w:rPr>
+              <w:t>xiÉÑ</w:t>
+            </w:r>
+            <w:r>
+              <w:rPr>
+                <w:rFonts w:ascii="BRH Devanagari Extra" w:hAnsi="BRH Devanagari Extra" w:cs="BRH Devanagari Extra"/>
+                <w:sz w:val="32"/>
+                <w:szCs w:val="32"/>
+              </w:rPr>
+              <w:t>uÉ</w:t>
+            </w:r>
+            <w:r>
+              <w:rPr>
+                <w:rFonts w:ascii="BRH Malayalam Extra" w:hAnsi="BRH Malayalam Extra" w:cs="BRH Devanagari Extra"/>
+                <w:szCs w:val="32"/>
+              </w:rPr>
+              <w:t>–</w:t>
+            </w:r>
+            <w:r>
+              <w:rPr>
+                <w:rFonts w:ascii="BRH Devanagari Extra" w:hAnsi="BRH Devanagari Extra" w:cs="BRH Devanagari Extra"/>
+                <w:sz w:val="32"/>
+                <w:szCs w:val="32"/>
+              </w:rPr>
+              <w:t xml:space="preserve"> iÉæMüþÌuÉ</w:t>
+            </w:r>
+            <w:r>
+              <w:rPr>
+                <w:rFonts w:ascii="BRH Devanagari Extra" w:hAnsi="BRH Devanagari Extra" w:cs="BRH Devanagari Extra"/>
+                <w:sz w:val="26"/>
+                <w:szCs w:val="32"/>
+              </w:rPr>
+              <w:t>óè</w:t>
+            </w:r>
+            <w:r>
+              <w:rPr>
+                <w:rFonts w:ascii="BRH Devanagari Extra" w:hAnsi="BRH Devanagari Extra" w:cs="BRH Devanagari Extra"/>
+                <w:sz w:val="32"/>
+                <w:szCs w:val="32"/>
+              </w:rPr>
+              <w:t>zÉirÉÉ ÅÅxiÉÉ qÉÉxiÉÉ</w:t>
+            </w:r>
+            <w:r>
+              <w:rPr>
+                <w:rFonts w:ascii="BRH Malayalam Extra" w:hAnsi="BRH Malayalam Extra" w:cs="BRH Devanagari Extra"/>
+                <w:szCs w:val="32"/>
+              </w:rPr>
+              <w:t>–</w:t>
+            </w:r>
+            <w:r>
+              <w:rPr>
+                <w:rFonts w:ascii="BRH Devanagari Extra" w:hAnsi="BRH Devanagari Extra" w:cs="BRH Devanagari Extra"/>
+                <w:sz w:val="32"/>
+                <w:szCs w:val="32"/>
+              </w:rPr>
+              <w:t xml:space="preserve"> qÉåMüþÌuÉ</w:t>
+            </w:r>
+            <w:r>
+              <w:rPr>
+                <w:rFonts w:ascii="BRH Devanagari Extra" w:hAnsi="BRH Devanagari Extra" w:cs="BRH Devanagari Extra"/>
+                <w:sz w:val="26"/>
+                <w:szCs w:val="32"/>
+              </w:rPr>
+              <w:t>óè</w:t>
+            </w:r>
+            <w:r>
+              <w:rPr>
+                <w:rFonts w:ascii="BRH Devanagari Extra" w:hAnsi="BRH Devanagari Extra" w:cs="BRH Devanagari Extra"/>
+                <w:sz w:val="32"/>
+                <w:szCs w:val="32"/>
+              </w:rPr>
+              <w:t xml:space="preserve">zÉirÉÉ </w:t>
+            </w:r>
+          </w:p>
+          <w:p>
+            <w:pPr>
+              <w:widowControl w:val="0"/>
+              <w:autoSpaceDE w:val="0"/>
+              <w:autoSpaceDN w:val="0"/>
+              <w:adjustRightInd w:val="0"/>
+              <w:spacing w:before="0" w:line="240" w:lineRule="auto"/>
+              <w:rPr>
+                <w:rFonts w:ascii="BRH Devanagari Extra" w:hAnsi="BRH Devanagari Extra" w:cs="BRH Devanagari Extra"/>
+                <w:sz w:val="32"/>
+                <w:szCs w:val="32"/>
+              </w:rPr>
+            </w:pPr>
+            <w:r>
+              <w:rPr>
+                <w:rFonts w:ascii="BRH Devanagari Extra" w:hAnsi="BRH Devanagari Extra" w:cs="BRH Devanagari Extra"/>
+                <w:sz w:val="32"/>
+                <w:szCs w:val="32"/>
+              </w:rPr>
+              <w:t>ÅxiÉ</w:t>
+            </w:r>
+            <w:r>
+              <w:rPr>
+                <w:rFonts w:ascii="BRH Devanagari Extra" w:hAnsi="BRH Devanagari Extra" w:cs="BRH Devanagari Extra"/>
+                <w:sz w:val="32"/>
+                <w:szCs w:val="32"/>
+                <w:highlight w:val="green"/>
+              </w:rPr>
+              <w:t>ÑuÉ</w:t>
+            </w:r>
+            <w:r>
+              <w:rPr>
+                <w:rFonts w:ascii="BRH Devanagari Extra" w:hAnsi="BRH Devanagari Extra" w:cs="BRH Devanagari Extra"/>
+                <w:sz w:val="32"/>
+                <w:szCs w:val="32"/>
+              </w:rPr>
+              <w:t xml:space="preserve">iÉ | </w:t>
+            </w:r>
+          </w:p>
+          <w:p>
+            <w:pPr>
+              <w:widowControl w:val="0"/>
+              <w:autoSpaceDE w:val="0"/>
+              <w:autoSpaceDN w:val="0"/>
+              <w:adjustRightInd w:val="0"/>
+              <w:spacing w:before="0" w:line="240" w:lineRule="auto"/>
+              <w:rPr>
+                <w:rFonts w:ascii="BRH Devanagari Extra" w:hAnsi="BRH Devanagari Extra" w:cs="BRH Devanagari Extra"/>
+                <w:sz w:val="32"/>
+                <w:szCs w:val="32"/>
+              </w:rPr>
+            </w:pPr>
+            <w:r>
+              <w:rPr>
+                <w:rFonts w:ascii="BRH Devanagari Extra" w:hAnsi="BRH Devanagari Extra" w:cs="BRH Devanagari Extra"/>
+                <w:sz w:val="32"/>
+                <w:szCs w:val="32"/>
+              </w:rPr>
+              <w:t>(</w:t>
+            </w:r>
+            <w:r>
+              <w:rPr>
+                <w:rFonts w:cs="BRH Devanagari Extra"/>
+                <w:szCs w:val="32"/>
+              </w:rPr>
+              <w:t>31</w:t>
+            </w:r>
+            <w:r>
+              <w:rPr>
+                <w:rFonts w:ascii="BRH Devanagari Extra" w:hAnsi="BRH Devanagari Extra" w:cs="BRH Devanagari Extra"/>
+                <w:sz w:val="32"/>
+                <w:szCs w:val="32"/>
+              </w:rPr>
+              <w:t>)[</w:t>
+            </w:r>
+            <w:r>
+              <w:rPr>
+                <w:rFonts w:cs="BRH Devanagari Extra"/>
+                <w:szCs w:val="32"/>
+              </w:rPr>
+              <w:t>P19</w:t>
+            </w:r>
+            <w:r>
+              <w:rPr>
+                <w:rFonts w:ascii="BRH Devanagari Extra" w:hAnsi="BRH Devanagari Extra" w:cs="BRH Devanagari Extra"/>
+                <w:sz w:val="32"/>
+                <w:szCs w:val="32"/>
+              </w:rPr>
+              <w:t xml:space="preserve">] </w:t>
+            </w:r>
+            <w:r>
+              <w:rPr>
+                <w:rFonts w:cs="BRH Devanagari Extra"/>
+                <w:szCs w:val="32"/>
+              </w:rPr>
+              <w:t>4</w:t>
+            </w:r>
+            <w:r>
+              <w:rPr>
+                <w:rFonts w:ascii="BRH Devanagari Extra" w:hAnsi="BRH Devanagari Extra" w:cs="BRH Devanagari Extra"/>
+                <w:sz w:val="32"/>
+                <w:szCs w:val="32"/>
+              </w:rPr>
+              <w:t>.</w:t>
+            </w:r>
+            <w:r>
+              <w:rPr>
+                <w:rFonts w:cs="BRH Devanagari Extra"/>
+                <w:szCs w:val="32"/>
+              </w:rPr>
+              <w:t>3</w:t>
+            </w:r>
+            <w:r>
+              <w:rPr>
+                <w:rFonts w:ascii="BRH Devanagari Extra" w:hAnsi="BRH Devanagari Extra" w:cs="BRH Devanagari Extra"/>
+                <w:sz w:val="32"/>
+                <w:szCs w:val="32"/>
+              </w:rPr>
+              <w:t>.</w:t>
+            </w:r>
+            <w:r>
+              <w:rPr>
+                <w:rFonts w:cs="BRH Devanagari Extra"/>
+                <w:szCs w:val="32"/>
+              </w:rPr>
+              <w:t>10</w:t>
+            </w:r>
+            <w:r>
+              <w:rPr>
+                <w:rFonts w:ascii="BRH Devanagari Extra" w:hAnsi="BRH Devanagari Extra" w:cs="BRH Devanagari Extra"/>
+                <w:sz w:val="32"/>
+                <w:szCs w:val="32"/>
+              </w:rPr>
+              <w:t>.</w:t>
+            </w:r>
+            <w:r>
+              <w:rPr>
+                <w:rFonts w:cs="BRH Devanagari Extra"/>
+                <w:szCs w:val="32"/>
+              </w:rPr>
+              <w:t>2</w:t>
+            </w:r>
+            <w:r>
+              <w:rPr>
+                <w:rFonts w:ascii="BRH Devanagari Extra" w:hAnsi="BRH Devanagari Extra" w:cs="BRH Devanagari Extra"/>
+                <w:sz w:val="32"/>
+                <w:szCs w:val="32"/>
+              </w:rPr>
+              <w:t>(</w:t>
+            </w:r>
+            <w:r>
+              <w:rPr>
+                <w:rFonts w:cs="BRH Devanagari Extra"/>
+                <w:szCs w:val="32"/>
+              </w:rPr>
+              <w:t>23</w:t>
+            </w:r>
+            <w:r>
+              <w:rPr>
+                <w:rFonts w:ascii="BRH Devanagari Extra" w:hAnsi="BRH Devanagari Extra" w:cs="BRH Devanagari Extra"/>
+                <w:sz w:val="32"/>
+                <w:szCs w:val="32"/>
+              </w:rPr>
+              <w:t>)-  LMüþÌuÉ</w:t>
+            </w:r>
+            <w:r>
+              <w:rPr>
+                <w:rFonts w:ascii="BRH Devanagari Extra" w:hAnsi="BRH Devanagari Extra" w:cs="BRH Devanagari Extra"/>
+                <w:sz w:val="26"/>
+                <w:szCs w:val="32"/>
+              </w:rPr>
+              <w:t>óè</w:t>
+            </w:r>
+            <w:r>
+              <w:rPr>
+                <w:rFonts w:ascii="BRH Devanagari Extra" w:hAnsi="BRH Devanagari Extra" w:cs="BRH Devanagari Extra"/>
+                <w:sz w:val="32"/>
+                <w:szCs w:val="32"/>
+              </w:rPr>
+              <w:t>zÉirÉÉ | A</w:t>
+            </w:r>
+            <w:r>
+              <w:rPr>
+                <w:rFonts w:ascii="BRH Malayalam Extra" w:hAnsi="BRH Malayalam Extra" w:cs="BRH Devanagari Extra"/>
+                <w:szCs w:val="32"/>
+              </w:rPr>
+              <w:t>–</w:t>
+            </w:r>
+            <w:r>
+              <w:rPr>
+                <w:rFonts w:ascii="BRH Devanagari Extra" w:hAnsi="BRH Devanagari Extra" w:cs="BRH Devanagari Extra"/>
+                <w:sz w:val="32"/>
+                <w:szCs w:val="32"/>
+              </w:rPr>
+              <w:t>xiÉÑ</w:t>
+            </w:r>
+            <w:r>
+              <w:rPr>
+                <w:rFonts w:ascii="BRH Malayalam Extra" w:hAnsi="BRH Malayalam Extra" w:cs="BRH Devanagari Extra"/>
+                <w:szCs w:val="32"/>
+              </w:rPr>
+              <w:t>–</w:t>
+            </w:r>
+            <w:r>
+              <w:rPr>
+                <w:rFonts w:ascii="BRH Devanagari Extra" w:hAnsi="BRH Devanagari Extra" w:cs="BRH Devanagari Extra"/>
+                <w:sz w:val="32"/>
+                <w:szCs w:val="32"/>
+              </w:rPr>
+              <w:t>uÉ</w:t>
+            </w:r>
+            <w:r>
+              <w:rPr>
+                <w:rFonts w:ascii="BRH Malayalam Extra" w:hAnsi="BRH Malayalam Extra" w:cs="BRH Devanagari Extra"/>
+                <w:szCs w:val="32"/>
+                <w:highlight w:val="green"/>
+              </w:rPr>
+              <w:t>–</w:t>
+            </w:r>
+            <w:r>
+              <w:rPr>
+                <w:rFonts w:ascii="BRH Devanagari Extra" w:hAnsi="BRH Devanagari Extra" w:cs="BRH Devanagari Extra"/>
+                <w:sz w:val="32"/>
+                <w:szCs w:val="32"/>
+                <w:highlight w:val="green"/>
+              </w:rPr>
+              <w:t>iÉ</w:t>
+            </w:r>
+            <w:r>
+              <w:rPr>
+                <w:rFonts w:ascii="BRH Malayalam Extra" w:hAnsi="BRH Malayalam Extra" w:cs="BRH Devanagari Extra"/>
+                <w:szCs w:val="32"/>
+                <w:highlight w:val="yellow"/>
+              </w:rPr>
+              <w:t>–</w:t>
+            </w:r>
+            <w:r>
+              <w:rPr>
+                <w:rFonts w:ascii="BRH Devanagari Extra" w:hAnsi="BRH Devanagari Extra" w:cs="BRH Devanagari Extra"/>
+                <w:sz w:val="32"/>
+                <w:szCs w:val="32"/>
+              </w:rPr>
+              <w:t xml:space="preserve"> | LMüþzÉTüÉÈ |</w:t>
+            </w:r>
+          </w:p>
+          <w:p>
+            <w:pPr>
+              <w:widowControl w:val="0"/>
+              <w:autoSpaceDE w:val="0"/>
+              <w:autoSpaceDN w:val="0"/>
+              <w:adjustRightInd w:val="0"/>
+              <w:spacing w:before="0" w:line="240" w:lineRule="auto"/>
+              <w:rPr>
+                <w:rFonts w:ascii="BRH Devanagari Extra" w:hAnsi="BRH Devanagari Extra" w:cs="BRH Devanagari Extra"/>
+                <w:sz w:val="32"/>
+                <w:szCs w:val="32"/>
+              </w:rPr>
+            </w:pPr>
+            <w:r>
+              <w:rPr>
+                <w:rFonts w:ascii="BRH Devanagari Extra" w:hAnsi="BRH Devanagari Extra" w:cs="BRH Devanagari Extra"/>
+                <w:sz w:val="32"/>
+                <w:szCs w:val="32"/>
+              </w:rPr>
+              <w:t>LMüþÌuÉ</w:t>
+            </w:r>
+            <w:r>
+              <w:rPr>
+                <w:rFonts w:ascii="BRH Devanagari Extra" w:hAnsi="BRH Devanagari Extra" w:cs="BRH Devanagari Extra"/>
+                <w:sz w:val="26"/>
+                <w:szCs w:val="32"/>
+              </w:rPr>
+              <w:t>óè</w:t>
+            </w:r>
+            <w:r>
+              <w:rPr>
+                <w:rFonts w:ascii="BRH Devanagari Extra" w:hAnsi="BRH Devanagari Extra" w:cs="BRH Devanagari Extra"/>
+                <w:sz w:val="32"/>
+                <w:szCs w:val="32"/>
+              </w:rPr>
+              <w:t>zÉirÉÉ ÅxiÉ</w:t>
+            </w:r>
+            <w:r>
+              <w:rPr>
+                <w:rFonts w:ascii="BRH Devanagari Extra" w:hAnsi="BRH Devanagari Extra" w:cs="BRH Devanagari Extra"/>
+                <w:sz w:val="32"/>
+                <w:szCs w:val="32"/>
+                <w:highlight w:val="green"/>
+              </w:rPr>
+              <w:t>ÑuÉ</w:t>
+            </w:r>
+            <w:r>
+              <w:rPr>
+                <w:rFonts w:ascii="BRH Devanagari Extra" w:hAnsi="BRH Devanagari Extra" w:cs="BRH Devanagari Extra"/>
+                <w:sz w:val="32"/>
+                <w:szCs w:val="32"/>
+              </w:rPr>
+              <w:t xml:space="preserve">iÉÉ </w:t>
+            </w:r>
+            <w:r>
+              <w:rPr>
+                <w:rFonts w:ascii="BRH Devanagari Extra" w:hAnsi="BRH Devanagari Extra" w:cs="BRH Devanagari Extra"/>
+                <w:sz w:val="32"/>
+                <w:szCs w:val="32"/>
+                <w:highlight w:val="green"/>
+              </w:rPr>
+              <w:t>xiÉÑ</w:t>
+            </w:r>
+            <w:r>
+              <w:rPr>
+                <w:rFonts w:ascii="BRH Devanagari Extra" w:hAnsi="BRH Devanagari Extra" w:cs="BRH Devanagari Extra"/>
+                <w:sz w:val="32"/>
+                <w:szCs w:val="32"/>
+              </w:rPr>
+              <w:t>uÉ</w:t>
+            </w:r>
+            <w:r>
+              <w:rPr>
+                <w:rFonts w:ascii="BRH Malayalam Extra" w:hAnsi="BRH Malayalam Extra" w:cs="BRH Devanagari Extra"/>
+                <w:szCs w:val="32"/>
+              </w:rPr>
+              <w:t>–</w:t>
+            </w:r>
+            <w:r>
+              <w:rPr>
+                <w:rFonts w:ascii="BRH Devanagari Extra" w:hAnsi="BRH Devanagari Extra" w:cs="BRH Devanagari Extra"/>
+                <w:sz w:val="32"/>
+                <w:szCs w:val="32"/>
+              </w:rPr>
+              <w:t xml:space="preserve"> iÉæMüþÌuÉ</w:t>
+            </w:r>
+            <w:r>
+              <w:rPr>
+                <w:rFonts w:ascii="BRH Devanagari Extra" w:hAnsi="BRH Devanagari Extra" w:cs="BRH Devanagari Extra"/>
+                <w:sz w:val="26"/>
+                <w:szCs w:val="32"/>
+              </w:rPr>
+              <w:t>óè</w:t>
+            </w:r>
+            <w:r>
+              <w:rPr>
+                <w:rFonts w:ascii="BRH Devanagari Extra" w:hAnsi="BRH Devanagari Extra" w:cs="BRH Devanagari Extra"/>
+                <w:sz w:val="32"/>
+                <w:szCs w:val="32"/>
+              </w:rPr>
+              <w:t>zÉ</w:t>
+            </w:r>
+            <w:r>
+              <w:rPr>
+                <w:rFonts w:ascii="BRH Malayalam Extra" w:hAnsi="BRH Malayalam Extra" w:cs="BRH Devanagari Extra"/>
+                <w:szCs w:val="32"/>
+              </w:rPr>
+              <w:t>–</w:t>
+            </w:r>
+            <w:r>
+              <w:rPr>
+                <w:rFonts w:ascii="BRH Devanagari Extra" w:hAnsi="BRH Devanagari Extra" w:cs="BRH Devanagari Extra"/>
+                <w:sz w:val="32"/>
+                <w:szCs w:val="32"/>
+              </w:rPr>
+              <w:t xml:space="preserve"> irÉæMüþÌuÉ</w:t>
+            </w:r>
+            <w:r>
+              <w:rPr>
+                <w:rFonts w:ascii="BRH Devanagari Extra" w:hAnsi="BRH Devanagari Extra" w:cs="BRH Devanagari Extra"/>
+                <w:sz w:val="26"/>
+                <w:szCs w:val="32"/>
+              </w:rPr>
+              <w:t>óè</w:t>
+            </w:r>
+            <w:r>
+              <w:rPr>
+                <w:rFonts w:ascii="BRH Devanagari Extra" w:hAnsi="BRH Devanagari Extra" w:cs="BRH Devanagari Extra"/>
+                <w:sz w:val="32"/>
+                <w:szCs w:val="32"/>
+              </w:rPr>
+              <w:t>zÉirÉÉ ÅxiÉÑuÉ</w:t>
+            </w:r>
+            <w:r>
+              <w:rPr>
+                <w:rFonts w:ascii="BRH Malayalam Extra" w:hAnsi="BRH Malayalam Extra" w:cs="BRH Devanagari Extra"/>
+                <w:szCs w:val="32"/>
+              </w:rPr>
+              <w:t>–</w:t>
+            </w:r>
+            <w:r>
+              <w:rPr>
+                <w:rFonts w:ascii="BRH Devanagari Extra" w:hAnsi="BRH Devanagari Extra" w:cs="BRH Devanagari Extra"/>
+                <w:sz w:val="32"/>
+                <w:szCs w:val="32"/>
+              </w:rPr>
+              <w:t xml:space="preserve"> iÉæMüþzÉTüÉ</w:t>
+            </w:r>
+            <w:r>
+              <w:rPr>
+                <w:rFonts w:ascii="BRH Malayalam Extra" w:hAnsi="BRH Malayalam Extra" w:cs="BRH Devanagari Extra"/>
+                <w:szCs w:val="32"/>
+              </w:rPr>
+              <w:t>–</w:t>
+            </w:r>
+            <w:r>
+              <w:rPr>
+                <w:rFonts w:ascii="BRH Devanagari Extra" w:hAnsi="BRH Devanagari Extra" w:cs="BRH Devanagari Extra"/>
+                <w:sz w:val="32"/>
+                <w:szCs w:val="32"/>
+              </w:rPr>
+              <w:t xml:space="preserve"> LMüþzÉTüÉ AxiÉÑuÉ</w:t>
+            </w:r>
+            <w:r>
+              <w:rPr>
+                <w:rFonts w:ascii="BRH Malayalam Extra" w:hAnsi="BRH Malayalam Extra" w:cs="BRH Devanagari Extra"/>
+                <w:szCs w:val="32"/>
+              </w:rPr>
+              <w:t>–</w:t>
+            </w:r>
+            <w:r>
+              <w:rPr>
+                <w:rFonts w:ascii="BRH Devanagari Extra" w:hAnsi="BRH Devanagari Extra" w:cs="BRH Devanagari Extra"/>
+                <w:sz w:val="32"/>
+                <w:szCs w:val="32"/>
+              </w:rPr>
+              <w:t xml:space="preserve"> iÉæMüþÌuÉ</w:t>
+            </w:r>
+            <w:r>
+              <w:rPr>
+                <w:rFonts w:ascii="BRH Devanagari Extra" w:hAnsi="BRH Devanagari Extra" w:cs="BRH Devanagari Extra"/>
+                <w:sz w:val="26"/>
+                <w:szCs w:val="32"/>
+              </w:rPr>
+              <w:t>óè</w:t>
+            </w:r>
+            <w:r>
+              <w:rPr>
+                <w:rFonts w:ascii="BRH Devanagari Extra" w:hAnsi="BRH Devanagari Extra" w:cs="BRH Devanagari Extra"/>
+                <w:sz w:val="32"/>
+                <w:szCs w:val="32"/>
+              </w:rPr>
+              <w:t>zÉ</w:t>
+            </w:r>
+            <w:r>
+              <w:rPr>
+                <w:rFonts w:ascii="BRH Malayalam Extra" w:hAnsi="BRH Malayalam Extra" w:cs="BRH Devanagari Extra"/>
+                <w:szCs w:val="32"/>
+              </w:rPr>
+              <w:t>–</w:t>
+            </w:r>
+            <w:r>
+              <w:rPr>
+                <w:rFonts w:ascii="BRH Devanagari Extra" w:hAnsi="BRH Devanagari Extra" w:cs="BRH Devanagari Extra"/>
+                <w:sz w:val="32"/>
+                <w:szCs w:val="32"/>
+              </w:rPr>
+              <w:t xml:space="preserve"> irÉæMüþÌuÉ</w:t>
+            </w:r>
+            <w:r>
+              <w:rPr>
+                <w:rFonts w:ascii="BRH Devanagari Extra" w:hAnsi="BRH Devanagari Extra" w:cs="BRH Devanagari Extra"/>
+                <w:sz w:val="26"/>
+                <w:szCs w:val="32"/>
+              </w:rPr>
+              <w:t>óè</w:t>
+            </w:r>
+            <w:r>
+              <w:rPr>
+                <w:rFonts w:ascii="BRH Devanagari Extra" w:hAnsi="BRH Devanagari Extra" w:cs="BRH Devanagari Extra"/>
+                <w:sz w:val="32"/>
+                <w:szCs w:val="32"/>
+              </w:rPr>
+              <w:t>zÉirÉÉ ÅxiÉÑuÉ</w:t>
+            </w:r>
+            <w:r>
+              <w:rPr>
+                <w:rFonts w:ascii="BRH Malayalam Extra" w:hAnsi="BRH Malayalam Extra" w:cs="BRH Devanagari Extra"/>
+                <w:szCs w:val="32"/>
+              </w:rPr>
+              <w:t>–</w:t>
+            </w:r>
+            <w:r>
+              <w:rPr>
+                <w:rFonts w:ascii="BRH Devanagari Extra" w:hAnsi="BRH Devanagari Extra" w:cs="BRH Devanagari Extra"/>
+                <w:sz w:val="32"/>
+                <w:szCs w:val="32"/>
+              </w:rPr>
+              <w:t xml:space="preserve"> iÉæMüþzÉTüÉÈ | </w:t>
+            </w:r>
+          </w:p>
+          <w:p>
+            <w:pPr>
+              <w:widowControl w:val="0"/>
+              <w:autoSpaceDE w:val="0"/>
+              <w:autoSpaceDN w:val="0"/>
+              <w:adjustRightInd w:val="0"/>
+              <w:spacing w:before="0" w:line="240" w:lineRule="auto"/>
+              <w:rPr>
+                <w:rFonts w:ascii="BRH Devanagari Extra" w:hAnsi="BRH Devanagari Extra" w:cs="BRH Devanagari Extra"/>
+                <w:sz w:val="32"/>
+                <w:szCs w:val="32"/>
+              </w:rPr>
+            </w:pPr>
+            <w:r>
+              <w:rPr>
+                <w:rFonts w:ascii="BRH Devanagari Extra" w:hAnsi="BRH Devanagari Extra" w:cs="BRH Devanagari Extra"/>
+                <w:sz w:val="32"/>
+                <w:szCs w:val="32"/>
+              </w:rPr>
+              <w:t>(</w:t>
+            </w:r>
+            <w:r>
+              <w:rPr>
+                <w:rFonts w:cs="BRH Devanagari Extra"/>
+                <w:szCs w:val="32"/>
+              </w:rPr>
+              <w:t>33</w:t>
+            </w:r>
+            <w:r>
+              <w:rPr>
+                <w:rFonts w:ascii="BRH Devanagari Extra" w:hAnsi="BRH Devanagari Extra" w:cs="BRH Devanagari Extra"/>
+                <w:sz w:val="32"/>
+                <w:szCs w:val="32"/>
+              </w:rPr>
+              <w:t>)[</w:t>
+            </w:r>
+            <w:r>
+              <w:rPr>
+                <w:rFonts w:cs="BRH Devanagari Extra"/>
+                <w:szCs w:val="32"/>
+              </w:rPr>
+              <w:t>P19</w:t>
+            </w:r>
+            <w:r>
+              <w:rPr>
+                <w:rFonts w:ascii="BRH Devanagari Extra" w:hAnsi="BRH Devanagari Extra" w:cs="BRH Devanagari Extra"/>
+                <w:sz w:val="32"/>
+                <w:szCs w:val="32"/>
+              </w:rPr>
+              <w:t xml:space="preserve">] </w:t>
+            </w:r>
+            <w:r>
+              <w:rPr>
+                <w:rFonts w:cs="BRH Devanagari Extra"/>
+                <w:szCs w:val="32"/>
+              </w:rPr>
+              <w:t>4</w:t>
+            </w:r>
+            <w:r>
+              <w:rPr>
+                <w:rFonts w:ascii="BRH Devanagari Extra" w:hAnsi="BRH Devanagari Extra" w:cs="BRH Devanagari Extra"/>
+                <w:sz w:val="32"/>
+                <w:szCs w:val="32"/>
+              </w:rPr>
+              <w:t>.</w:t>
+            </w:r>
+            <w:r>
+              <w:rPr>
+                <w:rFonts w:cs="BRH Devanagari Extra"/>
+                <w:szCs w:val="32"/>
+              </w:rPr>
+              <w:t>3</w:t>
+            </w:r>
+            <w:r>
+              <w:rPr>
+                <w:rFonts w:ascii="BRH Devanagari Extra" w:hAnsi="BRH Devanagari Extra" w:cs="BRH Devanagari Extra"/>
+                <w:sz w:val="32"/>
+                <w:szCs w:val="32"/>
+              </w:rPr>
+              <w:t>.</w:t>
+            </w:r>
+            <w:r>
+              <w:rPr>
+                <w:rFonts w:cs="BRH Devanagari Extra"/>
+                <w:szCs w:val="32"/>
+              </w:rPr>
+              <w:t>10</w:t>
+            </w:r>
+            <w:r>
+              <w:rPr>
+                <w:rFonts w:ascii="BRH Devanagari Extra" w:hAnsi="BRH Devanagari Extra" w:cs="BRH Devanagari Extra"/>
+                <w:sz w:val="32"/>
+                <w:szCs w:val="32"/>
+              </w:rPr>
+              <w:t>.</w:t>
+            </w:r>
+            <w:r>
+              <w:rPr>
+                <w:rFonts w:cs="BRH Devanagari Extra"/>
+                <w:szCs w:val="32"/>
+              </w:rPr>
+              <w:t>2</w:t>
+            </w:r>
+            <w:r>
+              <w:rPr>
+                <w:rFonts w:ascii="BRH Devanagari Extra" w:hAnsi="BRH Devanagari Extra" w:cs="BRH Devanagari Extra"/>
+                <w:sz w:val="32"/>
+                <w:szCs w:val="32"/>
+              </w:rPr>
+              <w:t>(</w:t>
+            </w:r>
+            <w:r>
+              <w:rPr>
+                <w:rFonts w:cs="BRH Devanagari Extra"/>
+                <w:szCs w:val="32"/>
+              </w:rPr>
+              <w:t>24</w:t>
+            </w:r>
+            <w:r>
+              <w:rPr>
+                <w:rFonts w:ascii="BRH Devanagari Extra" w:hAnsi="BRH Devanagari Extra" w:cs="BRH Devanagari Extra"/>
+                <w:sz w:val="32"/>
+                <w:szCs w:val="32"/>
+              </w:rPr>
+              <w:t>)-  A</w:t>
+            </w:r>
+            <w:r>
+              <w:rPr>
+                <w:rFonts w:ascii="BRH Malayalam Extra" w:hAnsi="BRH Malayalam Extra" w:cs="BRH Devanagari Extra"/>
+                <w:szCs w:val="32"/>
+              </w:rPr>
+              <w:t>–</w:t>
+            </w:r>
+            <w:r>
+              <w:rPr>
+                <w:rFonts w:ascii="BRH Devanagari Extra" w:hAnsi="BRH Devanagari Extra" w:cs="BRH Devanagari Extra"/>
+                <w:sz w:val="32"/>
+                <w:szCs w:val="32"/>
+              </w:rPr>
+              <w:t>xiÉÑ</w:t>
+            </w:r>
+            <w:r>
+              <w:rPr>
+                <w:rFonts w:ascii="BRH Malayalam Extra" w:hAnsi="BRH Malayalam Extra" w:cs="BRH Devanagari Extra"/>
+                <w:szCs w:val="32"/>
+              </w:rPr>
+              <w:t>–</w:t>
+            </w:r>
+            <w:r>
+              <w:rPr>
+                <w:rFonts w:ascii="BRH Devanagari Extra" w:hAnsi="BRH Devanagari Extra" w:cs="BRH Devanagari Extra"/>
+                <w:sz w:val="32"/>
+                <w:szCs w:val="32"/>
+              </w:rPr>
+              <w:t>uÉ</w:t>
+            </w:r>
+            <w:r>
+              <w:rPr>
+                <w:rFonts w:ascii="BRH Malayalam Extra" w:hAnsi="BRH Malayalam Extra" w:cs="BRH Devanagari Extra"/>
+                <w:szCs w:val="32"/>
+                <w:highlight w:val="green"/>
+              </w:rPr>
+              <w:t>–</w:t>
+            </w:r>
+            <w:r>
+              <w:rPr>
+                <w:rFonts w:ascii="BRH Devanagari Extra" w:hAnsi="BRH Devanagari Extra" w:cs="BRH Devanagari Extra"/>
+                <w:sz w:val="32"/>
+                <w:szCs w:val="32"/>
+                <w:highlight w:val="green"/>
+              </w:rPr>
+              <w:t>iÉ</w:t>
+            </w:r>
+            <w:r>
+              <w:rPr>
+                <w:rFonts w:ascii="BRH Malayalam Extra" w:hAnsi="BRH Malayalam Extra" w:cs="BRH Devanagari Extra"/>
+                <w:szCs w:val="32"/>
+                <w:highlight w:val="yellow"/>
+              </w:rPr>
+              <w:t>–</w:t>
+            </w:r>
+            <w:r>
+              <w:rPr>
+                <w:rFonts w:ascii="BRH Devanagari Extra" w:hAnsi="BRH Devanagari Extra" w:cs="BRH Devanagari Extra"/>
+                <w:sz w:val="32"/>
+                <w:szCs w:val="32"/>
+              </w:rPr>
+              <w:t xml:space="preserve"> | LMüþzÉTüÉÈ | mÉ</w:t>
+            </w:r>
+            <w:r>
+              <w:rPr>
+                <w:rFonts w:ascii="BRH Malayalam Extra" w:hAnsi="BRH Malayalam Extra" w:cs="BRH Devanagari Extra"/>
+                <w:szCs w:val="32"/>
+              </w:rPr>
+              <w:t>–</w:t>
+            </w:r>
+            <w:r>
+              <w:rPr>
+                <w:rFonts w:ascii="BRH Devanagari Extra" w:hAnsi="BRH Devanagari Extra" w:cs="BRH Devanagari Extra"/>
+                <w:sz w:val="32"/>
+                <w:szCs w:val="32"/>
+              </w:rPr>
+              <w:t>zÉuÉþÈ |</w:t>
+            </w:r>
+          </w:p>
+          <w:p>
+            <w:pPr>
+              <w:widowControl w:val="0"/>
+              <w:autoSpaceDE w:val="0"/>
+              <w:autoSpaceDN w:val="0"/>
+              <w:adjustRightInd w:val="0"/>
+              <w:spacing w:before="0" w:line="240" w:lineRule="auto"/>
+              <w:rPr>
+                <w:rFonts w:ascii="BRH Devanagari Extra" w:hAnsi="BRH Devanagari Extra" w:cs="BRH Devanagari Extra"/>
+                <w:sz w:val="32"/>
+                <w:szCs w:val="32"/>
+              </w:rPr>
+            </w:pPr>
+            <w:r>
+              <w:rPr>
+                <w:rFonts w:ascii="BRH Devanagari Extra" w:hAnsi="BRH Devanagari Extra" w:cs="BRH Devanagari Extra"/>
+                <w:sz w:val="32"/>
+                <w:szCs w:val="32"/>
+              </w:rPr>
+              <w:t>A</w:t>
+            </w:r>
+            <w:r>
+              <w:rPr>
+                <w:rFonts w:ascii="BRH Malayalam Extra" w:hAnsi="BRH Malayalam Extra" w:cs="BRH Devanagari Extra"/>
+                <w:szCs w:val="32"/>
+              </w:rPr>
+              <w:t>–</w:t>
+            </w:r>
+            <w:r>
+              <w:rPr>
+                <w:rFonts w:ascii="BRH Devanagari Extra" w:hAnsi="BRH Devanagari Extra" w:cs="BRH Devanagari Extra"/>
+                <w:sz w:val="32"/>
+                <w:szCs w:val="32"/>
+              </w:rPr>
+              <w:t>xiÉÑ</w:t>
+            </w:r>
+            <w:r>
+              <w:rPr>
+                <w:rFonts w:ascii="BRH Malayalam Extra" w:hAnsi="BRH Malayalam Extra" w:cs="BRH Devanagari Extra"/>
+                <w:szCs w:val="32"/>
+              </w:rPr>
+              <w:t>–</w:t>
+            </w:r>
+            <w:r>
+              <w:rPr>
+                <w:rFonts w:ascii="BRH Devanagari Extra" w:hAnsi="BRH Devanagari Extra" w:cs="BRH Devanagari Extra"/>
+                <w:sz w:val="32"/>
+                <w:szCs w:val="32"/>
+              </w:rPr>
+              <w:t>uÉ</w:t>
+            </w:r>
+            <w:r>
+              <w:rPr>
+                <w:rFonts w:ascii="BRH Malayalam Extra" w:hAnsi="BRH Malayalam Extra" w:cs="BRH Devanagari Extra"/>
+                <w:szCs w:val="32"/>
+              </w:rPr>
+              <w:t>–</w:t>
+            </w:r>
+            <w:r>
+              <w:rPr>
+                <w:rFonts w:ascii="BRH Devanagari Extra" w:hAnsi="BRH Devanagari Extra" w:cs="BRH Devanagari Extra"/>
+                <w:sz w:val="32"/>
+                <w:szCs w:val="32"/>
+              </w:rPr>
+              <w:t xml:space="preserve"> iÉæMüþzÉTüÉ</w:t>
+            </w:r>
+            <w:r>
+              <w:rPr>
+                <w:rFonts w:ascii="BRH Malayalam Extra" w:hAnsi="BRH Malayalam Extra" w:cs="BRH Devanagari Extra"/>
+                <w:szCs w:val="32"/>
+              </w:rPr>
+              <w:t>–</w:t>
+            </w:r>
+            <w:r>
+              <w:rPr>
+                <w:rFonts w:ascii="BRH Devanagari Extra" w:hAnsi="BRH Devanagari Extra" w:cs="BRH Devanagari Extra"/>
+                <w:sz w:val="32"/>
+                <w:szCs w:val="32"/>
+              </w:rPr>
+              <w:t xml:space="preserve"> LMüþzÉTüÉ AxiÉ</w:t>
+            </w:r>
+            <w:r>
+              <w:rPr>
+                <w:rFonts w:ascii="BRH Devanagari Extra" w:hAnsi="BRH Devanagari Extra" w:cs="BRH Devanagari Extra"/>
+                <w:sz w:val="32"/>
+                <w:szCs w:val="32"/>
+                <w:highlight w:val="green"/>
+              </w:rPr>
+              <w:t>ÑuÉ</w:t>
+            </w:r>
+            <w:r>
+              <w:rPr>
+                <w:rFonts w:ascii="BRH Devanagari Extra" w:hAnsi="BRH Devanagari Extra" w:cs="BRH Devanagari Extra"/>
+                <w:sz w:val="32"/>
+                <w:szCs w:val="32"/>
+              </w:rPr>
+              <w:t xml:space="preserve">iÉÉ </w:t>
+            </w:r>
+            <w:r>
+              <w:rPr>
+                <w:rFonts w:ascii="BRH Devanagari Extra" w:hAnsi="BRH Devanagari Extra" w:cs="BRH Devanagari Extra"/>
+                <w:sz w:val="32"/>
+                <w:szCs w:val="32"/>
+                <w:highlight w:val="green"/>
+              </w:rPr>
+              <w:t>xiÉÑ</w:t>
+            </w:r>
+            <w:r>
+              <w:rPr>
+                <w:rFonts w:ascii="BRH Devanagari Extra" w:hAnsi="BRH Devanagari Extra" w:cs="BRH Devanagari Extra"/>
+                <w:sz w:val="32"/>
+                <w:szCs w:val="32"/>
+              </w:rPr>
+              <w:t>uÉ</w:t>
+            </w:r>
+            <w:r>
+              <w:rPr>
+                <w:rFonts w:ascii="BRH Malayalam Extra" w:hAnsi="BRH Malayalam Extra" w:cs="BRH Devanagari Extra"/>
+                <w:szCs w:val="32"/>
+              </w:rPr>
+              <w:t>–</w:t>
+            </w:r>
+            <w:r>
+              <w:rPr>
+                <w:rFonts w:ascii="BRH Devanagari Extra" w:hAnsi="BRH Devanagari Extra" w:cs="BRH Devanagari Extra"/>
+                <w:sz w:val="32"/>
+                <w:szCs w:val="32"/>
+              </w:rPr>
+              <w:t xml:space="preserve"> iÉæMüþzÉTüÉÈ mÉ</w:t>
+            </w:r>
+            <w:r>
+              <w:rPr>
+                <w:rFonts w:ascii="BRH Malayalam Extra" w:hAnsi="BRH Malayalam Extra" w:cs="BRH Devanagari Extra"/>
+                <w:szCs w:val="32"/>
+              </w:rPr>
+              <w:t>–</w:t>
+            </w:r>
+            <w:r>
+              <w:rPr>
+                <w:rFonts w:ascii="BRH Devanagari Extra" w:hAnsi="BRH Devanagari Extra" w:cs="BRH Devanagari Extra"/>
+                <w:sz w:val="32"/>
+                <w:szCs w:val="32"/>
+              </w:rPr>
+              <w:t xml:space="preserve">zÉuÉþÈ </w:t>
+            </w:r>
+          </w:p>
+          <w:p>
+            <w:pPr>
+              <w:widowControl w:val="0"/>
+              <w:autoSpaceDE w:val="0"/>
+              <w:autoSpaceDN w:val="0"/>
+              <w:adjustRightInd w:val="0"/>
+              <w:spacing w:before="0" w:line="240" w:lineRule="auto"/>
+              <w:rPr>
+                <w:rFonts w:cs="BRH Malayalam Extra"/>
+                <w:color w:val="FF0000"/>
+                <w:szCs w:val="40"/>
+              </w:rPr>
+            </w:pPr>
+            <w:r>
+              <w:rPr>
+                <w:rFonts w:ascii="BRH Devanagari Extra" w:hAnsi="BRH Devanagari Extra" w:cs="BRH Devanagari Extra"/>
+                <w:sz w:val="32"/>
+                <w:szCs w:val="32"/>
+              </w:rPr>
+              <w:lastRenderedPageBreak/>
+              <w:t>mÉ</w:t>
+            </w:r>
+            <w:r>
+              <w:rPr>
+                <w:rFonts w:ascii="BRH Malayalam Extra" w:hAnsi="BRH Malayalam Extra" w:cs="BRH Devanagari Extra"/>
+                <w:szCs w:val="32"/>
+              </w:rPr>
+              <w:t>–</w:t>
+            </w:r>
+            <w:r>
+              <w:rPr>
+                <w:rFonts w:ascii="BRH Devanagari Extra" w:hAnsi="BRH Devanagari Extra" w:cs="BRH Devanagari Extra"/>
+                <w:sz w:val="32"/>
+                <w:szCs w:val="32"/>
+              </w:rPr>
+              <w:t>zÉuÉ</w:t>
+            </w:r>
+            <w:r>
+              <w:rPr>
+                <w:rFonts w:ascii="BRH Malayalam Extra" w:hAnsi="BRH Malayalam Extra" w:cs="BRH Devanagari Extra"/>
+                <w:szCs w:val="32"/>
+              </w:rPr>
+              <w:t>–</w:t>
+            </w:r>
+            <w:r>
+              <w:rPr>
+                <w:rFonts w:ascii="BRH Devanagari Extra" w:hAnsi="BRH Devanagari Extra" w:cs="BRH Devanagari Extra"/>
+                <w:sz w:val="32"/>
+                <w:szCs w:val="32"/>
+              </w:rPr>
+              <w:t xml:space="preserve"> LMüþzÉTüÉ AxiÉÑ</w:t>
+            </w:r>
+            <w:r>
+              <w:rPr>
+                <w:rFonts w:ascii="BRH Devanagari Extra" w:hAnsi="BRH Devanagari Extra" w:cs="BRH Devanagari Extra"/>
+                <w:sz w:val="32"/>
+                <w:szCs w:val="32"/>
+                <w:highlight w:val="green"/>
+              </w:rPr>
+              <w:t>u</w:t>
+            </w:r>
+            <w:r>
+              <w:rPr>
+                <w:rFonts w:ascii="BRH Devanagari Extra" w:hAnsi="BRH Devanagari Extra" w:cs="BRH Devanagari Extra"/>
+                <w:sz w:val="32"/>
+                <w:szCs w:val="32"/>
+                <w:highlight w:val="green"/>
+              </w:rPr>
+              <w:t>É</w:t>
+            </w:r>
+            <w:r>
+              <w:rPr>
+                <w:rFonts w:ascii="BRH Devanagari Extra" w:hAnsi="BRH Devanagari Extra" w:cs="BRH Devanagari Extra"/>
+                <w:sz w:val="32"/>
+                <w:szCs w:val="32"/>
+              </w:rPr>
+              <w:t xml:space="preserve">iÉÉ </w:t>
+            </w:r>
+            <w:r>
+              <w:rPr>
+                <w:rFonts w:ascii="BRH Devanagari Extra" w:hAnsi="BRH Devanagari Extra" w:cs="BRH Devanagari Extra"/>
+                <w:sz w:val="32"/>
+                <w:szCs w:val="32"/>
+                <w:highlight w:val="green"/>
+              </w:rPr>
+              <w:t>xiÉÑ</w:t>
+            </w:r>
+            <w:r>
+              <w:rPr>
+                <w:rFonts w:ascii="BRH Devanagari Extra" w:hAnsi="BRH Devanagari Extra" w:cs="BRH Devanagari Extra"/>
+                <w:sz w:val="32"/>
+                <w:szCs w:val="32"/>
+              </w:rPr>
+              <w:t>uÉ</w:t>
+            </w:r>
+            <w:r>
+              <w:rPr>
+                <w:rFonts w:ascii="BRH Malayalam Extra" w:hAnsi="BRH Malayalam Extra" w:cs="BRH Devanagari Extra"/>
+                <w:szCs w:val="32"/>
+              </w:rPr>
+              <w:t>–</w:t>
+            </w:r>
+            <w:r>
+              <w:rPr>
+                <w:rFonts w:ascii="BRH Devanagari Extra" w:hAnsi="BRH Devanagari Extra" w:cs="BRH Devanagari Extra"/>
+                <w:sz w:val="32"/>
+                <w:szCs w:val="32"/>
+              </w:rPr>
+              <w:t xml:space="preserve"> iÉæMüþzÉTüÉÈ mÉ</w:t>
+            </w:r>
+            <w:r>
+              <w:rPr>
+                <w:rFonts w:ascii="BRH Malayalam Extra" w:hAnsi="BRH Malayalam Extra" w:cs="BRH Devanagari Extra"/>
+                <w:szCs w:val="32"/>
+              </w:rPr>
+              <w:t>–</w:t>
+            </w:r>
+            <w:r>
+              <w:rPr>
+                <w:rFonts w:ascii="BRH Devanagari Extra" w:hAnsi="BRH Devanagari Extra" w:cs="BRH Devanagari Extra"/>
+                <w:sz w:val="32"/>
+                <w:szCs w:val="32"/>
+              </w:rPr>
+              <w:t xml:space="preserve">zÉuÉþÈ | </w:t>
+            </w:r>
+          </w:p>
+        </w:tc>
+      </w:tr>
+    </w:tbl>
+    <w:p>
+      <w:pPr>
+        <w:spacing w:before="0" w:line="240" w:lineRule="auto"/>
+        <w:jc w:val="center"/>
+        <w:rPr>
+          <w:b/>
+          <w:bCs/>
+          <w:sz w:val="32"/>
+          <w:szCs w:val="32"/>
+          <w:u w:val="single"/>
+        </w:rPr>
+      </w:pPr>
+    </w:p>
+    <w:p>
+      <w:pPr>
+        <w:spacing w:before="0" w:line="240" w:lineRule="auto"/>
+        <w:jc w:val="center"/>
+        <w:rPr>
+          <w:b/>
+          <w:bCs/>
+          <w:sz w:val="32"/>
+          <w:szCs w:val="32"/>
+          <w:u w:val="single"/>
+        </w:rPr>
+      </w:pPr>
+      <w:r>
+        <w:rPr>
+          <w:b/>
+          <w:bCs/>
+          <w:sz w:val="32"/>
+          <w:szCs w:val="32"/>
+          <w:u w:val="single"/>
+        </w:rPr>
+        <w:t>==============</w:t>
+      </w:r>
+    </w:p>
+    <w:p>
+      <w:pPr>
+        <w:spacing w:before="0" w:line="240" w:lineRule="auto"/>
+        <w:jc w:val="center"/>
+        <w:rPr>
+          <w:b/>
+          <w:bCs/>
+          <w:sz w:val="32"/>
+          <w:szCs w:val="32"/>
+          <w:u w:val="single"/>
+        </w:rPr>
+      </w:pPr>
+    </w:p>
     <w:p>
       <w:pPr>
         <w:spacing w:before="0" w:line="240" w:lineRule="auto"/>
@@ -341,7 +3541,6 @@
               <w:t>zNlS</w:t>
             </w:r>
             <w:bookmarkEnd w:id="1"/>
-            <w:proofErr w:type="gramStart"/>
             <w:r>
               <w:rPr>
                 <w:rFonts w:ascii="BRH Malayalam Extra" w:hAnsi="BRH Malayalam Extra" w:cs="BRH Devanagari Extra"/>
@@ -369,19 +3568,7 @@
                 <w:highlight w:val="green"/>
                 <w:lang w:val="en-IN"/>
               </w:rPr>
-              <w:t>replaced</w:t>
-            </w:r>
-            <w:proofErr w:type="gramEnd"/>
-            <w:r>
-              <w:rPr>
-                <w:rFonts w:ascii="Cambria" w:hAnsi="Cambria" w:cs="BRH Malayalam Extra"/>
-                <w:color w:val="000000"/>
-                <w:sz w:val="26"/>
-                <w:szCs w:val="32"/>
-                <w:highlight w:val="green"/>
-                <w:lang w:val="en-IN"/>
-              </w:rPr>
-              <w:t xml:space="preserve"> with correct spelling at various places</w:t>
+              <w:t>replaced with correct spelling at various places</w:t>
             </w:r>
           </w:p>
         </w:tc>
@@ -583,7 +3770,6 @@
               </w:rPr>
               <w:t>(</w:t>
             </w:r>
-            <w:proofErr w:type="gramStart"/>
             <w:r>
               <w:rPr>
                 <w:rFonts w:cs="BRH Devanagari Extra"/>
@@ -601,7 +3787,6 @@
               </w:rPr>
               <w:t>)[</w:t>
             </w:r>
-            <w:proofErr w:type="gramEnd"/>
             <w:r>
               <w:rPr>
                 <w:rFonts w:cs="BRH Devanagari Extra"/>
@@ -1087,7 +4272,6 @@
               </w:rPr>
               <w:t>(</w:t>
             </w:r>
-            <w:proofErr w:type="gramStart"/>
             <w:r>
               <w:rPr>
                 <w:rFonts w:cs="BRH Devanagari Extra"/>
@@ -1105,7 +4289,6 @@
               </w:rPr>
               <w:t>)[</w:t>
             </w:r>
-            <w:proofErr w:type="gramEnd"/>
             <w:r>
               <w:rPr>
                 <w:rFonts w:cs="BRH Devanagari Extra"/>
@@ -1620,7 +4803,6 @@
               </w:rPr>
               <w:t>(</w:t>
             </w:r>
-            <w:proofErr w:type="gramStart"/>
             <w:r>
               <w:rPr>
                 <w:rFonts w:cs="BRH Devanagari Extra"/>
@@ -1638,7 +4820,6 @@
               </w:rPr>
               <w:t>)[</w:t>
             </w:r>
-            <w:proofErr w:type="gramEnd"/>
             <w:r>
               <w:rPr>
                 <w:rFonts w:cs="BRH Devanagari Extra"/>
@@ -2163,6 +5344,7 @@
                 <w:sz w:val="32"/>
                 <w:szCs w:val="32"/>
               </w:rPr>
+              <w:lastRenderedPageBreak/>
               <w:t>kÉëÑ</w:t>
             </w:r>
             <w:r>
@@ -2223,7 +5405,6 @@
               </w:rPr>
               <w:t>(</w:t>
             </w:r>
-            <w:proofErr w:type="gramStart"/>
             <w:r>
               <w:rPr>
                 <w:rFonts w:cs="BRH Devanagari Extra"/>
@@ -2241,7 +5422,6 @@
               </w:rPr>
               <w:t>)[</w:t>
             </w:r>
-            <w:proofErr w:type="gramEnd"/>
             <w:r>
               <w:rPr>
                 <w:rFonts w:cs="BRH Devanagari Extra"/>
@@ -2531,9 +5711,9 @@
                 <w:sz w:val="32"/>
                 <w:szCs w:val="32"/>
               </w:rPr>
+              <w:lastRenderedPageBreak/>
               <w:t>(</w:t>
             </w:r>
-            <w:proofErr w:type="gramStart"/>
             <w:r>
               <w:rPr>
                 <w:rFonts w:cs="BRH Devanagari Extra"/>
@@ -2551,7 +5731,6 @@
               </w:rPr>
               <w:t>)[</w:t>
             </w:r>
-            <w:proofErr w:type="gramEnd"/>
             <w:r>
               <w:rPr>
                 <w:rFonts w:cs="BRH Devanagari Extra"/>
@@ -3076,6 +6255,7 @@
                 <w:sz w:val="32"/>
                 <w:szCs w:val="32"/>
               </w:rPr>
+              <w:lastRenderedPageBreak/>
               <w:t>kÉëÑ</w:t>
             </w:r>
             <w:r>
@@ -3136,7 +6316,6 @@
               </w:rPr>
               <w:t>(</w:t>
             </w:r>
-            <w:proofErr w:type="gramStart"/>
             <w:r>
               <w:rPr>
                 <w:rFonts w:cs="BRH Devanagari Extra"/>
@@ -3154,7 +6333,6 @@
               </w:rPr>
               <w:t>)[</w:t>
             </w:r>
-            <w:proofErr w:type="gramEnd"/>
             <w:r>
               <w:rPr>
                 <w:rFonts w:cs="BRH Devanagari Extra"/>
@@ -3476,7 +6654,6 @@
               <w:lastRenderedPageBreak/>
               <w:t>(</w:t>
             </w:r>
-            <w:proofErr w:type="gramStart"/>
             <w:r>
               <w:rPr>
                 <w:rFonts w:cs="BRH Devanagari Extra"/>
@@ -3494,7 +6671,6 @@
               </w:rPr>
               <w:t>)[</w:t>
             </w:r>
-            <w:proofErr w:type="gramEnd"/>
             <w:r>
               <w:rPr>
                 <w:rFonts w:cs="BRH Devanagari Extra"/>
@@ -3934,7 +7110,6 @@
               </w:rPr>
               <w:t>(</w:t>
             </w:r>
-            <w:proofErr w:type="gramStart"/>
             <w:r>
               <w:rPr>
                 <w:rFonts w:cs="BRH Devanagari Extra"/>
@@ -3952,7 +7127,6 @@
               </w:rPr>
               <w:t>)[</w:t>
             </w:r>
-            <w:proofErr w:type="gramEnd"/>
             <w:r>
               <w:rPr>
                 <w:rFonts w:cs="BRH Devanagari Extra"/>
@@ -4493,7 +7667,6 @@
               </w:rPr>
               <w:t>(</w:t>
             </w:r>
-            <w:proofErr w:type="gramStart"/>
             <w:r>
               <w:rPr>
                 <w:rFonts w:cs="BRH Devanagari Extra"/>
@@ -4511,7 +7684,6 @@
               </w:rPr>
               <w:t>)[</w:t>
             </w:r>
-            <w:proofErr w:type="gramEnd"/>
             <w:r>
               <w:rPr>
                 <w:rFonts w:cs="BRH Devanagari Extra"/>
@@ -5021,7 +8193,6 @@
               </w:rPr>
               <w:t>(</w:t>
             </w:r>
-            <w:proofErr w:type="gramStart"/>
             <w:r>
               <w:rPr>
                 <w:rFonts w:cs="BRH Devanagari Extra"/>
@@ -5039,7 +8210,6 @@
               </w:rPr>
               <w:t>)[</w:t>
             </w:r>
-            <w:proofErr w:type="gramEnd"/>
             <w:r>
               <w:rPr>
                 <w:rFonts w:cs="BRH Devanagari Extra"/>
@@ -5304,7 +8474,6 @@
               </w:rPr>
               <w:t>(</w:t>
             </w:r>
-            <w:proofErr w:type="gramStart"/>
             <w:r>
               <w:rPr>
                 <w:rFonts w:cs="BRH Devanagari Extra"/>
@@ -5322,7 +8491,6 @@
               </w:rPr>
               <w:t>)[</w:t>
             </w:r>
-            <w:proofErr w:type="gramEnd"/>
             <w:r>
               <w:rPr>
                 <w:rFonts w:cs="BRH Devanagari Extra"/>
@@ -5762,7 +8930,6 @@
               </w:rPr>
               <w:t>(</w:t>
             </w:r>
-            <w:proofErr w:type="gramStart"/>
             <w:r>
               <w:rPr>
                 <w:rFonts w:cs="BRH Devanagari Extra"/>
@@ -5780,7 +8947,6 @@
               </w:rPr>
               <w:t>)[</w:t>
             </w:r>
-            <w:proofErr w:type="gramEnd"/>
             <w:r>
               <w:rPr>
                 <w:rFonts w:cs="BRH Devanagari Extra"/>
@@ -6331,7 +9497,6 @@
               </w:rPr>
               <w:t>(</w:t>
             </w:r>
-            <w:proofErr w:type="gramStart"/>
             <w:r>
               <w:rPr>
                 <w:rFonts w:cs="BRH Devanagari Extra"/>
@@ -6349,7 +9514,6 @@
               </w:rPr>
               <w:t>)[</w:t>
             </w:r>
-            <w:proofErr w:type="gramEnd"/>
             <w:r>
               <w:rPr>
                 <w:rFonts w:cs="BRH Devanagari Extra"/>
@@ -6859,7 +10023,6 @@
               </w:rPr>
               <w:t>(</w:t>
             </w:r>
-            <w:proofErr w:type="gramStart"/>
             <w:r>
               <w:rPr>
                 <w:rFonts w:cs="BRH Devanagari Extra"/>
@@ -6877,7 +10040,6 @@
               </w:rPr>
               <w:t>)[</w:t>
             </w:r>
-            <w:proofErr w:type="gramEnd"/>
             <w:r>
               <w:rPr>
                 <w:rFonts w:cs="BRH Devanagari Extra"/>
@@ -7146,7 +10308,6 @@
               <w:lastRenderedPageBreak/>
               <w:t>(</w:t>
             </w:r>
-            <w:proofErr w:type="gramStart"/>
             <w:r>
               <w:rPr>
                 <w:rFonts w:cs="BRH Devanagari Extra"/>
@@ -7162,7 +10323,6 @@
               </w:rPr>
               <w:t>)[</w:t>
             </w:r>
-            <w:proofErr w:type="gramEnd"/>
             <w:r>
               <w:rPr>
                 <w:rFonts w:cs="BRH Devanagari Extra"/>
@@ -7535,7 +10695,6 @@
               </w:rPr>
               <w:t>(</w:t>
             </w:r>
-            <w:proofErr w:type="gramStart"/>
             <w:r>
               <w:rPr>
                 <w:rFonts w:cs="BRH Devanagari Extra"/>
@@ -7551,7 +10710,6 @@
               </w:rPr>
               <w:t>)[</w:t>
             </w:r>
-            <w:proofErr w:type="gramEnd"/>
             <w:r>
               <w:rPr>
                 <w:rFonts w:cs="BRH Devanagari Extra"/>
@@ -7931,7 +11089,6 @@
               </w:rPr>
               <w:t>(</w:t>
             </w:r>
-            <w:proofErr w:type="gramStart"/>
             <w:r>
               <w:rPr>
                 <w:rFonts w:cs="BRH Devanagari Extra"/>
@@ -7947,7 +11104,6 @@
               </w:rPr>
               <w:t>)[</w:t>
             </w:r>
-            <w:proofErr w:type="gramEnd"/>
             <w:r>
               <w:rPr>
                 <w:rFonts w:cs="BRH Devanagari Extra"/>
@@ -8343,7 +11499,6 @@
               </w:rPr>
               <w:t>(</w:t>
             </w:r>
-            <w:proofErr w:type="gramStart"/>
             <w:r>
               <w:rPr>
                 <w:rFonts w:cs="BRH Devanagari Extra"/>
@@ -8359,7 +11514,6 @@
               </w:rPr>
               <w:t>)[</w:t>
             </w:r>
-            <w:proofErr w:type="gramEnd"/>
             <w:r>
               <w:rPr>
                 <w:rFonts w:cs="BRH Devanagari Extra"/>
@@ -8744,7 +11898,6 @@
               </w:rPr>
               <w:t>(</w:t>
             </w:r>
-            <w:proofErr w:type="gramStart"/>
             <w:r>
               <w:rPr>
                 <w:rFonts w:cs="BRH Devanagari Extra"/>
@@ -8760,7 +11913,6 @@
               </w:rPr>
               <w:t>)[</w:t>
             </w:r>
-            <w:proofErr w:type="gramEnd"/>
             <w:r>
               <w:rPr>
                 <w:rFonts w:cs="BRH Devanagari Extra"/>
@@ -9120,7 +12272,6 @@
               </w:rPr>
               <w:t>(</w:t>
             </w:r>
-            <w:proofErr w:type="gramStart"/>
             <w:r>
               <w:rPr>
                 <w:rFonts w:cs="BRH Devanagari Extra"/>
@@ -9136,7 +12287,6 @@
               </w:rPr>
               <w:t>)[</w:t>
             </w:r>
-            <w:proofErr w:type="gramEnd"/>
             <w:r>
               <w:rPr>
                 <w:rFonts w:cs="BRH Devanagari Extra"/>
@@ -9520,7 +12670,6 @@
               </w:rPr>
               <w:t>(</w:t>
             </w:r>
-            <w:proofErr w:type="gramStart"/>
             <w:r>
               <w:rPr>
                 <w:rFonts w:cs="BRH Devanagari Extra"/>
@@ -9538,7 +12687,6 @@
               </w:rPr>
               <w:t>)[</w:t>
             </w:r>
-            <w:proofErr w:type="gramEnd"/>
             <w:r>
               <w:rPr>
                 <w:rFonts w:cs="BRH Devanagari Extra"/>
@@ -9864,7 +13012,6 @@
               </w:rPr>
               <w:t>(</w:t>
             </w:r>
-            <w:proofErr w:type="gramStart"/>
             <w:r>
               <w:rPr>
                 <w:rFonts w:cs="BRH Devanagari Extra"/>
@@ -9882,7 +13029,6 @@
               </w:rPr>
               <w:t>)[</w:t>
             </w:r>
-            <w:proofErr w:type="gramEnd"/>
             <w:r>
               <w:rPr>
                 <w:rFonts w:cs="BRH Devanagari Extra"/>
@@ -10041,6 +13187,7 @@
                 <w:szCs w:val="32"/>
                 <w:highlight w:val="yellow"/>
               </w:rPr>
+              <w:lastRenderedPageBreak/>
               <w:t>pÉÑ</w:t>
             </w:r>
             <w:r>
@@ -10138,17 +13285,7 @@
                 <w:sz w:val="32"/>
                 <w:szCs w:val="32"/>
               </w:rPr>
-              <w:t xml:space="preserve">iÉ(aaÉç) </w:t>
-            </w:r>
-            <w:r>
-              <w:rPr>
-                <w:rFonts w:ascii="BRH Devanagari Extra" w:hAnsi="BRH Devanagari Extra" w:cs="BRH Devanagari Extra"/>
-                <w:color w:val="000000"/>
-                <w:sz w:val="32"/>
-                <w:szCs w:val="32"/>
-              </w:rPr>
-              <w:lastRenderedPageBreak/>
-              <w:t>xmÉ×</w:t>
+              <w:t>iÉ(aaÉç) xmÉ×</w:t>
             </w:r>
             <w:r>
               <w:rPr>
@@ -10273,7 +13410,6 @@
               <w:lastRenderedPageBreak/>
               <w:t>(</w:t>
             </w:r>
-            <w:proofErr w:type="gramStart"/>
             <w:r>
               <w:rPr>
                 <w:rFonts w:cs="BRH Devanagari Extra"/>
@@ -10291,7 +13427,6 @@
               </w:rPr>
               <w:t>)[</w:t>
             </w:r>
-            <w:proofErr w:type="gramEnd"/>
             <w:r>
               <w:rPr>
                 <w:rFonts w:cs="BRH Devanagari Extra"/>
@@ -10627,7 +13762,6 @@
               </w:rPr>
               <w:t>(</w:t>
             </w:r>
-            <w:proofErr w:type="gramStart"/>
             <w:r>
               <w:rPr>
                 <w:rFonts w:cs="BRH Devanagari Extra"/>
@@ -10645,7 +13779,6 @@
               </w:rPr>
               <w:t>)[</w:t>
             </w:r>
-            <w:proofErr w:type="gramEnd"/>
             <w:r>
               <w:rPr>
                 <w:rFonts w:cs="BRH Devanagari Extra"/>
@@ -10804,6 +13937,7 @@
                 <w:szCs w:val="32"/>
                 <w:highlight w:val="green"/>
               </w:rPr>
+              <w:lastRenderedPageBreak/>
               <w:t>pÉ</w:t>
             </w:r>
             <w:r>
@@ -10910,17 +14044,7 @@
                 <w:sz w:val="32"/>
                 <w:szCs w:val="32"/>
               </w:rPr>
-              <w:t xml:space="preserve">iÉ(aaÉç) </w:t>
-            </w:r>
-            <w:r>
-              <w:rPr>
-                <w:rFonts w:ascii="BRH Devanagari Extra" w:hAnsi="BRH Devanagari Extra" w:cs="BRH Devanagari Extra"/>
-                <w:color w:val="000000"/>
-                <w:sz w:val="32"/>
-                <w:szCs w:val="32"/>
-              </w:rPr>
-              <w:lastRenderedPageBreak/>
-              <w:t>xmÉ×</w:t>
+              <w:t>iÉ(aaÉç) xmÉ×</w:t>
             </w:r>
             <w:r>
               <w:rPr>
@@ -11041,7 +14165,6 @@
               <w:lastRenderedPageBreak/>
               <w:t>(</w:t>
             </w:r>
-            <w:proofErr w:type="gramStart"/>
             <w:r>
               <w:rPr>
                 <w:rFonts w:cs="BRH Devanagari Extra"/>
@@ -11059,7 +14182,6 @@
               </w:rPr>
               <w:t>)[</w:t>
             </w:r>
-            <w:proofErr w:type="gramEnd"/>
             <w:r>
               <w:rPr>
                 <w:rFonts w:cs="BRH Devanagari Extra"/>
@@ -11324,7 +14446,6 @@
               </w:rPr>
               <w:t>(</w:t>
             </w:r>
-            <w:proofErr w:type="gramStart"/>
             <w:r>
               <w:rPr>
                 <w:rFonts w:cs="BRH Devanagari Extra"/>
@@ -11342,7 +14463,6 @@
               </w:rPr>
               <w:t>)[</w:t>
             </w:r>
-            <w:proofErr w:type="gramEnd"/>
             <w:r>
               <w:rPr>
                 <w:rFonts w:cs="BRH Devanagari Extra"/>
@@ -11622,7 +14742,6 @@
               </w:rPr>
               <w:t>(</w:t>
             </w:r>
-            <w:proofErr w:type="gramStart"/>
             <w:r>
               <w:rPr>
                 <w:rFonts w:cs="BRH Devanagari Extra"/>
@@ -11640,7 +14759,6 @@
               </w:rPr>
               <w:t>)[</w:t>
             </w:r>
-            <w:proofErr w:type="gramEnd"/>
             <w:r>
               <w:rPr>
                 <w:rFonts w:cs="BRH Devanagari Extra"/>
@@ -12082,7 +15200,6 @@
               </w:rPr>
               <w:t>(</w:t>
             </w:r>
-            <w:proofErr w:type="gramStart"/>
             <w:r>
               <w:rPr>
                 <w:rFonts w:cs="BRH Devanagari Extra"/>
@@ -12100,7 +15217,6 @@
               </w:rPr>
               <w:t>)[</w:t>
             </w:r>
-            <w:proofErr w:type="gramEnd"/>
             <w:r>
               <w:rPr>
                 <w:rFonts w:cs="BRH Devanagari Extra"/>
@@ -12547,7 +15663,6 @@
               </w:rPr>
               <w:t>(</w:t>
             </w:r>
-            <w:proofErr w:type="gramStart"/>
             <w:r>
               <w:rPr>
                 <w:rFonts w:cs="BRH Devanagari Extra"/>
@@ -12565,7 +15680,6 @@
               </w:rPr>
               <w:t>)[</w:t>
             </w:r>
-            <w:proofErr w:type="gramEnd"/>
             <w:r>
               <w:rPr>
                 <w:rFonts w:cs="BRH Devanagari Extra"/>
@@ -12762,7 +15876,6 @@
               </w:rPr>
               <w:t>(</w:t>
             </w:r>
-            <w:proofErr w:type="gramStart"/>
             <w:r>
               <w:rPr>
                 <w:rFonts w:cs="BRH Devanagari Extra"/>
@@ -12780,7 +15893,6 @@
               </w:rPr>
               <w:t>)[</w:t>
             </w:r>
-            <w:proofErr w:type="gramEnd"/>
             <w:r>
               <w:rPr>
                 <w:rFonts w:cs="BRH Devanagari Extra"/>
@@ -12991,7 +16103,6 @@
               </w:rPr>
               <w:t>(</w:t>
             </w:r>
-            <w:proofErr w:type="gramStart"/>
             <w:r>
               <w:rPr>
                 <w:rFonts w:cs="BRH Devanagari Extra"/>
@@ -13009,7 +16120,6 @@
               </w:rPr>
               <w:t>)[</w:t>
             </w:r>
-            <w:proofErr w:type="gramEnd"/>
             <w:r>
               <w:rPr>
                 <w:rFonts w:cs="BRH Devanagari Extra"/>
@@ -13494,7 +16604,6 @@
               </w:rPr>
               <w:t>(</w:t>
             </w:r>
-            <w:proofErr w:type="gramStart"/>
             <w:r>
               <w:rPr>
                 <w:rFonts w:cs="BRH Devanagari Extra"/>
@@ -13512,7 +16621,6 @@
               </w:rPr>
               <w:t>)[</w:t>
             </w:r>
-            <w:proofErr w:type="gramEnd"/>
             <w:r>
               <w:rPr>
                 <w:rFonts w:cs="BRH Devanagari Extra"/>
@@ -13955,7 +17063,6 @@
               <w:lastRenderedPageBreak/>
               <w:t>(</w:t>
             </w:r>
-            <w:proofErr w:type="gramStart"/>
             <w:r>
               <w:rPr>
                 <w:rFonts w:cs="BRH Devanagari Extra"/>
@@ -13973,7 +17080,6 @@
               </w:rPr>
               <w:t>)[</w:t>
             </w:r>
-            <w:proofErr w:type="gramEnd"/>
             <w:r>
               <w:rPr>
                 <w:rFonts w:cs="BRH Devanagari Extra"/>
@@ -14219,7 +17325,6 @@
               </w:rPr>
               <w:t>(</w:t>
             </w:r>
-            <w:proofErr w:type="gramStart"/>
             <w:r>
               <w:rPr>
                 <w:rFonts w:cs="BRH Devanagari Extra"/>
@@ -14237,7 +17342,6 @@
               </w:rPr>
               <w:t>)[</w:t>
             </w:r>
-            <w:proofErr w:type="gramEnd"/>
             <w:r>
               <w:rPr>
                 <w:rFonts w:cs="BRH Devanagari Extra"/>
@@ -14552,7 +17656,6 @@
               <w:lastRenderedPageBreak/>
               <w:t>(</w:t>
             </w:r>
-            <w:proofErr w:type="gramStart"/>
             <w:r>
               <w:rPr>
                 <w:rFonts w:cs="BRH Devanagari Extra"/>
@@ -14570,7 +17673,6 @@
               </w:rPr>
               <w:t>)[</w:t>
             </w:r>
-            <w:proofErr w:type="gramEnd"/>
             <w:r>
               <w:rPr>
                 <w:rFonts w:cs="BRH Devanagari Extra"/>
@@ -15004,7 +18106,6 @@
               </w:rPr>
               <w:t>(</w:t>
             </w:r>
-            <w:proofErr w:type="gramStart"/>
             <w:r>
               <w:rPr>
                 <w:rFonts w:cs="BRH Devanagari Extra"/>
@@ -15022,7 +18123,6 @@
               </w:rPr>
               <w:t>)[</w:t>
             </w:r>
-            <w:proofErr w:type="gramEnd"/>
             <w:r>
               <w:rPr>
                 <w:rFonts w:cs="BRH Devanagari Extra"/>
@@ -15431,7 +18531,6 @@
               <w:lastRenderedPageBreak/>
               <w:t>(</w:t>
             </w:r>
-            <w:proofErr w:type="gramStart"/>
             <w:r>
               <w:rPr>
                 <w:rFonts w:cs="BRH Devanagari Extra"/>
@@ -15449,7 +18548,6 @@
               </w:rPr>
               <w:t>)[</w:t>
             </w:r>
-            <w:proofErr w:type="gramEnd"/>
             <w:r>
               <w:rPr>
                 <w:rFonts w:cs="BRH Devanagari Extra"/>
@@ -15687,7 +18785,6 @@
               </w:rPr>
               <w:t>(</w:t>
             </w:r>
-            <w:proofErr w:type="gramStart"/>
             <w:r>
               <w:rPr>
                 <w:rFonts w:cs="BRH Devanagari Extra"/>
@@ -15705,7 +18802,6 @@
               </w:rPr>
               <w:t>)[</w:t>
             </w:r>
-            <w:proofErr w:type="gramEnd"/>
             <w:r>
               <w:rPr>
                 <w:rFonts w:cs="BRH Devanagari Extra"/>
@@ -16016,7 +19112,6 @@
               <w:lastRenderedPageBreak/>
               <w:t>(</w:t>
             </w:r>
-            <w:proofErr w:type="gramStart"/>
             <w:r>
               <w:rPr>
                 <w:rFonts w:cs="BRH Devanagari Extra"/>
@@ -16034,7 +19129,6 @@
               </w:rPr>
               <w:t>)[</w:t>
             </w:r>
-            <w:proofErr w:type="gramEnd"/>
             <w:r>
               <w:rPr>
                 <w:rFonts w:cs="BRH Devanagari Extra"/>
@@ -16381,7 +19475,6 @@
               </w:rPr>
               <w:t>(</w:t>
             </w:r>
-            <w:proofErr w:type="gramStart"/>
             <w:r>
               <w:rPr>
                 <w:rFonts w:cs="BRH Devanagari Extra"/>
@@ -16399,7 +19492,6 @@
               </w:rPr>
               <w:t>)[</w:t>
             </w:r>
-            <w:proofErr w:type="gramEnd"/>
             <w:r>
               <w:rPr>
                 <w:rFonts w:cs="BRH Devanagari Extra"/>
@@ -16734,7 +19826,6 @@
               </w:rPr>
               <w:t>(</w:t>
             </w:r>
-            <w:proofErr w:type="gramStart"/>
             <w:r>
               <w:rPr>
                 <w:rFonts w:cs="BRH Devanagari Extra"/>
@@ -16752,7 +19843,6 @@
               </w:rPr>
               <w:t>)[</w:t>
             </w:r>
-            <w:proofErr w:type="gramEnd"/>
             <w:r>
               <w:rPr>
                 <w:rFonts w:cs="BRH Devanagari Extra"/>
@@ -17107,7 +20197,6 @@
               </w:rPr>
               <w:t>(</w:t>
             </w:r>
-            <w:proofErr w:type="gramStart"/>
             <w:r>
               <w:rPr>
                 <w:rFonts w:cs="BRH Devanagari Extra"/>
@@ -17125,7 +20214,6 @@
               </w:rPr>
               <w:t>)[</w:t>
             </w:r>
-            <w:proofErr w:type="gramEnd"/>
             <w:r>
               <w:rPr>
                 <w:rFonts w:cs="BRH Devanagari Extra"/>
@@ -17502,7 +20590,6 @@
               </w:rPr>
               <w:t>(</w:t>
             </w:r>
-            <w:proofErr w:type="gramStart"/>
             <w:r>
               <w:rPr>
                 <w:rFonts w:cs="BRH Devanagari Extra"/>
@@ -17520,7 +20607,6 @@
               </w:rPr>
               <w:t>)[</w:t>
             </w:r>
-            <w:proofErr w:type="gramEnd"/>
             <w:r>
               <w:rPr>
                 <w:rFonts w:cs="BRH Devanagari Extra"/>
@@ -17851,21 +20937,6 @@
                 <w:szCs w:val="32"/>
               </w:rPr>
             </w:pPr>
-          </w:p>
-          <w:p>
-            <w:pPr>
-              <w:widowControl w:val="0"/>
-              <w:autoSpaceDE w:val="0"/>
-              <w:autoSpaceDN w:val="0"/>
-              <w:adjustRightInd w:val="0"/>
-              <w:spacing w:before="0" w:line="240" w:lineRule="auto"/>
-              <w:rPr>
-                <w:rFonts w:ascii="BRH Devanagari Extra" w:hAnsi="BRH Devanagari Extra" w:cs="BRH Devanagari Extra"/>
-                <w:color w:val="000000"/>
-                <w:sz w:val="32"/>
-                <w:szCs w:val="32"/>
-              </w:rPr>
-            </w:pPr>
             <w:r>
               <w:rPr>
                 <w:rFonts w:ascii="BRH Devanagari Extra" w:hAnsi="BRH Devanagari Extra" w:cs="BRH Devanagari Extra"/>
@@ -17876,7 +20947,6 @@
               <w:lastRenderedPageBreak/>
               <w:t>(</w:t>
             </w:r>
-            <w:proofErr w:type="gramStart"/>
             <w:r>
               <w:rPr>
                 <w:rFonts w:cs="BRH Devanagari Extra"/>
@@ -17894,7 +20964,6 @@
               </w:rPr>
               <w:t>)[</w:t>
             </w:r>
-            <w:proofErr w:type="gramEnd"/>
             <w:r>
               <w:rPr>
                 <w:rFonts w:cs="BRH Devanagari Extra"/>
@@ -18230,7 +21299,6 @@
               <w:lastRenderedPageBreak/>
               <w:t>(</w:t>
             </w:r>
-            <w:proofErr w:type="gramStart"/>
             <w:r>
               <w:rPr>
                 <w:rFonts w:cs="BRH Devanagari Extra"/>
@@ -18248,7 +21316,6 @@
               </w:rPr>
               <w:t>)[</w:t>
             </w:r>
-            <w:proofErr w:type="gramEnd"/>
             <w:r>
               <w:rPr>
                 <w:rFonts w:cs="BRH Devanagari Extra"/>
@@ -18597,21 +21664,6 @@
                 <w:szCs w:val="32"/>
               </w:rPr>
             </w:pPr>
-          </w:p>
-          <w:p>
-            <w:pPr>
-              <w:widowControl w:val="0"/>
-              <w:autoSpaceDE w:val="0"/>
-              <w:autoSpaceDN w:val="0"/>
-              <w:adjustRightInd w:val="0"/>
-              <w:spacing w:before="0" w:line="240" w:lineRule="auto"/>
-              <w:rPr>
-                <w:rFonts w:ascii="BRH Devanagari Extra" w:hAnsi="BRH Devanagari Extra" w:cs="BRH Devanagari Extra"/>
-                <w:color w:val="000000"/>
-                <w:sz w:val="32"/>
-                <w:szCs w:val="32"/>
-              </w:rPr>
-            </w:pPr>
             <w:r>
               <w:rPr>
                 <w:rFonts w:ascii="BRH Devanagari Extra" w:hAnsi="BRH Devanagari Extra" w:cs="BRH Devanagari Extra"/>
@@ -18622,7 +21674,6 @@
               <w:lastRenderedPageBreak/>
               <w:t>(</w:t>
             </w:r>
-            <w:proofErr w:type="gramStart"/>
             <w:r>
               <w:rPr>
                 <w:rFonts w:cs="BRH Devanagari Extra"/>
@@ -18640,7 +21691,6 @@
               </w:rPr>
               <w:t>)[</w:t>
             </w:r>
-            <w:proofErr w:type="gramEnd"/>
             <w:r>
               <w:rPr>
                 <w:rFonts w:cs="BRH Devanagari Extra"/>
@@ -19016,7 +22066,6 @@
               <w:lastRenderedPageBreak/>
               <w:t>(</w:t>
             </w:r>
-            <w:proofErr w:type="gramStart"/>
             <w:r>
               <w:rPr>
                 <w:rFonts w:cs="BRH Devanagari Extra"/>
@@ -19034,7 +22083,6 @@
               </w:rPr>
               <w:t>)[</w:t>
             </w:r>
-            <w:proofErr w:type="gramEnd"/>
             <w:r>
               <w:rPr>
                 <w:rFonts w:cs="BRH Devanagari Extra"/>
@@ -19282,7 +22330,6 @@
               </w:rPr>
               <w:t>(</w:t>
             </w:r>
-            <w:proofErr w:type="gramStart"/>
             <w:r>
               <w:rPr>
                 <w:rFonts w:cs="BRH Devanagari Extra"/>
@@ -19300,7 +22347,6 @@
               </w:rPr>
               <w:t>)[</w:t>
             </w:r>
-            <w:proofErr w:type="gramEnd"/>
             <w:r>
               <w:rPr>
                 <w:rFonts w:cs="BRH Devanagari Extra"/>
@@ -19553,7 +22599,6 @@
               </w:rPr>
               <w:t>(</w:t>
             </w:r>
-            <w:proofErr w:type="gramStart"/>
             <w:r>
               <w:rPr>
                 <w:rFonts w:cs="BRH Devanagari Extra"/>
@@ -19571,7 +22616,6 @@
               </w:rPr>
               <w:t>)[</w:t>
             </w:r>
-            <w:proofErr w:type="gramEnd"/>
             <w:r>
               <w:rPr>
                 <w:rFonts w:cs="BRH Devanagari Extra"/>
@@ -20080,7 +23124,6 @@
               </w:rPr>
               <w:t>(</w:t>
             </w:r>
-            <w:proofErr w:type="gramStart"/>
             <w:r>
               <w:rPr>
                 <w:rFonts w:cs="BRH Devanagari Extra"/>
@@ -20098,7 +23141,6 @@
               </w:rPr>
               <w:t>)[</w:t>
             </w:r>
-            <w:proofErr w:type="gramEnd"/>
             <w:r>
               <w:rPr>
                 <w:rFonts w:cs="BRH Devanagari Extra"/>
@@ -20649,7 +23691,6 @@
               </w:rPr>
               <w:t>(</w:t>
             </w:r>
-            <w:proofErr w:type="gramStart"/>
             <w:r>
               <w:rPr>
                 <w:rFonts w:cs="BRH Devanagari Extra"/>
@@ -20667,7 +23708,6 @@
               </w:rPr>
               <w:t>)[</w:t>
             </w:r>
-            <w:proofErr w:type="gramEnd"/>
             <w:r>
               <w:rPr>
                 <w:rFonts w:cs="BRH Devanagari Extra"/>
@@ -21240,7 +24280,6 @@
               <w:lastRenderedPageBreak/>
               <w:t>(</w:t>
             </w:r>
-            <w:proofErr w:type="gramStart"/>
             <w:r>
               <w:rPr>
                 <w:rFonts w:cs="BRH Devanagari Extra"/>
@@ -21258,7 +24297,6 @@
               </w:rPr>
               <w:t>)[</w:t>
             </w:r>
-            <w:proofErr w:type="gramEnd"/>
             <w:r>
               <w:rPr>
                 <w:rFonts w:cs="BRH Devanagari Extra"/>
@@ -21549,7 +24587,6 @@
               <w:lastRenderedPageBreak/>
               <w:t>(</w:t>
             </w:r>
-            <w:proofErr w:type="gramStart"/>
             <w:r>
               <w:rPr>
                 <w:rFonts w:cs="BRH Devanagari Extra"/>
@@ -21567,7 +24604,6 @@
               </w:rPr>
               <w:t>)[</w:t>
             </w:r>
-            <w:proofErr w:type="gramEnd"/>
             <w:r>
               <w:rPr>
                 <w:rFonts w:cs="BRH Devanagari Extra"/>
@@ -22264,7 +25300,6 @@
               </w:rPr>
               <w:t>(</w:t>
             </w:r>
-            <w:proofErr w:type="gramStart"/>
             <w:r>
               <w:rPr>
                 <w:rFonts w:cs="BRH Devanagari Extra"/>
@@ -22282,7 +25317,6 @@
               </w:rPr>
               <w:t>)[</w:t>
             </w:r>
-            <w:proofErr w:type="gramEnd"/>
             <w:r>
               <w:rPr>
                 <w:rFonts w:cs="BRH Devanagari Extra"/>
@@ -22921,7 +25955,6 @@
               </w:rPr>
               <w:t>(</w:t>
             </w:r>
-            <w:proofErr w:type="gramStart"/>
             <w:r>
               <w:rPr>
                 <w:rFonts w:cs="BRH Devanagari Extra"/>
@@ -22939,7 +25972,6 @@
               </w:rPr>
               <w:t>)[</w:t>
             </w:r>
-            <w:proofErr w:type="gramEnd"/>
             <w:r>
               <w:rPr>
                 <w:rFonts w:cs="BRH Devanagari Extra"/>
@@ -23443,7 +26475,6 @@
               <w:lastRenderedPageBreak/>
               <w:t>(</w:t>
             </w:r>
-            <w:proofErr w:type="gramStart"/>
             <w:r>
               <w:rPr>
                 <w:rFonts w:cs="BRH Devanagari Extra"/>
@@ -23461,7 +26492,6 @@
               </w:rPr>
               <w:t>)[</w:t>
             </w:r>
-            <w:proofErr w:type="gramEnd"/>
             <w:r>
               <w:rPr>
                 <w:rFonts w:cs="BRH Devanagari Extra"/>
@@ -23765,7 +26795,6 @@
               <w:lastRenderedPageBreak/>
               <w:t>(</w:t>
             </w:r>
-            <w:proofErr w:type="gramStart"/>
             <w:r>
               <w:rPr>
                 <w:rFonts w:cs="BRH Devanagari Extra"/>
@@ -23783,7 +26812,6 @@
               </w:rPr>
               <w:t>)[</w:t>
             </w:r>
-            <w:proofErr w:type="gramEnd"/>
             <w:r>
               <w:rPr>
                 <w:rFonts w:cs="BRH Devanagari Extra"/>
@@ -23997,7 +27025,6 @@
               </w:rPr>
               <w:t>(</w:t>
             </w:r>
-            <w:proofErr w:type="gramStart"/>
             <w:r>
               <w:rPr>
                 <w:rFonts w:cs="BRH Devanagari Extra"/>
@@ -24015,7 +27042,6 @@
               </w:rPr>
               <w:t>)[</w:t>
             </w:r>
-            <w:proofErr w:type="gramEnd"/>
             <w:r>
               <w:rPr>
                 <w:rFonts w:cs="BRH Devanagari Extra"/>
@@ -24234,7 +27260,6 @@
               </w:rPr>
               <w:t>(</w:t>
             </w:r>
-            <w:proofErr w:type="gramStart"/>
             <w:r>
               <w:rPr>
                 <w:rFonts w:cs="BRH Devanagari Extra"/>
@@ -24252,7 +27277,6 @@
               </w:rPr>
               <w:t>)[</w:t>
             </w:r>
-            <w:proofErr w:type="gramEnd"/>
             <w:r>
               <w:rPr>
                 <w:rFonts w:cs="BRH Devanagari Extra"/>
@@ -24500,7 +27524,6 @@
               </w:rPr>
               <w:t>(</w:t>
             </w:r>
-            <w:proofErr w:type="gramStart"/>
             <w:r>
               <w:rPr>
                 <w:rFonts w:cs="BRH Devanagari Extra"/>
@@ -24518,7 +27541,6 @@
               </w:rPr>
               <w:t>)[</w:t>
             </w:r>
-            <w:proofErr w:type="gramEnd"/>
             <w:r>
               <w:rPr>
                 <w:rFonts w:cs="BRH Devanagari Extra"/>
@@ -24771,7 +27793,6 @@
               </w:rPr>
               <w:t>(</w:t>
             </w:r>
-            <w:proofErr w:type="gramStart"/>
             <w:r>
               <w:rPr>
                 <w:rFonts w:cs="BRH Devanagari Extra"/>
@@ -24789,7 +27810,6 @@
               </w:rPr>
               <w:t>)[</w:t>
             </w:r>
-            <w:proofErr w:type="gramEnd"/>
             <w:r>
               <w:rPr>
                 <w:rFonts w:cs="BRH Devanagari Extra"/>
@@ -25117,7 +28137,6 @@
               </w:rPr>
               <w:t>(</w:t>
             </w:r>
-            <w:proofErr w:type="gramStart"/>
             <w:r>
               <w:rPr>
                 <w:rFonts w:cs="BRH Devanagari Extra"/>
@@ -25135,7 +28154,6 @@
               </w:rPr>
               <w:t>)[</w:t>
             </w:r>
-            <w:proofErr w:type="gramEnd"/>
             <w:r>
               <w:rPr>
                 <w:rFonts w:cs="BRH Devanagari Extra"/>
@@ -25468,7 +28486,6 @@
               </w:rPr>
               <w:t>(</w:t>
             </w:r>
-            <w:proofErr w:type="gramStart"/>
             <w:r>
               <w:rPr>
                 <w:rFonts w:cs="BRH Devanagari Extra"/>
@@ -25486,7 +28503,6 @@
               </w:rPr>
               <w:t>)[</w:t>
             </w:r>
-            <w:proofErr w:type="gramEnd"/>
             <w:r>
               <w:rPr>
                 <w:rFonts w:cs="BRH Devanagari Extra"/>
@@ -25879,7 +28895,6 @@
               </w:rPr>
               <w:t>(</w:t>
             </w:r>
-            <w:proofErr w:type="gramStart"/>
             <w:r>
               <w:rPr>
                 <w:rFonts w:cs="BRH Devanagari Extra"/>
@@ -25897,7 +28912,6 @@
               </w:rPr>
               <w:t>)[</w:t>
             </w:r>
-            <w:proofErr w:type="gramEnd"/>
             <w:r>
               <w:rPr>
                 <w:rFonts w:cs="BRH Devanagari Extra"/>
@@ -26230,7 +29244,17 @@
                 <w:sz w:val="32"/>
                 <w:szCs w:val="32"/>
               </w:rPr>
-              <w:t xml:space="preserve"> wuÉe</w:t>
+              <w:t xml:space="preserve"> </w:t>
+            </w:r>
+            <w:r>
+              <w:rPr>
+                <w:rFonts w:ascii="BRH Devanagari Extra" w:hAnsi="BRH Devanagari Extra" w:cs="BRH Devanagari Extra"/>
+                <w:color w:val="000000"/>
+                <w:sz w:val="32"/>
+                <w:szCs w:val="32"/>
+              </w:rPr>
+              <w:lastRenderedPageBreak/>
+              <w:t>wuÉe</w:t>
             </w:r>
             <w:r>
               <w:rPr>
@@ -26318,7 +29342,6 @@
               <w:lastRenderedPageBreak/>
               <w:t>(</w:t>
             </w:r>
-            <w:proofErr w:type="gramStart"/>
             <w:r>
               <w:rPr>
                 <w:rFonts w:cs="BRH Devanagari Extra"/>
@@ -26336,7 +29359,6 @@
               </w:rPr>
               <w:t>)[</w:t>
             </w:r>
-            <w:proofErr w:type="gramEnd"/>
             <w:r>
               <w:rPr>
                 <w:rFonts w:cs="BRH Devanagari Extra"/>
@@ -26729,7 +29751,6 @@
               </w:rPr>
               <w:t>(</w:t>
             </w:r>
-            <w:proofErr w:type="gramStart"/>
             <w:r>
               <w:rPr>
                 <w:rFonts w:cs="BRH Devanagari Extra"/>
@@ -26747,7 +29768,6 @@
               </w:rPr>
               <w:t>)[</w:t>
             </w:r>
-            <w:proofErr w:type="gramEnd"/>
             <w:r>
               <w:rPr>
                 <w:rFonts w:cs="BRH Devanagari Extra"/>
@@ -27080,7 +30100,17 @@
                 <w:sz w:val="32"/>
                 <w:szCs w:val="32"/>
               </w:rPr>
-              <w:t xml:space="preserve"> wuÉe</w:t>
+              <w:t xml:space="preserve"> </w:t>
+            </w:r>
+            <w:r>
+              <w:rPr>
+                <w:rFonts w:ascii="BRH Devanagari Extra" w:hAnsi="BRH Devanagari Extra" w:cs="BRH Devanagari Extra"/>
+                <w:color w:val="000000"/>
+                <w:sz w:val="32"/>
+                <w:szCs w:val="32"/>
+              </w:rPr>
+              <w:lastRenderedPageBreak/>
+              <w:t>wuÉe</w:t>
             </w:r>
             <w:r>
               <w:rPr>
@@ -27182,7 +30212,6 @@
               <w:lastRenderedPageBreak/>
               <w:t>(</w:t>
             </w:r>
-            <w:proofErr w:type="gramStart"/>
             <w:r>
               <w:rPr>
                 <w:rFonts w:cs="BRH Devanagari Extra"/>
@@ -27200,7 +30229,6 @@
               </w:rPr>
               <w:t>)[</w:t>
             </w:r>
-            <w:proofErr w:type="gramEnd"/>
             <w:r>
               <w:rPr>
                 <w:rFonts w:cs="BRH Devanagari Extra"/>
@@ -27682,7 +30710,6 @@
               </w:rPr>
               <w:t>(</w:t>
             </w:r>
-            <w:proofErr w:type="gramStart"/>
             <w:r>
               <w:rPr>
                 <w:rFonts w:cs="BRH Devanagari Extra"/>
@@ -27700,7 +30727,6 @@
               </w:rPr>
               <w:t>)[</w:t>
             </w:r>
-            <w:proofErr w:type="gramEnd"/>
             <w:r>
               <w:rPr>
                 <w:rFonts w:cs="BRH Devanagari Extra"/>
@@ -28176,7 +31202,6 @@
               </w:rPr>
               <w:t>(</w:t>
             </w:r>
-            <w:proofErr w:type="gramStart"/>
             <w:r>
               <w:rPr>
                 <w:rFonts w:cs="BRH Devanagari Extra"/>
@@ -28194,7 +31219,6 @@
               </w:rPr>
               <w:t>)[</w:t>
             </w:r>
-            <w:proofErr w:type="gramEnd"/>
             <w:r>
               <w:rPr>
                 <w:rFonts w:cs="BRH Devanagari Extra"/>
@@ -28637,7 +31661,6 @@
               </w:rPr>
               <w:t>(</w:t>
             </w:r>
-            <w:proofErr w:type="gramStart"/>
             <w:r>
               <w:rPr>
                 <w:rFonts w:cs="BRH Devanagari Extra"/>
@@ -28655,7 +31678,6 @@
               </w:rPr>
               <w:t>)[</w:t>
             </w:r>
-            <w:proofErr w:type="gramEnd"/>
             <w:r>
               <w:rPr>
                 <w:rFonts w:cs="BRH Devanagari Extra"/>
@@ -29163,7 +32185,6 @@
               </w:rPr>
               <w:t>(</w:t>
             </w:r>
-            <w:proofErr w:type="gramStart"/>
             <w:r>
               <w:rPr>
                 <w:rFonts w:cs="BRH Devanagari Extra"/>
@@ -29181,7 +32202,6 @@
               </w:rPr>
               <w:t>)[</w:t>
             </w:r>
-            <w:proofErr w:type="gramEnd"/>
             <w:r>
               <w:rPr>
                 <w:rFonts w:cs="BRH Devanagari Extra"/>
@@ -29669,7 +32689,6 @@
               </w:rPr>
               <w:t>(</w:t>
             </w:r>
-            <w:proofErr w:type="gramStart"/>
             <w:r>
               <w:rPr>
                 <w:rFonts w:cs="BRH Devanagari Extra"/>
@@ -29687,7 +32706,6 @@
               </w:rPr>
               <w:t>)[</w:t>
             </w:r>
-            <w:proofErr w:type="gramEnd"/>
             <w:r>
               <w:rPr>
                 <w:rFonts w:cs="BRH Devanagari Extra"/>
@@ -30675,7 +33693,7 @@
 </file>
 
 <file path=word/endnotes.xml><?xml version="1.0" encoding="utf-8"?>
-<w:endnotes xmlns:wpc="http://schemas.microsoft.com/office/word/2010/wordprocessingCanvas" xmlns:cx="http://schemas.microsoft.com/office/drawing/2014/chartex" xmlns:cx1="http://schemas.microsoft.com/office/drawing/2015/9/8/chartex" xmlns:cx2="http://schemas.microsoft.com/office/drawing/2015/10/21/chartex" xmlns:cx3="http://schemas.microsoft.com/office/drawing/2016/5/9/chartex" xmlns:cx4="http://schemas.microsoft.com/office/drawing/2016/5/10/chartex" xmlns:cx5="http://schemas.microsoft.com/office/drawing/2016/5/11/chartex" xmlns:cx6="http://schemas.microsoft.com/office/drawing/2016/5/12/chartex" xmlns:cx7="http://schemas.microsoft.com/office/drawing/2016/5/13/chartex" xmlns:cx8="http://schemas.microsoft.com/office/drawing/2016/5/14/chartex" xmlns:mc="http://schemas.openxmlformats.org/markup-compatibility/2006" xmlns:aink="http://schemas.microsoft.com/office/drawing/2016/ink" xmlns:am3d="http://schemas.microsoft.com/office/drawing/2017/model3d" xmlns:o="urn:schemas-microsoft-com:office:office" xmlns:oel="http://schemas.microsoft.com/office/2019/extlst" xmlns:r="http://schemas.openxmlformats.org/officeDocument/2006/relationships" xmlns:m="http://schemas.openxmlformats.org/officeDocument/2006/math" xmlns:v="urn:schemas-microsoft-com:vml" xmlns:wp14="http://schemas.microsoft.com/office/word/2010/wordprocessingDrawing" xmlns:wp="http://schemas.openxmlformats.org/drawingml/2006/wordprocessingDrawing" xmlns:w10="urn:schemas-microsoft-com:office:word" xmlns:w="http://schemas.openxmlformats.org/wordprocessingml/2006/main" xmlns:w14="http://schemas.microsoft.com/office/word/2010/wordml" xmlns:w15="http://schemas.microsoft.com/office/word/2012/wordml" xmlns:w16cex="http://schemas.microsoft.com/office/word/2018/wordml/cex" xmlns:w16cid="http://schemas.microsoft.com/office/word/2016/wordml/cid" xmlns:w16="http://schemas.microsoft.com/office/word/2018/wordml" xmlns:w16sdtdh="http://schemas.microsoft.com/office/word/2020/wordml/sdtdatahash" xmlns:w16se="http://schemas.microsoft.com/office/word/2015/wordml/symex" xmlns:wpg="http://schemas.microsoft.com/office/word/2010/wordprocessingGroup" xmlns:wpi="http://schemas.microsoft.com/office/word/2010/wordprocessingInk" xmlns:wne="http://schemas.microsoft.com/office/word/2006/wordml" xmlns:wps="http://schemas.microsoft.com/office/word/2010/wordprocessingShape" mc:Ignorable="w14 w15 w16se w16cid w16 w16cex w16sdtdh wp14">
+<w:endnotes xmlns:wpc="http://schemas.microsoft.com/office/word/2010/wordprocessingCanvas" xmlns:cx="http://schemas.microsoft.com/office/drawing/2014/chartex" xmlns:cx1="http://schemas.microsoft.com/office/drawing/2015/9/8/chartex" xmlns:cx2="http://schemas.microsoft.com/office/drawing/2015/10/21/chartex" xmlns:cx3="http://schemas.microsoft.com/office/drawing/2016/5/9/chartex" xmlns:cx4="http://schemas.microsoft.com/office/drawing/2016/5/10/chartex" xmlns:cx5="http://schemas.microsoft.com/office/drawing/2016/5/11/chartex" xmlns:cx6="http://schemas.microsoft.com/office/drawing/2016/5/12/chartex" xmlns:cx7="http://schemas.microsoft.com/office/drawing/2016/5/13/chartex" xmlns:cx8="http://schemas.microsoft.com/office/drawing/2016/5/14/chartex" xmlns:mc="http://schemas.openxmlformats.org/markup-compatibility/2006" xmlns:aink="http://schemas.microsoft.com/office/drawing/2016/ink" xmlns:am3d="http://schemas.microsoft.com/office/drawing/2017/model3d" xmlns:o="urn:schemas-microsoft-com:office:office" xmlns:oel="http://schemas.microsoft.com/office/2019/extlst" xmlns:r="http://schemas.openxmlformats.org/officeDocument/2006/relationships" xmlns:m="http://schemas.openxmlformats.org/officeDocument/2006/math" xmlns:v="urn:schemas-microsoft-com:vml" xmlns:wp14="http://schemas.microsoft.com/office/word/2010/wordprocessingDrawing" xmlns:wp="http://schemas.openxmlformats.org/drawingml/2006/wordprocessingDrawing" xmlns:w10="urn:schemas-microsoft-com:office:word" xmlns:w="http://schemas.openxmlformats.org/wordprocessingml/2006/main" xmlns:w14="http://schemas.microsoft.com/office/word/2010/wordml" xmlns:w15="http://schemas.microsoft.com/office/word/2012/wordml" xmlns:w16cex="http://schemas.microsoft.com/office/word/2018/wordml/cex" xmlns:w16cid="http://schemas.microsoft.com/office/word/2016/wordml/cid" xmlns:w16="http://schemas.microsoft.com/office/word/2018/wordml" xmlns:w16du="http://schemas.microsoft.com/office/word/2023/wordml/word16du" xmlns:w16sdtdh="http://schemas.microsoft.com/office/word/2020/wordml/sdtdatahash" xmlns:w16sdtfl="http://schemas.microsoft.com/office/word/2024/wordml/sdtformatlock" xmlns:w16se="http://schemas.microsoft.com/office/word/2015/wordml/symex" xmlns:wpg="http://schemas.microsoft.com/office/word/2010/wordprocessingGroup" xmlns:wpi="http://schemas.microsoft.com/office/word/2010/wordprocessingInk" xmlns:wne="http://schemas.microsoft.com/office/word/2006/wordml" xmlns:wps="http://schemas.microsoft.com/office/word/2010/wordprocessingShape" mc:Ignorable="w14 w15 w16se w16cid w16 w16cex w16sdtdh w16sdtfl w16du wp14">
   <w:endnote w:type="separator" w:id="-1">
     <w:p>
       <w:pPr>
@@ -30700,7 +33718,7 @@
 </file>
 
 <file path=word/footer1.xml><?xml version="1.0" encoding="utf-8"?>
-<w:ftr xmlns:wpc="http://schemas.microsoft.com/office/word/2010/wordprocessingCanvas" xmlns:cx="http://schemas.microsoft.com/office/drawing/2014/chartex" xmlns:cx1="http://schemas.microsoft.com/office/drawing/2015/9/8/chartex" xmlns:cx2="http://schemas.microsoft.com/office/drawing/2015/10/21/chartex" xmlns:cx3="http://schemas.microsoft.com/office/drawing/2016/5/9/chartex" xmlns:cx4="http://schemas.microsoft.com/office/drawing/2016/5/10/chartex" xmlns:cx5="http://schemas.microsoft.com/office/drawing/2016/5/11/chartex" xmlns:cx6="http://schemas.microsoft.com/office/drawing/2016/5/12/chartex" xmlns:cx7="http://schemas.microsoft.com/office/drawing/2016/5/13/chartex" xmlns:cx8="http://schemas.microsoft.com/office/drawing/2016/5/14/chartex" xmlns:mc="http://schemas.openxmlformats.org/markup-compatibility/2006" xmlns:aink="http://schemas.microsoft.com/office/drawing/2016/ink" xmlns:am3d="http://schemas.microsoft.com/office/drawing/2017/model3d" xmlns:o="urn:schemas-microsoft-com:office:office" xmlns:oel="http://schemas.microsoft.com/office/2019/extlst" xmlns:r="http://schemas.openxmlformats.org/officeDocument/2006/relationships" xmlns:m="http://schemas.openxmlformats.org/officeDocument/2006/math" xmlns:v="urn:schemas-microsoft-com:vml" xmlns:wp14="http://schemas.microsoft.com/office/word/2010/wordprocessingDrawing" xmlns:wp="http://schemas.openxmlformats.org/drawingml/2006/wordprocessingDrawing" xmlns:w10="urn:schemas-microsoft-com:office:word" xmlns:w="http://schemas.openxmlformats.org/wordprocessingml/2006/main" xmlns:w14="http://schemas.microsoft.com/office/word/2010/wordml" xmlns:w15="http://schemas.microsoft.com/office/word/2012/wordml" xmlns:w16cex="http://schemas.microsoft.com/office/word/2018/wordml/cex" xmlns:w16cid="http://schemas.microsoft.com/office/word/2016/wordml/cid" xmlns:w16="http://schemas.microsoft.com/office/word/2018/wordml" xmlns:w16sdtdh="http://schemas.microsoft.com/office/word/2020/wordml/sdtdatahash" xmlns:w16se="http://schemas.microsoft.com/office/word/2015/wordml/symex" xmlns:wpg="http://schemas.microsoft.com/office/word/2010/wordprocessingGroup" xmlns:wpi="http://schemas.microsoft.com/office/word/2010/wordprocessingInk" xmlns:wne="http://schemas.microsoft.com/office/word/2006/wordml" xmlns:wps="http://schemas.microsoft.com/office/word/2010/wordprocessingShape" mc:Ignorable="w14 w15 w16se w16cid w16 w16cex w16sdtdh wp14">
+<w:ftr xmlns:wpc="http://schemas.microsoft.com/office/word/2010/wordprocessingCanvas" xmlns:cx="http://schemas.microsoft.com/office/drawing/2014/chartex" xmlns:cx1="http://schemas.microsoft.com/office/drawing/2015/9/8/chartex" xmlns:cx2="http://schemas.microsoft.com/office/drawing/2015/10/21/chartex" xmlns:cx3="http://schemas.microsoft.com/office/drawing/2016/5/9/chartex" xmlns:cx4="http://schemas.microsoft.com/office/drawing/2016/5/10/chartex" xmlns:cx5="http://schemas.microsoft.com/office/drawing/2016/5/11/chartex" xmlns:cx6="http://schemas.microsoft.com/office/drawing/2016/5/12/chartex" xmlns:cx7="http://schemas.microsoft.com/office/drawing/2016/5/13/chartex" xmlns:cx8="http://schemas.microsoft.com/office/drawing/2016/5/14/chartex" xmlns:mc="http://schemas.openxmlformats.org/markup-compatibility/2006" xmlns:aink="http://schemas.microsoft.com/office/drawing/2016/ink" xmlns:am3d="http://schemas.microsoft.com/office/drawing/2017/model3d" xmlns:o="urn:schemas-microsoft-com:office:office" xmlns:oel="http://schemas.microsoft.com/office/2019/extlst" xmlns:r="http://schemas.openxmlformats.org/officeDocument/2006/relationships" xmlns:m="http://schemas.openxmlformats.org/officeDocument/2006/math" xmlns:v="urn:schemas-microsoft-com:vml" xmlns:wp14="http://schemas.microsoft.com/office/word/2010/wordprocessingDrawing" xmlns:wp="http://schemas.openxmlformats.org/drawingml/2006/wordprocessingDrawing" xmlns:w10="urn:schemas-microsoft-com:office:word" xmlns:w="http://schemas.openxmlformats.org/wordprocessingml/2006/main" xmlns:w14="http://schemas.microsoft.com/office/word/2010/wordml" xmlns:w15="http://schemas.microsoft.com/office/word/2012/wordml" xmlns:w16cex="http://schemas.microsoft.com/office/word/2018/wordml/cex" xmlns:w16cid="http://schemas.microsoft.com/office/word/2016/wordml/cid" xmlns:w16="http://schemas.microsoft.com/office/word/2018/wordml" xmlns:w16du="http://schemas.microsoft.com/office/word/2023/wordml/word16du" xmlns:w16sdtdh="http://schemas.microsoft.com/office/word/2020/wordml/sdtdatahash" xmlns:w16sdtfl="http://schemas.microsoft.com/office/word/2024/wordml/sdtformatlock" xmlns:w16se="http://schemas.microsoft.com/office/word/2015/wordml/symex" xmlns:wpg="http://schemas.microsoft.com/office/word/2010/wordprocessingGroup" xmlns:wpi="http://schemas.microsoft.com/office/word/2010/wordprocessingInk" xmlns:wne="http://schemas.microsoft.com/office/word/2006/wordml" xmlns:wps="http://schemas.microsoft.com/office/word/2010/wordprocessingShape" mc:Ignorable="w14 w15 w16se w16cid w16 w16cex w16sdtdh w16sdtfl w16du wp14">
   <w:p>
     <w:pPr>
       <w:pBdr>
@@ -30882,7 +33900,7 @@
 </file>
 
 <file path=word/footer2.xml><?xml version="1.0" encoding="utf-8"?>
-<w:ftr xmlns:wpc="http://schemas.microsoft.com/office/word/2010/wordprocessingCanvas" xmlns:cx="http://schemas.microsoft.com/office/drawing/2014/chartex" xmlns:cx1="http://schemas.microsoft.com/office/drawing/2015/9/8/chartex" xmlns:cx2="http://schemas.microsoft.com/office/drawing/2015/10/21/chartex" xmlns:cx3="http://schemas.microsoft.com/office/drawing/2016/5/9/chartex" xmlns:cx4="http://schemas.microsoft.com/office/drawing/2016/5/10/chartex" xmlns:cx5="http://schemas.microsoft.com/office/drawing/2016/5/11/chartex" xmlns:cx6="http://schemas.microsoft.com/office/drawing/2016/5/12/chartex" xmlns:cx7="http://schemas.microsoft.com/office/drawing/2016/5/13/chartex" xmlns:cx8="http://schemas.microsoft.com/office/drawing/2016/5/14/chartex" xmlns:mc="http://schemas.openxmlformats.org/markup-compatibility/2006" xmlns:aink="http://schemas.microsoft.com/office/drawing/2016/ink" xmlns:am3d="http://schemas.microsoft.com/office/drawing/2017/model3d" xmlns:o="urn:schemas-microsoft-com:office:office" xmlns:oel="http://schemas.microsoft.com/office/2019/extlst" xmlns:r="http://schemas.openxmlformats.org/officeDocument/2006/relationships" xmlns:m="http://schemas.openxmlformats.org/officeDocument/2006/math" xmlns:v="urn:schemas-microsoft-com:vml" xmlns:wp14="http://schemas.microsoft.com/office/word/2010/wordprocessingDrawing" xmlns:wp="http://schemas.openxmlformats.org/drawingml/2006/wordprocessingDrawing" xmlns:w10="urn:schemas-microsoft-com:office:word" xmlns:w="http://schemas.openxmlformats.org/wordprocessingml/2006/main" xmlns:w14="http://schemas.microsoft.com/office/word/2010/wordml" xmlns:w15="http://schemas.microsoft.com/office/word/2012/wordml" xmlns:w16cex="http://schemas.microsoft.com/office/word/2018/wordml/cex" xmlns:w16cid="http://schemas.microsoft.com/office/word/2016/wordml/cid" xmlns:w16="http://schemas.microsoft.com/office/word/2018/wordml" xmlns:w16sdtdh="http://schemas.microsoft.com/office/word/2020/wordml/sdtdatahash" xmlns:w16se="http://schemas.microsoft.com/office/word/2015/wordml/symex" xmlns:wpg="http://schemas.microsoft.com/office/word/2010/wordprocessingGroup" xmlns:wpi="http://schemas.microsoft.com/office/word/2010/wordprocessingInk" xmlns:wne="http://schemas.microsoft.com/office/word/2006/wordml" xmlns:wps="http://schemas.microsoft.com/office/word/2010/wordprocessingShape" mc:Ignorable="w14 w15 w16se w16cid w16 w16cex w16sdtdh wp14">
+<w:ftr xmlns:wpc="http://schemas.microsoft.com/office/word/2010/wordprocessingCanvas" xmlns:cx="http://schemas.microsoft.com/office/drawing/2014/chartex" xmlns:cx1="http://schemas.microsoft.com/office/drawing/2015/9/8/chartex" xmlns:cx2="http://schemas.microsoft.com/office/drawing/2015/10/21/chartex" xmlns:cx3="http://schemas.microsoft.com/office/drawing/2016/5/9/chartex" xmlns:cx4="http://schemas.microsoft.com/office/drawing/2016/5/10/chartex" xmlns:cx5="http://schemas.microsoft.com/office/drawing/2016/5/11/chartex" xmlns:cx6="http://schemas.microsoft.com/office/drawing/2016/5/12/chartex" xmlns:cx7="http://schemas.microsoft.com/office/drawing/2016/5/13/chartex" xmlns:cx8="http://schemas.microsoft.com/office/drawing/2016/5/14/chartex" xmlns:mc="http://schemas.openxmlformats.org/markup-compatibility/2006" xmlns:aink="http://schemas.microsoft.com/office/drawing/2016/ink" xmlns:am3d="http://schemas.microsoft.com/office/drawing/2017/model3d" xmlns:o="urn:schemas-microsoft-com:office:office" xmlns:oel="http://schemas.microsoft.com/office/2019/extlst" xmlns:r="http://schemas.openxmlformats.org/officeDocument/2006/relationships" xmlns:m="http://schemas.openxmlformats.org/officeDocument/2006/math" xmlns:v="urn:schemas-microsoft-com:vml" xmlns:wp14="http://schemas.microsoft.com/office/word/2010/wordprocessingDrawing" xmlns:wp="http://schemas.openxmlformats.org/drawingml/2006/wordprocessingDrawing" xmlns:w10="urn:schemas-microsoft-com:office:word" xmlns:w="http://schemas.openxmlformats.org/wordprocessingml/2006/main" xmlns:w14="http://schemas.microsoft.com/office/word/2010/wordml" xmlns:w15="http://schemas.microsoft.com/office/word/2012/wordml" xmlns:w16cex="http://schemas.microsoft.com/office/word/2018/wordml/cex" xmlns:w16cid="http://schemas.microsoft.com/office/word/2016/wordml/cid" xmlns:w16="http://schemas.microsoft.com/office/word/2018/wordml" xmlns:w16du="http://schemas.microsoft.com/office/word/2023/wordml/word16du" xmlns:w16sdtdh="http://schemas.microsoft.com/office/word/2020/wordml/sdtdatahash" xmlns:w16sdtfl="http://schemas.microsoft.com/office/word/2024/wordml/sdtformatlock" xmlns:w16se="http://schemas.microsoft.com/office/word/2015/wordml/symex" xmlns:wpg="http://schemas.microsoft.com/office/word/2010/wordprocessingGroup" xmlns:wpi="http://schemas.microsoft.com/office/word/2010/wordprocessingInk" xmlns:wne="http://schemas.microsoft.com/office/word/2006/wordml" xmlns:wps="http://schemas.microsoft.com/office/word/2010/wordprocessingShape" mc:Ignorable="w14 w15 w16se w16cid w16 w16cex w16sdtdh w16sdtfl w16du wp14">
   <w:p>
     <w:pPr>
       <w:pBdr>
@@ -31088,7 +34106,7 @@
 </file>
 
 <file path=word/footnotes.xml><?xml version="1.0" encoding="utf-8"?>
-<w:footnotes xmlns:wpc="http://schemas.microsoft.com/office/word/2010/wordprocessingCanvas" xmlns:cx="http://schemas.microsoft.com/office/drawing/2014/chartex" xmlns:cx1="http://schemas.microsoft.com/office/drawing/2015/9/8/chartex" xmlns:cx2="http://schemas.microsoft.com/office/drawing/2015/10/21/chartex" xmlns:cx3="http://schemas.microsoft.com/office/drawing/2016/5/9/chartex" xmlns:cx4="http://schemas.microsoft.com/office/drawing/2016/5/10/chartex" xmlns:cx5="http://schemas.microsoft.com/office/drawing/2016/5/11/chartex" xmlns:cx6="http://schemas.microsoft.com/office/drawing/2016/5/12/chartex" xmlns:cx7="http://schemas.microsoft.com/office/drawing/2016/5/13/chartex" xmlns:cx8="http://schemas.microsoft.com/office/drawing/2016/5/14/chartex" xmlns:mc="http://schemas.openxmlformats.org/markup-compatibility/2006" xmlns:aink="http://schemas.microsoft.com/office/drawing/2016/ink" xmlns:am3d="http://schemas.microsoft.com/office/drawing/2017/model3d" xmlns:o="urn:schemas-microsoft-com:office:office" xmlns:oel="http://schemas.microsoft.com/office/2019/extlst" xmlns:r="http://schemas.openxmlformats.org/officeDocument/2006/relationships" xmlns:m="http://schemas.openxmlformats.org/officeDocument/2006/math" xmlns:v="urn:schemas-microsoft-com:vml" xmlns:wp14="http://schemas.microsoft.com/office/word/2010/wordprocessingDrawing" xmlns:wp="http://schemas.openxmlformats.org/drawingml/2006/wordprocessingDrawing" xmlns:w10="urn:schemas-microsoft-com:office:word" xmlns:w="http://schemas.openxmlformats.org/wordprocessingml/2006/main" xmlns:w14="http://schemas.microsoft.com/office/word/2010/wordml" xmlns:w15="http://schemas.microsoft.com/office/word/2012/wordml" xmlns:w16cex="http://schemas.microsoft.com/office/word/2018/wordml/cex" xmlns:w16cid="http://schemas.microsoft.com/office/word/2016/wordml/cid" xmlns:w16="http://schemas.microsoft.com/office/word/2018/wordml" xmlns:w16sdtdh="http://schemas.microsoft.com/office/word/2020/wordml/sdtdatahash" xmlns:w16se="http://schemas.microsoft.com/office/word/2015/wordml/symex" xmlns:wpg="http://schemas.microsoft.com/office/word/2010/wordprocessingGroup" xmlns:wpi="http://schemas.microsoft.com/office/word/2010/wordprocessingInk" xmlns:wne="http://schemas.microsoft.com/office/word/2006/wordml" xmlns:wps="http://schemas.microsoft.com/office/word/2010/wordprocessingShape" mc:Ignorable="w14 w15 w16se w16cid w16 w16cex w16sdtdh wp14">
+<w:footnotes xmlns:wpc="http://schemas.microsoft.com/office/word/2010/wordprocessingCanvas" xmlns:cx="http://schemas.microsoft.com/office/drawing/2014/chartex" xmlns:cx1="http://schemas.microsoft.com/office/drawing/2015/9/8/chartex" xmlns:cx2="http://schemas.microsoft.com/office/drawing/2015/10/21/chartex" xmlns:cx3="http://schemas.microsoft.com/office/drawing/2016/5/9/chartex" xmlns:cx4="http://schemas.microsoft.com/office/drawing/2016/5/10/chartex" xmlns:cx5="http://schemas.microsoft.com/office/drawing/2016/5/11/chartex" xmlns:cx6="http://schemas.microsoft.com/office/drawing/2016/5/12/chartex" xmlns:cx7="http://schemas.microsoft.com/office/drawing/2016/5/13/chartex" xmlns:cx8="http://schemas.microsoft.com/office/drawing/2016/5/14/chartex" xmlns:mc="http://schemas.openxmlformats.org/markup-compatibility/2006" xmlns:aink="http://schemas.microsoft.com/office/drawing/2016/ink" xmlns:am3d="http://schemas.microsoft.com/office/drawing/2017/model3d" xmlns:o="urn:schemas-microsoft-com:office:office" xmlns:oel="http://schemas.microsoft.com/office/2019/extlst" xmlns:r="http://schemas.openxmlformats.org/officeDocument/2006/relationships" xmlns:m="http://schemas.openxmlformats.org/officeDocument/2006/math" xmlns:v="urn:schemas-microsoft-com:vml" xmlns:wp14="http://schemas.microsoft.com/office/word/2010/wordprocessingDrawing" xmlns:wp="http://schemas.openxmlformats.org/drawingml/2006/wordprocessingDrawing" xmlns:w10="urn:schemas-microsoft-com:office:word" xmlns:w="http://schemas.openxmlformats.org/wordprocessingml/2006/main" xmlns:w14="http://schemas.microsoft.com/office/word/2010/wordml" xmlns:w15="http://schemas.microsoft.com/office/word/2012/wordml" xmlns:w16cex="http://schemas.microsoft.com/office/word/2018/wordml/cex" xmlns:w16cid="http://schemas.microsoft.com/office/word/2016/wordml/cid" xmlns:w16="http://schemas.microsoft.com/office/word/2018/wordml" xmlns:w16du="http://schemas.microsoft.com/office/word/2023/wordml/word16du" xmlns:w16sdtdh="http://schemas.microsoft.com/office/word/2020/wordml/sdtdatahash" xmlns:w16sdtfl="http://schemas.microsoft.com/office/word/2024/wordml/sdtformatlock" xmlns:w16se="http://schemas.microsoft.com/office/word/2015/wordml/symex" xmlns:wpg="http://schemas.microsoft.com/office/word/2010/wordprocessingGroup" xmlns:wpi="http://schemas.microsoft.com/office/word/2010/wordprocessingInk" xmlns:wne="http://schemas.microsoft.com/office/word/2006/wordml" xmlns:wps="http://schemas.microsoft.com/office/word/2010/wordprocessingShape" mc:Ignorable="w14 w15 w16se w16cid w16 w16cex w16sdtdh w16sdtfl w16du wp14">
   <w:footnote w:type="separator" w:id="-1">
     <w:p>
       <w:pPr>
@@ -31113,7 +34131,7 @@
 </file>
 
 <file path=word/header1.xml><?xml version="1.0" encoding="utf-8"?>
-<w:hdr xmlns:wpc="http://schemas.microsoft.com/office/word/2010/wordprocessingCanvas" xmlns:cx="http://schemas.microsoft.com/office/drawing/2014/chartex" xmlns:cx1="http://schemas.microsoft.com/office/drawing/2015/9/8/chartex" xmlns:cx2="http://schemas.microsoft.com/office/drawing/2015/10/21/chartex" xmlns:cx3="http://schemas.microsoft.com/office/drawing/2016/5/9/chartex" xmlns:cx4="http://schemas.microsoft.com/office/drawing/2016/5/10/chartex" xmlns:cx5="http://schemas.microsoft.com/office/drawing/2016/5/11/chartex" xmlns:cx6="http://schemas.microsoft.com/office/drawing/2016/5/12/chartex" xmlns:cx7="http://schemas.microsoft.com/office/drawing/2016/5/13/chartex" xmlns:cx8="http://schemas.microsoft.com/office/drawing/2016/5/14/chartex" xmlns:mc="http://schemas.openxmlformats.org/markup-compatibility/2006" xmlns:aink="http://schemas.microsoft.com/office/drawing/2016/ink" xmlns:am3d="http://schemas.microsoft.com/office/drawing/2017/model3d" xmlns:o="urn:schemas-microsoft-com:office:office" xmlns:oel="http://schemas.microsoft.com/office/2019/extlst" xmlns:r="http://schemas.openxmlformats.org/officeDocument/2006/relationships" xmlns:m="http://schemas.openxmlformats.org/officeDocument/2006/math" xmlns:v="urn:schemas-microsoft-com:vml" xmlns:wp14="http://schemas.microsoft.com/office/word/2010/wordprocessingDrawing" xmlns:wp="http://schemas.openxmlformats.org/drawingml/2006/wordprocessingDrawing" xmlns:w10="urn:schemas-microsoft-com:office:word" xmlns:w="http://schemas.openxmlformats.org/wordprocessingml/2006/main" xmlns:w14="http://schemas.microsoft.com/office/word/2010/wordml" xmlns:w15="http://schemas.microsoft.com/office/word/2012/wordml" xmlns:w16cex="http://schemas.microsoft.com/office/word/2018/wordml/cex" xmlns:w16cid="http://schemas.microsoft.com/office/word/2016/wordml/cid" xmlns:w16="http://schemas.microsoft.com/office/word/2018/wordml" xmlns:w16sdtdh="http://schemas.microsoft.com/office/word/2020/wordml/sdtdatahash" xmlns:w16se="http://schemas.microsoft.com/office/word/2015/wordml/symex" xmlns:wpg="http://schemas.microsoft.com/office/word/2010/wordprocessingGroup" xmlns:wpi="http://schemas.microsoft.com/office/word/2010/wordprocessingInk" xmlns:wne="http://schemas.microsoft.com/office/word/2006/wordml" xmlns:wps="http://schemas.microsoft.com/office/word/2010/wordprocessingShape" mc:Ignorable="w14 w15 w16se w16cid w16 w16cex w16sdtdh wp14">
+<w:hdr xmlns:wpc="http://schemas.microsoft.com/office/word/2010/wordprocessingCanvas" xmlns:cx="http://schemas.microsoft.com/office/drawing/2014/chartex" xmlns:cx1="http://schemas.microsoft.com/office/drawing/2015/9/8/chartex" xmlns:cx2="http://schemas.microsoft.com/office/drawing/2015/10/21/chartex" xmlns:cx3="http://schemas.microsoft.com/office/drawing/2016/5/9/chartex" xmlns:cx4="http://schemas.microsoft.com/office/drawing/2016/5/10/chartex" xmlns:cx5="http://schemas.microsoft.com/office/drawing/2016/5/11/chartex" xmlns:cx6="http://schemas.microsoft.com/office/drawing/2016/5/12/chartex" xmlns:cx7="http://schemas.microsoft.com/office/drawing/2016/5/13/chartex" xmlns:cx8="http://schemas.microsoft.com/office/drawing/2016/5/14/chartex" xmlns:mc="http://schemas.openxmlformats.org/markup-compatibility/2006" xmlns:aink="http://schemas.microsoft.com/office/drawing/2016/ink" xmlns:am3d="http://schemas.microsoft.com/office/drawing/2017/model3d" xmlns:o="urn:schemas-microsoft-com:office:office" xmlns:oel="http://schemas.microsoft.com/office/2019/extlst" xmlns:r="http://schemas.openxmlformats.org/officeDocument/2006/relationships" xmlns:m="http://schemas.openxmlformats.org/officeDocument/2006/math" xmlns:v="urn:schemas-microsoft-com:vml" xmlns:wp14="http://schemas.microsoft.com/office/word/2010/wordprocessingDrawing" xmlns:wp="http://schemas.openxmlformats.org/drawingml/2006/wordprocessingDrawing" xmlns:w10="urn:schemas-microsoft-com:office:word" xmlns:w="http://schemas.openxmlformats.org/wordprocessingml/2006/main" xmlns:w14="http://schemas.microsoft.com/office/word/2010/wordml" xmlns:w15="http://schemas.microsoft.com/office/word/2012/wordml" xmlns:w16cex="http://schemas.microsoft.com/office/word/2018/wordml/cex" xmlns:w16cid="http://schemas.microsoft.com/office/word/2016/wordml/cid" xmlns:w16="http://schemas.microsoft.com/office/word/2018/wordml" xmlns:w16du="http://schemas.microsoft.com/office/word/2023/wordml/word16du" xmlns:w16sdtdh="http://schemas.microsoft.com/office/word/2020/wordml/sdtdatahash" xmlns:w16sdtfl="http://schemas.microsoft.com/office/word/2024/wordml/sdtformatlock" xmlns:w16se="http://schemas.microsoft.com/office/word/2015/wordml/symex" xmlns:wpg="http://schemas.microsoft.com/office/word/2010/wordprocessingGroup" xmlns:wpi="http://schemas.microsoft.com/office/word/2010/wordprocessingInk" xmlns:wne="http://schemas.microsoft.com/office/word/2006/wordml" xmlns:wps="http://schemas.microsoft.com/office/word/2010/wordprocessingShape" mc:Ignorable="w14 w15 w16se w16cid w16 w16cex w16sdtdh w16sdtfl w16du wp14">
   <w:p>
     <w:pPr>
       <w:pStyle w:val="Header"/>
@@ -31134,7 +34152,7 @@
 </file>
 
 <file path=word/header2.xml><?xml version="1.0" encoding="utf-8"?>
-<w:hdr xmlns:wpc="http://schemas.microsoft.com/office/word/2010/wordprocessingCanvas" xmlns:cx="http://schemas.microsoft.com/office/drawing/2014/chartex" xmlns:cx1="http://schemas.microsoft.com/office/drawing/2015/9/8/chartex" xmlns:cx2="http://schemas.microsoft.com/office/drawing/2015/10/21/chartex" xmlns:cx3="http://schemas.microsoft.com/office/drawing/2016/5/9/chartex" xmlns:cx4="http://schemas.microsoft.com/office/drawing/2016/5/10/chartex" xmlns:cx5="http://schemas.microsoft.com/office/drawing/2016/5/11/chartex" xmlns:cx6="http://schemas.microsoft.com/office/drawing/2016/5/12/chartex" xmlns:cx7="http://schemas.microsoft.com/office/drawing/2016/5/13/chartex" xmlns:cx8="http://schemas.microsoft.com/office/drawing/2016/5/14/chartex" xmlns:mc="http://schemas.openxmlformats.org/markup-compatibility/2006" xmlns:aink="http://schemas.microsoft.com/office/drawing/2016/ink" xmlns:am3d="http://schemas.microsoft.com/office/drawing/2017/model3d" xmlns:o="urn:schemas-microsoft-com:office:office" xmlns:oel="http://schemas.microsoft.com/office/2019/extlst" xmlns:r="http://schemas.openxmlformats.org/officeDocument/2006/relationships" xmlns:m="http://schemas.openxmlformats.org/officeDocument/2006/math" xmlns:v="urn:schemas-microsoft-com:vml" xmlns:wp14="http://schemas.microsoft.com/office/word/2010/wordprocessingDrawing" xmlns:wp="http://schemas.openxmlformats.org/drawingml/2006/wordprocessingDrawing" xmlns:w10="urn:schemas-microsoft-com:office:word" xmlns:w="http://schemas.openxmlformats.org/wordprocessingml/2006/main" xmlns:w14="http://schemas.microsoft.com/office/word/2010/wordml" xmlns:w15="http://schemas.microsoft.com/office/word/2012/wordml" xmlns:w16cex="http://schemas.microsoft.com/office/word/2018/wordml/cex" xmlns:w16cid="http://schemas.microsoft.com/office/word/2016/wordml/cid" xmlns:w16="http://schemas.microsoft.com/office/word/2018/wordml" xmlns:w16sdtdh="http://schemas.microsoft.com/office/word/2020/wordml/sdtdatahash" xmlns:w16se="http://schemas.microsoft.com/office/word/2015/wordml/symex" xmlns:wpg="http://schemas.microsoft.com/office/word/2010/wordprocessingGroup" xmlns:wpi="http://schemas.microsoft.com/office/word/2010/wordprocessingInk" xmlns:wne="http://schemas.microsoft.com/office/word/2006/wordml" xmlns:wps="http://schemas.microsoft.com/office/word/2010/wordprocessingShape" mc:Ignorable="w14 w15 w16se w16cid w16 w16cex w16sdtdh wp14">
+<w:hdr xmlns:wpc="http://schemas.microsoft.com/office/word/2010/wordprocessingCanvas" xmlns:cx="http://schemas.microsoft.com/office/drawing/2014/chartex" xmlns:cx1="http://schemas.microsoft.com/office/drawing/2015/9/8/chartex" xmlns:cx2="http://schemas.microsoft.com/office/drawing/2015/10/21/chartex" xmlns:cx3="http://schemas.microsoft.com/office/drawing/2016/5/9/chartex" xmlns:cx4="http://schemas.microsoft.com/office/drawing/2016/5/10/chartex" xmlns:cx5="http://schemas.microsoft.com/office/drawing/2016/5/11/chartex" xmlns:cx6="http://schemas.microsoft.com/office/drawing/2016/5/12/chartex" xmlns:cx7="http://schemas.microsoft.com/office/drawing/2016/5/13/chartex" xmlns:cx8="http://schemas.microsoft.com/office/drawing/2016/5/14/chartex" xmlns:mc="http://schemas.openxmlformats.org/markup-compatibility/2006" xmlns:aink="http://schemas.microsoft.com/office/drawing/2016/ink" xmlns:am3d="http://schemas.microsoft.com/office/drawing/2017/model3d" xmlns:o="urn:schemas-microsoft-com:office:office" xmlns:oel="http://schemas.microsoft.com/office/2019/extlst" xmlns:r="http://schemas.openxmlformats.org/officeDocument/2006/relationships" xmlns:m="http://schemas.openxmlformats.org/officeDocument/2006/math" xmlns:v="urn:schemas-microsoft-com:vml" xmlns:wp14="http://schemas.microsoft.com/office/word/2010/wordprocessingDrawing" xmlns:wp="http://schemas.openxmlformats.org/drawingml/2006/wordprocessingDrawing" xmlns:w10="urn:schemas-microsoft-com:office:word" xmlns:w="http://schemas.openxmlformats.org/wordprocessingml/2006/main" xmlns:w14="http://schemas.microsoft.com/office/word/2010/wordml" xmlns:w15="http://schemas.microsoft.com/office/word/2012/wordml" xmlns:w16cex="http://schemas.microsoft.com/office/word/2018/wordml/cex" xmlns:w16cid="http://schemas.microsoft.com/office/word/2016/wordml/cid" xmlns:w16="http://schemas.microsoft.com/office/word/2018/wordml" xmlns:w16du="http://schemas.microsoft.com/office/word/2023/wordml/word16du" xmlns:w16sdtdh="http://schemas.microsoft.com/office/word/2020/wordml/sdtdatahash" xmlns:w16sdtfl="http://schemas.microsoft.com/office/word/2024/wordml/sdtformatlock" xmlns:w16se="http://schemas.microsoft.com/office/word/2015/wordml/symex" xmlns:wpg="http://schemas.microsoft.com/office/word/2010/wordprocessingGroup" xmlns:wpi="http://schemas.microsoft.com/office/word/2010/wordprocessingInk" xmlns:wne="http://schemas.microsoft.com/office/word/2006/wordml" xmlns:wps="http://schemas.microsoft.com/office/word/2010/wordprocessingShape" mc:Ignorable="w14 w15 w16se w16cid w16 w16cex w16sdtdh w16sdtfl w16du wp14">
   <w:p>
     <w:pPr>
       <w:pStyle w:val="Header"/>
@@ -31147,7 +34165,7 @@
 </file>
 
 <file path=word/styles.xml><?xml version="1.0" encoding="utf-8"?>
-<w:styles xmlns:mc="http://schemas.openxmlformats.org/markup-compatibility/2006" xmlns:r="http://schemas.openxmlformats.org/officeDocument/2006/relationships" xmlns:w="http://schemas.openxmlformats.org/wordprocessingml/2006/main" xmlns:w14="http://schemas.microsoft.com/office/word/2010/wordml" xmlns:w15="http://schemas.microsoft.com/office/word/2012/wordml" xmlns:w16cex="http://schemas.microsoft.com/office/word/2018/wordml/cex" xmlns:w16cid="http://schemas.microsoft.com/office/word/2016/wordml/cid" xmlns:w16="http://schemas.microsoft.com/office/word/2018/wordml" xmlns:w16sdtdh="http://schemas.microsoft.com/office/word/2020/wordml/sdtdatahash" xmlns:w16se="http://schemas.microsoft.com/office/word/2015/wordml/symex" mc:Ignorable="w14 w15 w16se w16cid w16 w16cex w16sdtdh">
+<w:styles xmlns:mc="http://schemas.openxmlformats.org/markup-compatibility/2006" xmlns:r="http://schemas.openxmlformats.org/officeDocument/2006/relationships" xmlns:w="http://schemas.openxmlformats.org/wordprocessingml/2006/main" xmlns:w14="http://schemas.microsoft.com/office/word/2010/wordml" xmlns:w15="http://schemas.microsoft.com/office/word/2012/wordml" xmlns:w16cex="http://schemas.microsoft.com/office/word/2018/wordml/cex" xmlns:w16cid="http://schemas.microsoft.com/office/word/2016/wordml/cid" xmlns:w16="http://schemas.microsoft.com/office/word/2018/wordml" xmlns:w16du="http://schemas.microsoft.com/office/word/2023/wordml/word16du" xmlns:w16sdtdh="http://schemas.microsoft.com/office/word/2020/wordml/sdtdatahash" xmlns:w16sdtfl="http://schemas.microsoft.com/office/word/2024/wordml/sdtformatlock" xmlns:w16se="http://schemas.microsoft.com/office/word/2015/wordml/symex" mc:Ignorable="w14 w15 w16se w16cid w16 w16cex w16sdtdh w16sdtfl w16du">
   <w:docDefaults>
     <w:rPrDefault>
       <w:rPr>

</xml_diff>